<commit_message>
Topics included, mod in Problem Definition topic
</commit_message>
<xml_diff>
--- a/Project_Project-Sep2026.docx
+++ b/Project_Project-Sep2026.docx
@@ -5,6 +5,52 @@
     <w:p>
       <w:pPr>
         <w:pStyle w:val="Heading2"/>
+        <w:jc w:val="center"/>
+        <w:rPr>
+          <w:u w:val="single"/>
+          <w:lang w:val="en-US"/>
+        </w:rPr>
+      </w:pPr>
+      <w:r>
+        <w:rPr>
+          <w:u w:val="single"/>
+          <w:lang w:val="en-US"/>
+        </w:rPr>
+        <w:t>Social</w:t>
+      </w:r>
+      <w:r>
+        <w:rPr>
+          <w:u w:val="single"/>
+          <w:lang w:val="en-US"/>
+        </w:rPr>
+        <w:t xml:space="preserve"> impact by Chronic Diseases</w:t>
+      </w:r>
+    </w:p>
+    <w:p>
+      <w:pPr>
+        <w:pStyle w:val="Heading2"/>
+        <w:rPr>
+          <w:lang w:val="en-US"/>
+        </w:rPr>
+      </w:pPr>
+    </w:p>
+    <w:p>
+      <w:pPr>
+        <w:rPr>
+          <w:lang w:val="en-US"/>
+        </w:rPr>
+      </w:pPr>
+    </w:p>
+    <w:p>
+      <w:pPr>
+        <w:rPr>
+          <w:lang w:val="en-US"/>
+        </w:rPr>
+      </w:pPr>
+    </w:p>
+    <w:p>
+      <w:pPr>
+        <w:pStyle w:val="Heading2"/>
         <w:rPr>
           <w:lang w:val="en-US"/>
         </w:rPr>
@@ -39,20 +85,6 @@
     </w:p>
     <w:p>
       <w:pPr>
-        <w:rPr>
-          <w:lang w:val="en-US"/>
-        </w:rPr>
-      </w:pPr>
-    </w:p>
-    <w:p>
-      <w:pPr>
-        <w:rPr>
-          <w:lang w:val="en-US"/>
-        </w:rPr>
-      </w:pPr>
-    </w:p>
-    <w:p>
-      <w:pPr>
         <w:pStyle w:val="Heading3"/>
         <w:rPr>
           <w:rFonts w:ascii="Trebuchet MS" w:hAnsi="Trebuchet MS" w:cs="Times New Roman"/>
@@ -168,7 +200,7 @@
         <w:rPr>
           <w:rFonts w:asciiTheme="minorHAnsi" w:hAnsiTheme="minorHAnsi" w:cstheme="minorHAnsi"/>
         </w:rPr>
-        <w:t>6</w:t>
+        <w:t>5</w:t>
       </w:r>
     </w:p>
     <w:p>
@@ -454,27 +486,6 @@
     </w:p>
     <w:p>
       <w:pPr>
-        <w:rPr>
-          <w:lang w:val="en-US"/>
-        </w:rPr>
-      </w:pPr>
-    </w:p>
-    <w:p>
-      <w:pPr>
-        <w:rPr>
-          <w:lang w:val="en-US"/>
-        </w:rPr>
-      </w:pPr>
-    </w:p>
-    <w:p>
-      <w:pPr>
-        <w:rPr>
-          <w:lang w:val="en-US"/>
-        </w:rPr>
-      </w:pPr>
-    </w:p>
-    <w:p>
-      <w:pPr>
         <w:pStyle w:val="Heading2"/>
         <w:rPr>
           <w:lang w:val="en-US"/>
@@ -507,23 +518,15 @@
       <w:pPr>
         <w:rPr>
           <w:rFonts w:asciiTheme="minorHAnsi" w:hAnsiTheme="minorHAnsi" w:cstheme="minorHAnsi"/>
-          <w:lang w:val="en-US"/>
-        </w:rPr>
-      </w:pPr>
-      <w:r>
-        <w:rPr>
-          <w:rFonts w:asciiTheme="minorHAnsi" w:hAnsiTheme="minorHAnsi" w:cstheme="minorHAnsi"/>
-          <w:lang w:val="en-US"/>
-        </w:rPr>
-        <w:t xml:space="preserve">  </w:t>
-      </w:r>
+        </w:rPr>
+      </w:pPr>
       <w:r>
         <w:rPr>
           <w:rFonts w:asciiTheme="minorHAnsi" w:hAnsiTheme="minorHAnsi" w:cstheme="minorHAnsi"/>
         </w:rPr>
         <w:t>The Chronic Disease Indicators (CDI) web tool (</w:t>
       </w:r>
-      <w:hyperlink r:id="rId5" w:tgtFrame="_blank" w:history="1">
+      <w:hyperlink r:id="rId6" w:tgtFrame="_blank" w:history="1">
         <w:r>
           <w:rPr>
             <w:rStyle w:val="Hyperlink"/>
@@ -546,26 +549,42 @@
           <w:lang w:val="en-US"/>
         </w:rPr>
       </w:pPr>
-      <w:r>
-        <w:rPr>
-          <w:rFonts w:asciiTheme="minorHAnsi" w:hAnsiTheme="minorHAnsi" w:cstheme="minorHAnsi"/>
-          <w:lang w:val="en-US"/>
-        </w:rPr>
-        <w:t xml:space="preserve">  That moment you can be asking “Do I have a chronic disease?”; “What is it?”; “Does it contagious?”. Do not worry, for this reason you are here to understand which kind of disease are considered chronic and what is it means.</w:t>
-      </w:r>
-    </w:p>
-    <w:p>
-      <w:pPr>
-        <w:rPr>
-          <w:rFonts w:asciiTheme="minorHAnsi" w:hAnsiTheme="minorHAnsi" w:cstheme="minorHAnsi"/>
-        </w:rPr>
-      </w:pPr>
-      <w:r>
-        <w:rPr>
-          <w:rFonts w:asciiTheme="minorHAnsi" w:hAnsiTheme="minorHAnsi" w:cstheme="minorHAnsi"/>
-          <w:lang w:val="en-US"/>
-        </w:rPr>
-        <w:t xml:space="preserve">  Basically, among the most popular Chronic diseases are </w:t>
+    </w:p>
+    <w:p>
+      <w:pPr>
+        <w:rPr>
+          <w:rFonts w:asciiTheme="minorHAnsi" w:hAnsiTheme="minorHAnsi" w:cstheme="minorHAnsi"/>
+          <w:lang w:val="en-US"/>
+        </w:rPr>
+      </w:pPr>
+      <w:r>
+        <w:rPr>
+          <w:rFonts w:asciiTheme="minorHAnsi" w:hAnsiTheme="minorHAnsi" w:cstheme="minorHAnsi"/>
+          <w:lang w:val="en-US"/>
+        </w:rPr>
+        <w:t>That moment you can be asking “Do I have a chronic disease?”; “What is it?”; “Does it contagious?”. Do not worry, for this reason you are here to understand which kind of disease are considered chronic and what is it means.</w:t>
+      </w:r>
+    </w:p>
+    <w:p>
+      <w:pPr>
+        <w:rPr>
+          <w:rFonts w:asciiTheme="minorHAnsi" w:hAnsiTheme="minorHAnsi" w:cstheme="minorHAnsi"/>
+          <w:lang w:val="en-US"/>
+        </w:rPr>
+      </w:pPr>
+    </w:p>
+    <w:p>
+      <w:pPr>
+        <w:rPr>
+          <w:rFonts w:asciiTheme="minorHAnsi" w:hAnsiTheme="minorHAnsi" w:cstheme="minorHAnsi"/>
+        </w:rPr>
+      </w:pPr>
+      <w:r>
+        <w:rPr>
+          <w:rFonts w:asciiTheme="minorHAnsi" w:hAnsiTheme="minorHAnsi" w:cstheme="minorHAnsi"/>
+          <w:lang w:val="en-US"/>
+        </w:rPr>
+        <w:t xml:space="preserve">Basically, among the most popular Chronic diseases are </w:t>
       </w:r>
       <w:r>
         <w:rPr>
@@ -638,16 +657,16 @@
       <w:pPr>
         <w:rPr>
           <w:rFonts w:asciiTheme="minorHAnsi" w:hAnsiTheme="minorHAnsi" w:cstheme="minorHAnsi"/>
-          <w:lang w:val="en-US"/>
-        </w:rPr>
-      </w:pPr>
-      <w:r>
-        <w:rPr>
-          <w:rFonts w:asciiTheme="minorHAnsi" w:hAnsiTheme="minorHAnsi" w:cstheme="minorHAnsi"/>
-          <w:lang w:val="en-US"/>
-        </w:rPr>
-        <w:t xml:space="preserve">  </w:t>
-      </w:r>
+        </w:rPr>
+      </w:pPr>
+    </w:p>
+    <w:p>
+      <w:pPr>
+        <w:rPr>
+          <w:rFonts w:asciiTheme="minorHAnsi" w:hAnsiTheme="minorHAnsi" w:cstheme="minorHAnsi"/>
+          <w:lang w:val="en-US"/>
+        </w:rPr>
+      </w:pPr>
       <w:r>
         <w:rPr>
           <w:rFonts w:asciiTheme="minorHAnsi" w:hAnsiTheme="minorHAnsi" w:cstheme="minorHAnsi"/>
@@ -723,8 +742,155 @@
           <w:rFonts w:asciiTheme="minorHAnsi" w:hAnsiTheme="minorHAnsi" w:cstheme="minorHAnsi"/>
           <w:lang w:val="en-US"/>
         </w:rPr>
-        <w:t xml:space="preserve"> factors.</w:t>
-      </w:r>
+        <w:t xml:space="preserve"> factors. </w:t>
+      </w:r>
+    </w:p>
+    <w:p>
+      <w:pPr>
+        <w:rPr>
+          <w:rFonts w:asciiTheme="minorHAnsi" w:hAnsiTheme="minorHAnsi" w:cstheme="minorHAnsi"/>
+          <w:lang w:val="en-US"/>
+        </w:rPr>
+      </w:pPr>
+    </w:p>
+    <w:p>
+      <w:pPr>
+        <w:rPr>
+          <w:rFonts w:asciiTheme="minorHAnsi" w:hAnsiTheme="minorHAnsi" w:cstheme="minorHAnsi"/>
+          <w:lang w:val="en-US"/>
+        </w:rPr>
+      </w:pPr>
+      <w:r>
+        <w:rPr>
+          <w:rFonts w:asciiTheme="minorHAnsi" w:hAnsiTheme="minorHAnsi" w:cstheme="minorHAnsi"/>
+          <w:lang w:val="en-US"/>
+        </w:rPr>
+        <w:t>T</w:t>
+      </w:r>
+      <w:r>
+        <w:rPr>
+          <w:rFonts w:asciiTheme="minorHAnsi" w:hAnsiTheme="minorHAnsi" w:cstheme="minorHAnsi"/>
+          <w:lang w:val="en-US"/>
+        </w:rPr>
+        <w:t xml:space="preserve">his project will </w:t>
+      </w:r>
+      <w:r>
+        <w:rPr>
+          <w:rFonts w:asciiTheme="minorHAnsi" w:hAnsiTheme="minorHAnsi" w:cstheme="minorHAnsi"/>
+          <w:lang w:val="en-US"/>
+        </w:rPr>
+        <w:t>explain</w:t>
+      </w:r>
+      <w:r>
+        <w:rPr>
+          <w:rFonts w:asciiTheme="minorHAnsi" w:hAnsiTheme="minorHAnsi" w:cstheme="minorHAnsi"/>
+          <w:lang w:val="en-US"/>
+        </w:rPr>
+        <w:t xml:space="preserve"> the simplest </w:t>
+      </w:r>
+      <w:r>
+        <w:rPr>
+          <w:rFonts w:asciiTheme="minorHAnsi" w:hAnsiTheme="minorHAnsi" w:cstheme="minorHAnsi"/>
+          <w:lang w:val="en-US"/>
+        </w:rPr>
+        <w:t>terms possible,</w:t>
+      </w:r>
+      <w:r>
+        <w:rPr>
+          <w:rFonts w:asciiTheme="minorHAnsi" w:hAnsiTheme="minorHAnsi" w:cstheme="minorHAnsi"/>
+          <w:lang w:val="en-US"/>
+        </w:rPr>
+        <w:t xml:space="preserve"> the </w:t>
+      </w:r>
+      <w:r>
+        <w:rPr>
+          <w:rFonts w:asciiTheme="minorHAnsi" w:hAnsiTheme="minorHAnsi" w:cstheme="minorHAnsi"/>
+          <w:lang w:val="en-US"/>
+        </w:rPr>
+        <w:t xml:space="preserve">importance of this data collection for society in general and how it can affect individuals; It will also highlight why prevention is essential in </w:t>
+      </w:r>
+      <w:r>
+        <w:rPr>
+          <w:rFonts w:asciiTheme="minorHAnsi" w:hAnsiTheme="minorHAnsi" w:cstheme="minorHAnsi"/>
+          <w:lang w:val="en-US"/>
+        </w:rPr>
+        <w:t>this</w:t>
+      </w:r>
+      <w:r>
+        <w:rPr>
+          <w:rFonts w:asciiTheme="minorHAnsi" w:hAnsiTheme="minorHAnsi" w:cstheme="minorHAnsi"/>
+          <w:lang w:val="en-US"/>
+        </w:rPr>
+        <w:t xml:space="preserve"> process in which the government must be proactive, effective, and sufficient manner.</w:t>
+      </w:r>
+    </w:p>
+    <w:p>
+      <w:pPr>
+        <w:rPr>
+          <w:rFonts w:asciiTheme="minorHAnsi" w:hAnsiTheme="minorHAnsi" w:cstheme="minorHAnsi"/>
+          <w:lang w:val="en-US"/>
+        </w:rPr>
+      </w:pPr>
+    </w:p>
+    <w:p>
+      <w:pPr>
+        <w:rPr>
+          <w:rFonts w:asciiTheme="minorHAnsi" w:hAnsiTheme="minorHAnsi" w:cstheme="minorHAnsi"/>
+          <w:lang w:val="en-US"/>
+        </w:rPr>
+      </w:pPr>
+      <w:r>
+        <w:rPr>
+          <w:rFonts w:asciiTheme="minorHAnsi" w:hAnsiTheme="minorHAnsi" w:cstheme="minorHAnsi"/>
+          <w:lang w:val="en-US"/>
+        </w:rPr>
+        <w:t>You are invited</w:t>
+      </w:r>
+      <w:r>
+        <w:rPr>
+          <w:rFonts w:asciiTheme="minorHAnsi" w:hAnsiTheme="minorHAnsi" w:cstheme="minorHAnsi"/>
+          <w:lang w:val="en-US"/>
+        </w:rPr>
+        <w:t xml:space="preserve"> to </w:t>
+      </w:r>
+      <w:r>
+        <w:rPr>
+          <w:rFonts w:asciiTheme="minorHAnsi" w:hAnsiTheme="minorHAnsi" w:cstheme="minorHAnsi"/>
+          <w:lang w:val="en-US"/>
+        </w:rPr>
+        <w:t>join this journey of knowledge and discovery of human body and a sample of its diseases, to understand little bit more how the prevention works and how the style life changes can improve or harm your life outcome as human being.</w:t>
+      </w:r>
+    </w:p>
+    <w:p>
+      <w:pPr>
+        <w:rPr>
+          <w:rFonts w:asciiTheme="minorHAnsi" w:hAnsiTheme="minorHAnsi" w:cstheme="minorHAnsi"/>
+          <w:lang w:val="en-US"/>
+        </w:rPr>
+      </w:pPr>
+    </w:p>
+    <w:p>
+      <w:pPr>
+        <w:rPr>
+          <w:rFonts w:asciiTheme="minorHAnsi" w:hAnsiTheme="minorHAnsi" w:cstheme="minorHAnsi"/>
+          <w:lang w:val="en-US"/>
+        </w:rPr>
+      </w:pPr>
+      <w:r>
+        <w:rPr>
+          <w:rFonts w:asciiTheme="minorHAnsi" w:hAnsiTheme="minorHAnsi" w:cstheme="minorHAnsi"/>
+          <w:lang w:val="en-US"/>
+        </w:rPr>
+        <w:t>If you come closer, you will be able to see such interesting and important value of this subject and perhaps one day you can help someone or yourself.</w:t>
+      </w:r>
+    </w:p>
+    <w:p>
+      <w:pPr>
+        <w:rPr>
+          <w:rFonts w:asciiTheme="minorHAnsi" w:hAnsiTheme="minorHAnsi" w:cstheme="minorHAnsi"/>
+          <w:lang w:val="en-US"/>
+        </w:rPr>
+      </w:pPr>
       <w:r>
         <w:rPr>
           <w:rFonts w:asciiTheme="minorHAnsi" w:hAnsiTheme="minorHAnsi" w:cstheme="minorHAnsi"/>
@@ -737,199 +903,6 @@
       <w:pPr>
         <w:rPr>
           <w:rFonts w:asciiTheme="minorHAnsi" w:hAnsiTheme="minorHAnsi" w:cstheme="minorHAnsi"/>
-          <w:lang w:val="en-US"/>
-        </w:rPr>
-      </w:pPr>
-      <w:r>
-        <w:rPr>
-          <w:rFonts w:asciiTheme="minorHAnsi" w:hAnsiTheme="minorHAnsi" w:cstheme="minorHAnsi"/>
-          <w:lang w:val="en-US"/>
-        </w:rPr>
-        <w:t xml:space="preserve"> </w:t>
-      </w:r>
-      <w:r>
-        <w:rPr>
-          <w:rFonts w:asciiTheme="minorHAnsi" w:hAnsiTheme="minorHAnsi" w:cstheme="minorHAnsi"/>
-          <w:lang w:val="en-US"/>
-        </w:rPr>
-        <w:t>T</w:t>
-      </w:r>
-      <w:r>
-        <w:rPr>
-          <w:rFonts w:asciiTheme="minorHAnsi" w:hAnsiTheme="minorHAnsi" w:cstheme="minorHAnsi"/>
-          <w:lang w:val="en-US"/>
-        </w:rPr>
-        <w:t xml:space="preserve">his project will </w:t>
-      </w:r>
-      <w:r>
-        <w:rPr>
-          <w:rFonts w:asciiTheme="minorHAnsi" w:hAnsiTheme="minorHAnsi" w:cstheme="minorHAnsi"/>
-          <w:lang w:val="en-US"/>
-        </w:rPr>
-        <w:t>explain</w:t>
-      </w:r>
-      <w:r>
-        <w:rPr>
-          <w:rFonts w:asciiTheme="minorHAnsi" w:hAnsiTheme="minorHAnsi" w:cstheme="minorHAnsi"/>
-          <w:lang w:val="en-US"/>
-        </w:rPr>
-        <w:t xml:space="preserve"> the simplest </w:t>
-      </w:r>
-      <w:r>
-        <w:rPr>
-          <w:rFonts w:asciiTheme="minorHAnsi" w:hAnsiTheme="minorHAnsi" w:cstheme="minorHAnsi"/>
-          <w:lang w:val="en-US"/>
-        </w:rPr>
-        <w:t>terms possible,</w:t>
-      </w:r>
-      <w:r>
-        <w:rPr>
-          <w:rFonts w:asciiTheme="minorHAnsi" w:hAnsiTheme="minorHAnsi" w:cstheme="minorHAnsi"/>
-          <w:lang w:val="en-US"/>
-        </w:rPr>
-        <w:t xml:space="preserve"> the </w:t>
-      </w:r>
-      <w:r>
-        <w:rPr>
-          <w:rFonts w:asciiTheme="minorHAnsi" w:hAnsiTheme="minorHAnsi" w:cstheme="minorHAnsi"/>
-          <w:lang w:val="en-US"/>
-        </w:rPr>
-        <w:t xml:space="preserve">importance of this data collection for society in general and how it can affect individuals; It will also highlight why prevention is essential in </w:t>
-      </w:r>
-      <w:r>
-        <w:rPr>
-          <w:rFonts w:asciiTheme="minorHAnsi" w:hAnsiTheme="minorHAnsi" w:cstheme="minorHAnsi"/>
-          <w:lang w:val="en-US"/>
-        </w:rPr>
-        <w:t>this</w:t>
-      </w:r>
-      <w:r>
-        <w:rPr>
-          <w:rFonts w:asciiTheme="minorHAnsi" w:hAnsiTheme="minorHAnsi" w:cstheme="minorHAnsi"/>
-          <w:lang w:val="en-US"/>
-        </w:rPr>
-        <w:t xml:space="preserve"> process in which the government must be proactive, effective, and sufficient manner.</w:t>
-      </w:r>
-    </w:p>
-    <w:p>
-      <w:pPr>
-        <w:rPr>
-          <w:rFonts w:asciiTheme="minorHAnsi" w:hAnsiTheme="minorHAnsi" w:cstheme="minorHAnsi"/>
-          <w:lang w:val="en-US"/>
-        </w:rPr>
-      </w:pPr>
-      <w:r>
-        <w:rPr>
-          <w:rFonts w:asciiTheme="minorHAnsi" w:hAnsiTheme="minorHAnsi" w:cstheme="minorHAnsi"/>
-          <w:lang w:val="en-US"/>
-        </w:rPr>
-        <w:t xml:space="preserve"> </w:t>
-      </w:r>
-      <w:r>
-        <w:rPr>
-          <w:rFonts w:asciiTheme="minorHAnsi" w:hAnsiTheme="minorHAnsi" w:cstheme="minorHAnsi"/>
-          <w:lang w:val="en-US"/>
-        </w:rPr>
-        <w:t>You are invited</w:t>
-      </w:r>
-      <w:r>
-        <w:rPr>
-          <w:rFonts w:asciiTheme="minorHAnsi" w:hAnsiTheme="minorHAnsi" w:cstheme="minorHAnsi"/>
-          <w:lang w:val="en-US"/>
-        </w:rPr>
-        <w:t xml:space="preserve"> to </w:t>
-      </w:r>
-      <w:r>
-        <w:rPr>
-          <w:rFonts w:asciiTheme="minorHAnsi" w:hAnsiTheme="minorHAnsi" w:cstheme="minorHAnsi"/>
-          <w:lang w:val="en-US"/>
-        </w:rPr>
-        <w:t>join this journey of knowledge and discovery of human body and a sample of its diseases, to understand little bit more how the prevention works and how the style life changes can improve or harm your life outcome as human being.</w:t>
-      </w:r>
-    </w:p>
-    <w:p>
-      <w:pPr>
-        <w:rPr>
-          <w:rFonts w:asciiTheme="minorHAnsi" w:hAnsiTheme="minorHAnsi" w:cstheme="minorHAnsi"/>
-          <w:lang w:val="en-US"/>
-        </w:rPr>
-      </w:pPr>
-      <w:r>
-        <w:rPr>
-          <w:rFonts w:asciiTheme="minorHAnsi" w:hAnsiTheme="minorHAnsi" w:cstheme="minorHAnsi"/>
-          <w:lang w:val="en-US"/>
-        </w:rPr>
-        <w:t xml:space="preserve">  If you come closer, you will be able to see such interesting and important value of this subject and perhaps one day you can help someone or yourself.</w:t>
-      </w:r>
-    </w:p>
-    <w:p>
-      <w:pPr>
-        <w:rPr>
-          <w:rFonts w:asciiTheme="minorHAnsi" w:hAnsiTheme="minorHAnsi" w:cstheme="minorHAnsi"/>
-          <w:lang w:val="en-US"/>
-        </w:rPr>
-      </w:pPr>
-      <w:r>
-        <w:rPr>
-          <w:rFonts w:asciiTheme="minorHAnsi" w:hAnsiTheme="minorHAnsi" w:cstheme="minorHAnsi"/>
-          <w:lang w:val="en-US"/>
-        </w:rPr>
-        <w:t xml:space="preserve"> </w:t>
-      </w:r>
-    </w:p>
-    <w:p>
-      <w:pPr>
-        <w:rPr>
-          <w:rFonts w:asciiTheme="minorHAnsi" w:hAnsiTheme="minorHAnsi" w:cstheme="minorHAnsi"/>
-          <w:lang w:val="en-US"/>
-        </w:rPr>
-      </w:pPr>
-    </w:p>
-    <w:p>
-      <w:pPr>
-        <w:rPr>
-          <w:lang w:val="en-US"/>
-        </w:rPr>
-      </w:pPr>
-    </w:p>
-    <w:p>
-      <w:pPr>
-        <w:rPr>
-          <w:lang w:val="en-US"/>
-        </w:rPr>
-      </w:pPr>
-    </w:p>
-    <w:p>
-      <w:pPr>
-        <w:rPr>
-          <w:lang w:val="en-US"/>
-        </w:rPr>
-      </w:pPr>
-    </w:p>
-    <w:p>
-      <w:pPr>
-        <w:rPr>
-          <w:lang w:val="en-US"/>
-        </w:rPr>
-      </w:pPr>
-    </w:p>
-    <w:p>
-      <w:pPr>
-        <w:rPr>
-          <w:lang w:val="en-US"/>
-        </w:rPr>
-      </w:pPr>
-    </w:p>
-    <w:p>
-      <w:pPr>
-        <w:rPr>
-          <w:lang w:val="en-US"/>
-        </w:rPr>
-      </w:pPr>
-    </w:p>
-    <w:p>
-      <w:pPr>
-        <w:rPr>
           <w:lang w:val="en-US"/>
         </w:rPr>
       </w:pPr>
@@ -1059,7 +1032,7 @@
     <w:p>
       <w:pPr>
         <w:rPr>
-          <w:rFonts w:asciiTheme="minorHAnsi" w:hAnsiTheme="minorHAnsi" w:cstheme="minorHAnsi"/>
+          <w:lang w:val="en-US"/>
         </w:rPr>
       </w:pPr>
       <w:r>
@@ -1068,17 +1041,18 @@
         </w:rPr>
         <w:t xml:space="preserve"> </w:t>
       </w:r>
-      <w:r>
-        <w:rPr>
-          <w:rFonts w:asciiTheme="minorHAnsi" w:hAnsiTheme="minorHAnsi" w:cstheme="minorHAnsi"/>
-        </w:rPr>
-        <w:t>In 1999 the first indicators were developed by</w:t>
-      </w:r>
-      <w:r>
-        <w:rPr>
-          <w:rFonts w:asciiTheme="minorHAnsi" w:hAnsiTheme="minorHAnsi" w:cstheme="minorHAnsi"/>
-        </w:rPr>
-        <w:t xml:space="preserve"> CDC, the Council of State and Territorial Epidemiologists (CSTE), and the Association of State and Territorial Chronic Disease Program Directors</w:t>
+    </w:p>
+    <w:p>
+      <w:pPr>
+        <w:rPr>
+          <w:rFonts w:asciiTheme="minorHAnsi" w:hAnsiTheme="minorHAnsi" w:cstheme="minorHAnsi"/>
+        </w:rPr>
+      </w:pPr>
+      <w:r>
+        <w:rPr>
+          <w:rFonts w:asciiTheme="minorHAnsi" w:hAnsiTheme="minorHAnsi" w:cstheme="minorHAnsi"/>
+        </w:rPr>
+        <w:t>In 1999 the first indicators were developed by CDC, the Council of State and Territorial Epidemiologists (CSTE), and the Association of State and Territorial Chronic Disease Program Directors</w:t>
       </w:r>
       <w:r>
         <w:rPr>
@@ -1093,11 +1067,18 @@
           <w:rFonts w:asciiTheme="minorHAnsi" w:hAnsiTheme="minorHAnsi" w:cstheme="minorHAnsi"/>
         </w:rPr>
       </w:pPr>
-      <w:r>
-        <w:rPr>
-          <w:rFonts w:asciiTheme="minorHAnsi" w:hAnsiTheme="minorHAnsi" w:cstheme="minorHAnsi"/>
-        </w:rPr>
-        <w:t xml:space="preserve">  After three years (2002) those indicators were revised and expanded to 92 and then in 2012-2013</w:t>
+    </w:p>
+    <w:p>
+      <w:pPr>
+        <w:rPr>
+          <w:rFonts w:asciiTheme="minorHAnsi" w:hAnsiTheme="minorHAnsi" w:cstheme="minorHAnsi"/>
+        </w:rPr>
+      </w:pPr>
+      <w:r>
+        <w:rPr>
+          <w:rFonts w:asciiTheme="minorHAnsi" w:hAnsiTheme="minorHAnsi" w:cstheme="minorHAnsi"/>
+        </w:rPr>
+        <w:t>After three years (2002) those indicators were revised and expanded to 92 and then in 2012-2013</w:t>
       </w:r>
       <w:r>
         <w:rPr>
@@ -1166,11 +1147,18 @@
           <w:rFonts w:asciiTheme="minorHAnsi" w:hAnsiTheme="minorHAnsi" w:cstheme="minorHAnsi"/>
         </w:rPr>
       </w:pPr>
-      <w:r>
-        <w:rPr>
-          <w:rFonts w:asciiTheme="minorHAnsi" w:hAnsiTheme="minorHAnsi" w:cstheme="minorHAnsi"/>
-        </w:rPr>
-        <w:t xml:space="preserve">  The mean objective </w:t>
+    </w:p>
+    <w:p>
+      <w:pPr>
+        <w:rPr>
+          <w:rFonts w:asciiTheme="minorHAnsi" w:hAnsiTheme="minorHAnsi" w:cstheme="minorHAnsi"/>
+        </w:rPr>
+      </w:pPr>
+      <w:r>
+        <w:rPr>
+          <w:rFonts w:asciiTheme="minorHAnsi" w:hAnsiTheme="minorHAnsi" w:cstheme="minorHAnsi"/>
+        </w:rPr>
+        <w:t xml:space="preserve">The mean objective </w:t>
       </w:r>
       <w:r>
         <w:rPr>
@@ -1209,12 +1197,13 @@
           <w:rFonts w:asciiTheme="minorHAnsi" w:hAnsiTheme="minorHAnsi" w:cstheme="minorHAnsi"/>
         </w:rPr>
       </w:pPr>
-      <w:r>
-        <w:rPr>
-          <w:rFonts w:asciiTheme="minorHAnsi" w:hAnsiTheme="minorHAnsi" w:cstheme="minorHAnsi"/>
-        </w:rPr>
-        <w:t xml:space="preserve">  </w:t>
-      </w:r>
+    </w:p>
+    <w:p>
+      <w:pPr>
+        <w:rPr>
+          <w:rFonts w:asciiTheme="minorHAnsi" w:hAnsiTheme="minorHAnsi" w:cstheme="minorHAnsi"/>
+        </w:rPr>
+      </w:pPr>
       <w:r>
         <w:rPr>
           <w:rFonts w:asciiTheme="minorHAnsi" w:hAnsiTheme="minorHAnsi" w:cstheme="minorHAnsi"/>
@@ -1233,20 +1222,86 @@
         </w:rPr>
         <w:t xml:space="preserve"> The result of this was a drop down to 113</w:t>
       </w:r>
-    </w:p>
-    <w:p>
-      <w:pPr>
-        <w:rPr>
-          <w:rFonts w:asciiTheme="minorHAnsi" w:hAnsiTheme="minorHAnsi" w:cstheme="minorHAnsi"/>
-        </w:rPr>
-      </w:pPr>
-      <w:r>
-        <w:rPr>
-          <w:rFonts w:asciiTheme="minorHAnsi" w:hAnsiTheme="minorHAnsi" w:cstheme="minorHAnsi"/>
-        </w:rPr>
-        <w:t xml:space="preserve">  Based on this information above the dataset chose to be used on this project was extracted from </w:t>
-      </w:r>
-      <w:hyperlink r:id="rId6" w:history="1">
+      <w:r>
+        <w:rPr>
+          <w:rFonts w:asciiTheme="minorHAnsi" w:hAnsiTheme="minorHAnsi" w:cstheme="minorHAnsi"/>
+        </w:rPr>
+        <w:t>.</w:t>
+      </w:r>
+    </w:p>
+    <w:p>
+      <w:pPr>
+        <w:rPr>
+          <w:rFonts w:asciiTheme="minorHAnsi" w:hAnsiTheme="minorHAnsi" w:cstheme="minorHAnsi"/>
+        </w:rPr>
+      </w:pPr>
+    </w:p>
+    <w:p>
+      <w:pPr>
+        <w:rPr>
+          <w:rFonts w:asciiTheme="minorHAnsi" w:hAnsiTheme="minorHAnsi" w:cstheme="minorHAnsi"/>
+        </w:rPr>
+      </w:pPr>
+      <w:r>
+        <w:rPr>
+          <w:rFonts w:asciiTheme="minorHAnsi" w:hAnsiTheme="minorHAnsi" w:cstheme="minorHAnsi"/>
+        </w:rPr>
+        <w:t xml:space="preserve">Why this subject to work on? </w:t>
+      </w:r>
+      <w:r>
+        <w:rPr>
+          <w:rFonts w:asciiTheme="minorHAnsi" w:hAnsiTheme="minorHAnsi" w:cstheme="minorHAnsi"/>
+        </w:rPr>
+        <w:t xml:space="preserve">Over years, </w:t>
+      </w:r>
+      <w:r>
+        <w:rPr>
+          <w:rFonts w:asciiTheme="minorHAnsi" w:hAnsiTheme="minorHAnsi" w:cstheme="minorHAnsi"/>
+        </w:rPr>
+        <w:t>all these surveys and studies have had an impact on public health and the lives of families; however, this is not enough to solve the problems faced by people living with a medical condition</w:t>
+      </w:r>
+      <w:r>
+        <w:rPr>
+          <w:rFonts w:asciiTheme="minorHAnsi" w:hAnsiTheme="minorHAnsi" w:cstheme="minorHAnsi"/>
+        </w:rPr>
+        <w:t>.</w:t>
+      </w:r>
+      <w:r>
+        <w:t xml:space="preserve"> </w:t>
+      </w:r>
+      <w:r>
+        <w:rPr>
+          <w:rFonts w:asciiTheme="minorHAnsi" w:hAnsiTheme="minorHAnsi" w:cstheme="minorHAnsi"/>
+        </w:rPr>
+        <w:t>On the other hand, data collection facilitates the monitoring of these indicators—whether by encouraging the adoption of a healthier lifestyle or, at the very least, by raising individual awareness.</w:t>
+      </w:r>
+      <w:r>
+        <w:rPr>
+          <w:rFonts w:asciiTheme="minorHAnsi" w:hAnsiTheme="minorHAnsi" w:cstheme="minorHAnsi"/>
+        </w:rPr>
+        <w:t xml:space="preserve"> </w:t>
+      </w:r>
+    </w:p>
+    <w:p>
+      <w:pPr>
+        <w:rPr>
+          <w:rFonts w:asciiTheme="minorHAnsi" w:hAnsiTheme="minorHAnsi" w:cstheme="minorHAnsi"/>
+        </w:rPr>
+      </w:pPr>
+    </w:p>
+    <w:p>
+      <w:pPr>
+        <w:rPr>
+          <w:rFonts w:asciiTheme="minorHAnsi" w:hAnsiTheme="minorHAnsi" w:cstheme="minorHAnsi"/>
+        </w:rPr>
+      </w:pPr>
+      <w:r>
+        <w:rPr>
+          <w:rFonts w:asciiTheme="minorHAnsi" w:hAnsiTheme="minorHAnsi" w:cstheme="minorHAnsi"/>
+        </w:rPr>
+        <w:t xml:space="preserve">Based on this information above the dataset chose to be used on this project was extracted from </w:t>
+      </w:r>
+      <w:hyperlink r:id="rId7" w:history="1">
         <w:r>
           <w:rPr>
             <w:rStyle w:val="Hyperlink"/>
@@ -1265,7 +1320,55 @@
         <w:rPr>
           <w:rFonts w:asciiTheme="minorHAnsi" w:hAnsiTheme="minorHAnsi" w:cstheme="minorHAnsi"/>
         </w:rPr>
-        <w:t>and the indicators will be explored to present the strategic thinking methodology and how it will work during the process.</w:t>
+        <w:t>and the indicators will be explored</w:t>
+      </w:r>
+      <w:r>
+        <w:rPr>
+          <w:rFonts w:asciiTheme="minorHAnsi" w:hAnsiTheme="minorHAnsi" w:cstheme="minorHAnsi"/>
+        </w:rPr>
+        <w:t>, d</w:t>
+      </w:r>
+      <w:r>
+        <w:rPr>
+          <w:rFonts w:asciiTheme="minorHAnsi" w:hAnsiTheme="minorHAnsi" w:cstheme="minorHAnsi"/>
+        </w:rPr>
+        <w:t>etecting any lack or misinformation</w:t>
+      </w:r>
+      <w:r>
+        <w:rPr>
+          <w:rFonts w:asciiTheme="minorHAnsi" w:hAnsiTheme="minorHAnsi" w:cstheme="minorHAnsi"/>
+        </w:rPr>
+        <w:t>, fixing errors if necessary, and practicing</w:t>
+      </w:r>
+      <w:r>
+        <w:rPr>
+          <w:rFonts w:asciiTheme="minorHAnsi" w:hAnsiTheme="minorHAnsi" w:cstheme="minorHAnsi"/>
+        </w:rPr>
+        <w:t xml:space="preserve"> the strategic thinking</w:t>
+      </w:r>
+      <w:r>
+        <w:rPr>
+          <w:rFonts w:asciiTheme="minorHAnsi" w:hAnsiTheme="minorHAnsi" w:cstheme="minorHAnsi"/>
+        </w:rPr>
+        <w:t>, Machine learning</w:t>
+      </w:r>
+      <w:r>
+        <w:rPr>
+          <w:rFonts w:asciiTheme="minorHAnsi" w:hAnsiTheme="minorHAnsi" w:cstheme="minorHAnsi"/>
+        </w:rPr>
+        <w:t xml:space="preserve"> methodology and how it will work during the process</w:t>
+      </w:r>
+      <w:r>
+        <w:rPr>
+          <w:rFonts w:asciiTheme="minorHAnsi" w:hAnsiTheme="minorHAnsi" w:cstheme="minorHAnsi"/>
+        </w:rPr>
+        <w:t>.</w:t>
+      </w:r>
+      <w:r>
+        <w:rPr>
+          <w:rFonts w:asciiTheme="minorHAnsi" w:hAnsiTheme="minorHAnsi" w:cstheme="minorHAnsi"/>
+        </w:rPr>
+        <w:t xml:space="preserve"> </w:t>
       </w:r>
     </w:p>
     <w:p>
@@ -1370,122 +1473,475 @@
     <w:p>
       <w:pPr>
         <w:rPr>
-          <w:lang w:val="en-US"/>
-        </w:rPr>
-      </w:pPr>
-    </w:p>
-    <w:p>
-      <w:pPr>
-        <w:rPr>
-          <w:lang w:val="en-US"/>
-        </w:rPr>
-      </w:pPr>
-    </w:p>
-    <w:p>
-      <w:pPr>
-        <w:rPr>
-          <w:lang w:val="en-US"/>
-        </w:rPr>
-      </w:pPr>
-    </w:p>
-    <w:p>
-      <w:pPr>
-        <w:rPr>
-          <w:lang w:val="en-US"/>
-        </w:rPr>
-      </w:pPr>
-    </w:p>
-    <w:p>
-      <w:pPr>
-        <w:rPr>
-          <w:lang w:val="en-US"/>
-        </w:rPr>
-      </w:pPr>
-    </w:p>
-    <w:p>
-      <w:pPr>
-        <w:rPr>
-          <w:lang w:val="en-US"/>
-        </w:rPr>
-      </w:pPr>
-    </w:p>
-    <w:p>
-      <w:pPr>
-        <w:rPr>
-          <w:lang w:val="en-US"/>
-        </w:rPr>
-      </w:pPr>
-    </w:p>
-    <w:p>
-      <w:pPr>
-        <w:rPr>
-          <w:lang w:val="en-US"/>
-        </w:rPr>
-      </w:pPr>
-    </w:p>
-    <w:p>
-      <w:pPr>
-        <w:rPr>
-          <w:lang w:val="en-US"/>
-        </w:rPr>
-      </w:pPr>
-    </w:p>
-    <w:p>
-      <w:pPr>
-        <w:rPr>
-          <w:lang w:val="en-US"/>
-        </w:rPr>
-      </w:pPr>
-    </w:p>
-    <w:p>
-      <w:pPr>
-        <w:rPr>
-          <w:lang w:val="en-US"/>
-        </w:rPr>
-      </w:pPr>
-    </w:p>
-    <w:p>
-      <w:pPr>
-        <w:rPr>
-          <w:lang w:val="en-US"/>
-        </w:rPr>
-      </w:pPr>
-    </w:p>
-    <w:p>
-      <w:pPr>
-        <w:rPr>
-          <w:lang w:val="en-US"/>
-        </w:rPr>
-      </w:pPr>
-    </w:p>
-    <w:p>
-      <w:pPr>
-        <w:rPr>
-          <w:rFonts w:asciiTheme="minorHAnsi" w:hAnsiTheme="minorHAnsi" w:cstheme="minorHAnsi"/>
-          <w:lang w:val="en-US"/>
-        </w:rPr>
-      </w:pPr>
-      <w:r>
-        <w:rPr>
-          <w:rFonts w:asciiTheme="minorHAnsi" w:hAnsiTheme="minorHAnsi" w:cstheme="minorHAnsi"/>
-          <w:lang w:val="en-US"/>
+          <w:rFonts w:asciiTheme="minorHAnsi" w:hAnsiTheme="minorHAnsi" w:cstheme="minorHAnsi"/>
+          <w:lang w:val="en-US"/>
+        </w:rPr>
+      </w:pPr>
+      <w:r>
+        <w:rPr>
+          <w:rFonts w:asciiTheme="minorHAnsi" w:hAnsiTheme="minorHAnsi" w:cstheme="minorHAnsi"/>
+          <w:lang w:val="en-US"/>
+        </w:rPr>
+        <w:t xml:space="preserve">                                                                                                                                                                              </w:t>
+      </w:r>
+    </w:p>
+    <w:p>
+      <w:pPr>
+        <w:rPr>
+          <w:rFonts w:asciiTheme="minorHAnsi" w:hAnsiTheme="minorHAnsi" w:cstheme="minorHAnsi"/>
+          <w:lang w:val="en-US"/>
+        </w:rPr>
+      </w:pPr>
+      <w:r>
+        <w:rPr>
+          <w:rFonts w:asciiTheme="minorHAnsi" w:hAnsiTheme="minorHAnsi" w:cstheme="minorHAnsi"/>
+          <w:lang w:val="en-US"/>
+        </w:rPr>
+        <w:t xml:space="preserve">                                                                                                                                                                                      </w:t>
+      </w:r>
+      <w:r>
+        <w:rPr>
+          <w:rFonts w:asciiTheme="minorHAnsi" w:hAnsiTheme="minorHAnsi" w:cstheme="minorHAnsi"/>
+          <w:lang w:val="en-US"/>
+        </w:rPr>
+        <w:t xml:space="preserve">   4</w:t>
+      </w:r>
+    </w:p>
+    <w:p>
+      <w:pPr>
+        <w:pStyle w:val="Heading2"/>
+        <w:rPr>
+          <w:i/>
+          <w:iCs/>
+          <w:lang w:val="en-US"/>
+        </w:rPr>
+      </w:pPr>
+      <w:r>
+        <w:rPr>
+          <w:i/>
+          <w:iCs/>
+          <w:lang w:val="en-US"/>
+        </w:rPr>
+        <w:lastRenderedPageBreak/>
+        <w:t>Aim and Objectives</w:t>
+      </w:r>
+    </w:p>
+    <w:p>
+      <w:pPr>
+        <w:rPr>
+          <w:lang w:val="en-US"/>
+        </w:rPr>
+      </w:pPr>
+    </w:p>
+    <w:p>
+      <w:pPr>
+        <w:rPr>
+          <w:lang w:val="en-US"/>
+        </w:rPr>
+      </w:pPr>
+    </w:p>
+    <w:p>
+      <w:pPr>
+        <w:rPr>
+          <w:rFonts w:asciiTheme="minorHAnsi" w:hAnsiTheme="minorHAnsi" w:cstheme="minorHAnsi"/>
+        </w:rPr>
+      </w:pPr>
+      <w:r>
+        <w:rPr>
+          <w:rFonts w:asciiTheme="minorHAnsi" w:hAnsiTheme="minorHAnsi" w:cstheme="minorHAnsi"/>
+        </w:rPr>
+        <w:t xml:space="preserve">The aim of this project is to provide </w:t>
+      </w:r>
+      <w:r>
+        <w:rPr>
+          <w:rFonts w:asciiTheme="minorHAnsi" w:hAnsiTheme="minorHAnsi" w:cstheme="minorHAnsi"/>
+        </w:rPr>
+        <w:t xml:space="preserve">full </w:t>
+      </w:r>
+      <w:r>
+        <w:rPr>
+          <w:rFonts w:asciiTheme="minorHAnsi" w:hAnsiTheme="minorHAnsi" w:cstheme="minorHAnsi"/>
+        </w:rPr>
+        <w:t>study</w:t>
+      </w:r>
+      <w:r>
+        <w:rPr>
+          <w:rFonts w:asciiTheme="minorHAnsi" w:hAnsiTheme="minorHAnsi" w:cstheme="minorHAnsi"/>
         </w:rPr>
         <w:t xml:space="preserve"> </w:t>
       </w:r>
       <w:r>
         <w:rPr>
           <w:rFonts w:asciiTheme="minorHAnsi" w:hAnsiTheme="minorHAnsi" w:cstheme="minorHAnsi"/>
-          <w:lang w:val="en-US"/>
-        </w:rPr>
-        <w:t xml:space="preserve">  </w:t>
-      </w:r>
-      <w:r>
-        <w:rPr>
-          <w:rFonts w:asciiTheme="minorHAnsi" w:hAnsiTheme="minorHAnsi" w:cstheme="minorHAnsi"/>
-          <w:lang w:val="en-US"/>
-        </w:rPr>
-        <w:t xml:space="preserve">                                                                                                                                                                                     4</w:t>
-      </w:r>
+        </w:rPr>
+        <w:t xml:space="preserve">of Data, since </w:t>
+      </w:r>
+      <w:r>
+        <w:rPr>
+          <w:rFonts w:asciiTheme="minorHAnsi" w:hAnsiTheme="minorHAnsi" w:cstheme="minorHAnsi"/>
+        </w:rPr>
+        <w:t>collection until analyses of current data and predicting trends and/or outcomes</w:t>
+      </w:r>
+      <w:r>
+        <w:rPr>
+          <w:rFonts w:asciiTheme="minorHAnsi" w:hAnsiTheme="minorHAnsi" w:cstheme="minorHAnsi"/>
+        </w:rPr>
+        <w:t xml:space="preserve"> for business purposes to make decision</w:t>
+      </w:r>
+      <w:r>
+        <w:rPr>
+          <w:rFonts w:asciiTheme="minorHAnsi" w:hAnsiTheme="minorHAnsi" w:cstheme="minorHAnsi"/>
+        </w:rPr>
+        <w:t xml:space="preserve">, it will happen </w:t>
+      </w:r>
+      <w:r>
+        <w:rPr>
+          <w:rFonts w:asciiTheme="minorHAnsi" w:hAnsiTheme="minorHAnsi" w:cstheme="minorHAnsi"/>
+        </w:rPr>
+        <w:t>through Machine Learning (ML)</w:t>
+      </w:r>
+      <w:r>
+        <w:rPr>
+          <w:rFonts w:asciiTheme="minorHAnsi" w:hAnsiTheme="minorHAnsi" w:cstheme="minorHAnsi"/>
+        </w:rPr>
+        <w:t xml:space="preserve"> process, where algorithms will be used to learn patterns and make predictions.</w:t>
+      </w:r>
+    </w:p>
+    <w:p>
+      <w:pPr>
+        <w:rPr>
+          <w:rFonts w:asciiTheme="minorHAnsi" w:hAnsiTheme="minorHAnsi" w:cstheme="minorHAnsi"/>
+        </w:rPr>
+      </w:pPr>
+    </w:p>
+    <w:p>
+      <w:pPr>
+        <w:rPr>
+          <w:rFonts w:asciiTheme="minorHAnsi" w:hAnsiTheme="minorHAnsi" w:cstheme="minorHAnsi"/>
+        </w:rPr>
+      </w:pPr>
+      <w:r>
+        <w:rPr>
+          <w:rFonts w:asciiTheme="minorHAnsi" w:hAnsiTheme="minorHAnsi" w:cstheme="minorHAnsi"/>
+        </w:rPr>
+        <w:t xml:space="preserve">The </w:t>
+      </w:r>
+      <w:r>
+        <w:rPr>
+          <w:rFonts w:asciiTheme="minorHAnsi" w:hAnsiTheme="minorHAnsi" w:cstheme="minorHAnsi"/>
+        </w:rPr>
+        <w:t xml:space="preserve">objective of the </w:t>
+      </w:r>
+      <w:r>
+        <w:rPr>
+          <w:rFonts w:asciiTheme="minorHAnsi" w:hAnsiTheme="minorHAnsi" w:cstheme="minorHAnsi"/>
+        </w:rPr>
+        <w:t xml:space="preserve">project will </w:t>
+      </w:r>
+      <w:r>
+        <w:rPr>
+          <w:rFonts w:asciiTheme="minorHAnsi" w:hAnsiTheme="minorHAnsi" w:cstheme="minorHAnsi"/>
+        </w:rPr>
+        <w:t>be facing</w:t>
+      </w:r>
+      <w:r>
+        <w:rPr>
+          <w:rFonts w:asciiTheme="minorHAnsi" w:hAnsiTheme="minorHAnsi" w:cstheme="minorHAnsi"/>
+        </w:rPr>
+        <w:t xml:space="preserve"> different </w:t>
+      </w:r>
+      <w:r>
+        <w:rPr>
+          <w:rFonts w:asciiTheme="minorHAnsi" w:hAnsiTheme="minorHAnsi" w:cstheme="minorHAnsi"/>
+        </w:rPr>
+        <w:t xml:space="preserve">analysis tools and </w:t>
+      </w:r>
+      <w:r>
+        <w:rPr>
+          <w:rFonts w:asciiTheme="minorHAnsi" w:hAnsiTheme="minorHAnsi" w:cstheme="minorHAnsi"/>
+        </w:rPr>
+        <w:t xml:space="preserve">techniques based on the project stage, such </w:t>
+      </w:r>
+      <w:r>
+        <w:rPr>
+          <w:rFonts w:asciiTheme="minorHAnsi" w:hAnsiTheme="minorHAnsi" w:cstheme="minorHAnsi"/>
+        </w:rPr>
+        <w:t>as:</w:t>
+      </w:r>
+    </w:p>
+    <w:p>
+      <w:pPr>
+        <w:pStyle w:val="ListParagraph"/>
+        <w:numPr>
+          <w:ilvl w:val="0"/>
+          <w:numId w:val="2"/>
+        </w:numPr>
+        <w:rPr>
+          <w:rFonts w:asciiTheme="minorHAnsi" w:eastAsiaTheme="minorHAnsi" w:hAnsiTheme="minorHAnsi" w:cstheme="minorHAnsi"/>
+        </w:rPr>
+      </w:pPr>
+      <w:r>
+        <w:rPr>
+          <w:rFonts w:asciiTheme="minorHAnsi" w:eastAsiaTheme="minorHAnsi" w:hAnsiTheme="minorHAnsi" w:cstheme="minorHAnsi"/>
+        </w:rPr>
+        <w:t xml:space="preserve">supervised and unsupervised learning (Classification, Regression, </w:t>
+      </w:r>
+      <w:r>
+        <w:rPr>
+          <w:rFonts w:asciiTheme="minorHAnsi" w:eastAsiaTheme="minorHAnsi" w:hAnsiTheme="minorHAnsi" w:cstheme="minorHAnsi"/>
+        </w:rPr>
+        <w:t xml:space="preserve">Forecasting, </w:t>
+      </w:r>
+      <w:r>
+        <w:rPr>
+          <w:rFonts w:asciiTheme="minorHAnsi" w:eastAsiaTheme="minorHAnsi" w:hAnsiTheme="minorHAnsi" w:cstheme="minorHAnsi"/>
+        </w:rPr>
+        <w:t>Clustering)</w:t>
+      </w:r>
+      <w:r>
+        <w:rPr>
+          <w:rFonts w:asciiTheme="minorHAnsi" w:eastAsiaTheme="minorHAnsi" w:hAnsiTheme="minorHAnsi" w:cstheme="minorHAnsi"/>
+        </w:rPr>
+        <w:t>.</w:t>
+      </w:r>
+      <w:r>
+        <w:rPr>
+          <w:rFonts w:asciiTheme="minorHAnsi" w:eastAsiaTheme="minorHAnsi" w:hAnsiTheme="minorHAnsi" w:cstheme="minorHAnsi"/>
+        </w:rPr>
+        <w:t xml:space="preserve"> </w:t>
+      </w:r>
+    </w:p>
+    <w:p>
+      <w:pPr>
+        <w:pStyle w:val="ListParagraph"/>
+        <w:numPr>
+          <w:ilvl w:val="0"/>
+          <w:numId w:val="2"/>
+        </w:numPr>
+        <w:rPr>
+          <w:rFonts w:asciiTheme="minorHAnsi" w:eastAsiaTheme="minorHAnsi" w:hAnsiTheme="minorHAnsi" w:cstheme="minorHAnsi"/>
+        </w:rPr>
+      </w:pPr>
+      <w:r>
+        <w:rPr>
+          <w:rFonts w:asciiTheme="minorHAnsi" w:eastAsiaTheme="minorHAnsi" w:hAnsiTheme="minorHAnsi" w:cstheme="minorHAnsi"/>
+        </w:rPr>
+        <w:t>M</w:t>
+      </w:r>
+      <w:r>
+        <w:rPr>
+          <w:rFonts w:asciiTheme="minorHAnsi" w:eastAsiaTheme="minorHAnsi" w:hAnsiTheme="minorHAnsi" w:cstheme="minorHAnsi"/>
+        </w:rPr>
+        <w:t>odelling (Train, Test)</w:t>
+      </w:r>
+      <w:r>
+        <w:rPr>
+          <w:rFonts w:asciiTheme="minorHAnsi" w:eastAsiaTheme="minorHAnsi" w:hAnsiTheme="minorHAnsi" w:cstheme="minorHAnsi"/>
+        </w:rPr>
+        <w:t>.</w:t>
+      </w:r>
+    </w:p>
+    <w:p>
+      <w:pPr>
+        <w:pStyle w:val="ListParagraph"/>
+        <w:numPr>
+          <w:ilvl w:val="0"/>
+          <w:numId w:val="2"/>
+        </w:numPr>
+        <w:rPr>
+          <w:rFonts w:asciiTheme="minorHAnsi" w:eastAsiaTheme="minorHAnsi" w:hAnsiTheme="minorHAnsi" w:cstheme="minorHAnsi"/>
+        </w:rPr>
+      </w:pPr>
+      <w:r>
+        <w:rPr>
+          <w:rFonts w:asciiTheme="minorHAnsi" w:eastAsiaTheme="minorHAnsi" w:hAnsiTheme="minorHAnsi" w:cstheme="minorHAnsi"/>
+        </w:rPr>
+        <w:t>Evaluation Metric (Accuracy, Precision, Recall).</w:t>
+      </w:r>
+    </w:p>
+    <w:p>
+      <w:pPr>
+        <w:pStyle w:val="ListParagraph"/>
+        <w:numPr>
+          <w:ilvl w:val="0"/>
+          <w:numId w:val="2"/>
+        </w:numPr>
+        <w:rPr>
+          <w:rFonts w:asciiTheme="minorHAnsi" w:eastAsiaTheme="minorHAnsi" w:hAnsiTheme="minorHAnsi" w:cstheme="minorHAnsi"/>
+        </w:rPr>
+      </w:pPr>
+      <w:r>
+        <w:rPr>
+          <w:rFonts w:asciiTheme="minorHAnsi" w:eastAsiaTheme="minorHAnsi" w:hAnsiTheme="minorHAnsi" w:cstheme="minorHAnsi"/>
+        </w:rPr>
+        <w:t>Decision Tree (Potential decisions options).</w:t>
+      </w:r>
+    </w:p>
+    <w:p>
+      <w:pPr>
+        <w:rPr>
+          <w:lang w:val="en-US"/>
+        </w:rPr>
+      </w:pPr>
+    </w:p>
+    <w:p>
+      <w:pPr>
+        <w:rPr>
+          <w:lang w:val="en-US"/>
+        </w:rPr>
+      </w:pPr>
+    </w:p>
+    <w:p>
+      <w:pPr>
+        <w:rPr>
+          <w:rFonts w:asciiTheme="minorHAnsi" w:hAnsiTheme="minorHAnsi" w:cstheme="minorHAnsi"/>
+          <w:lang w:val="en-US"/>
+        </w:rPr>
+      </w:pPr>
+      <w:r>
+        <w:rPr>
+          <w:rFonts w:asciiTheme="minorHAnsi" w:hAnsiTheme="minorHAnsi" w:cstheme="minorHAnsi"/>
+          <w:lang w:val="en-US"/>
+        </w:rPr>
+        <w:t xml:space="preserve">All these results will be important to a new overview of panoramic pictures, if the analysis have </w:t>
+      </w:r>
+      <w:r>
+        <w:rPr>
+          <w:rFonts w:asciiTheme="minorHAnsi" w:hAnsiTheme="minorHAnsi" w:cstheme="minorHAnsi"/>
+          <w:lang w:val="en-US"/>
+        </w:rPr>
+        <w:t>been</w:t>
+      </w:r>
+      <w:r>
+        <w:rPr>
+          <w:rFonts w:asciiTheme="minorHAnsi" w:hAnsiTheme="minorHAnsi" w:cstheme="minorHAnsi"/>
+          <w:lang w:val="en-US"/>
+        </w:rPr>
+        <w:t xml:space="preserve"> efficient and with positive impact, or if will be necessary other database refresh with some modification, exclusion or inclusion of risk indicators</w:t>
+      </w:r>
+      <w:r>
+        <w:rPr>
+          <w:rFonts w:asciiTheme="minorHAnsi" w:hAnsiTheme="minorHAnsi" w:cstheme="minorHAnsi"/>
+          <w:lang w:val="en-US"/>
+        </w:rPr>
+        <w:t>, surveys questions, fields, sources basis</w:t>
+      </w:r>
+      <w:r>
+        <w:rPr>
+          <w:rFonts w:asciiTheme="minorHAnsi" w:hAnsiTheme="minorHAnsi" w:cstheme="minorHAnsi"/>
+          <w:lang w:val="en-US"/>
+        </w:rPr>
+        <w:t>.</w:t>
+      </w:r>
+    </w:p>
+    <w:p>
+      <w:pPr>
+        <w:rPr>
+          <w:lang w:val="en-US"/>
+        </w:rPr>
+      </w:pPr>
+    </w:p>
+    <w:p>
+      <w:pPr>
+        <w:rPr>
+          <w:lang w:val="en-US"/>
+        </w:rPr>
+      </w:pPr>
+    </w:p>
+    <w:p>
+      <w:pPr>
+        <w:rPr>
+          <w:lang w:val="en-US"/>
+        </w:rPr>
+      </w:pPr>
+    </w:p>
+    <w:p>
+      <w:pPr>
+        <w:rPr>
+          <w:lang w:val="en-US"/>
+        </w:rPr>
+      </w:pPr>
+    </w:p>
+    <w:p>
+      <w:pPr>
+        <w:rPr>
+          <w:lang w:val="en-US"/>
+        </w:rPr>
+      </w:pPr>
+    </w:p>
+    <w:p>
+      <w:pPr>
+        <w:rPr>
+          <w:rFonts w:asciiTheme="majorHAnsi" w:eastAsiaTheme="majorEastAsia" w:hAnsiTheme="majorHAnsi" w:cstheme="majorBidi"/>
+          <w:b/>
+          <w:bCs/>
+          <w:i/>
+          <w:iCs/>
+          <w:color w:val="4F81BD" w:themeColor="accent1"/>
+          <w:sz w:val="26"/>
+          <w:szCs w:val="26"/>
+          <w:lang w:val="en-US"/>
+        </w:rPr>
+      </w:pPr>
+      <w:r>
+        <w:rPr>
+          <w:rFonts w:asciiTheme="majorHAnsi" w:eastAsiaTheme="majorEastAsia" w:hAnsiTheme="majorHAnsi" w:cstheme="majorBidi"/>
+          <w:b/>
+          <w:bCs/>
+          <w:i/>
+          <w:iCs/>
+          <w:color w:val="4F81BD" w:themeColor="accent1"/>
+          <w:sz w:val="26"/>
+          <w:szCs w:val="26"/>
+          <w:lang w:val="en-US"/>
+        </w:rPr>
+        <w:t>Scope</w:t>
+      </w:r>
+    </w:p>
+    <w:p>
+      <w:pPr>
+        <w:rPr>
+          <w:rFonts w:asciiTheme="majorHAnsi" w:eastAsiaTheme="majorEastAsia" w:hAnsiTheme="majorHAnsi" w:cstheme="majorBidi"/>
+          <w:b/>
+          <w:bCs/>
+          <w:i/>
+          <w:iCs/>
+          <w:color w:val="4F81BD" w:themeColor="accent1"/>
+          <w:sz w:val="26"/>
+          <w:szCs w:val="26"/>
+          <w:lang w:val="en-US"/>
+        </w:rPr>
+      </w:pPr>
+    </w:p>
+    <w:p>
+      <w:pPr>
+        <w:rPr>
+          <w:rFonts w:asciiTheme="majorHAnsi" w:eastAsiaTheme="majorEastAsia" w:hAnsiTheme="majorHAnsi" w:cstheme="majorBidi"/>
+          <w:b/>
+          <w:bCs/>
+          <w:i/>
+          <w:iCs/>
+          <w:color w:val="4F81BD" w:themeColor="accent1"/>
+          <w:sz w:val="26"/>
+          <w:szCs w:val="26"/>
+          <w:lang w:val="en-US"/>
+        </w:rPr>
+      </w:pPr>
+    </w:p>
+    <w:p>
+      <w:pPr>
+        <w:rPr>
+          <w:rFonts w:asciiTheme="majorHAnsi" w:eastAsiaTheme="majorEastAsia" w:hAnsiTheme="majorHAnsi" w:cstheme="majorBidi"/>
+          <w:b/>
+          <w:bCs/>
+          <w:i/>
+          <w:iCs/>
+          <w:color w:val="4F81BD" w:themeColor="accent1"/>
+          <w:sz w:val="26"/>
+          <w:szCs w:val="26"/>
+          <w:lang w:val="en-US"/>
+        </w:rPr>
+      </w:pPr>
     </w:p>
     <w:sectPr>
       <w:pgSz w:w="12240" w:h="15840"/>
@@ -1585,8 +2041,123 @@
       </w:pPr>
     </w:lvl>
   </w:abstractNum>
+  <w:abstractNum w:abstractNumId="1" w15:restartNumberingAfterBreak="0">
+    <w:nsid w:val="7E9912BC"/>
+    <w:multiLevelType w:val="hybridMultilevel"/>
+    <w:tmpl w:val="E57C80BC"/>
+    <w:lvl w:ilvl="0" w:tplc="AE543B28">
+      <w:numFmt w:val="bullet"/>
+      <w:lvlText w:val=""/>
+      <w:lvlJc w:val="left"/>
+      <w:pPr>
+        <w:ind w:left="720" w:hanging="360"/>
+      </w:pPr>
+      <w:rPr>
+        <w:rFonts w:ascii="Symbol" w:eastAsiaTheme="minorHAnsi" w:hAnsi="Symbol" w:cstheme="minorBidi" w:hint="default"/>
+      </w:rPr>
+    </w:lvl>
+    <w:lvl w:ilvl="1" w:tplc="08090003" w:tentative="1">
+      <w:start w:val="1"/>
+      <w:numFmt w:val="bullet"/>
+      <w:lvlText w:val="o"/>
+      <w:lvlJc w:val="left"/>
+      <w:pPr>
+        <w:ind w:left="1440" w:hanging="360"/>
+      </w:pPr>
+      <w:rPr>
+        <w:rFonts w:ascii="Courier New" w:hAnsi="Courier New" w:cs="Courier New" w:hint="default"/>
+      </w:rPr>
+    </w:lvl>
+    <w:lvl w:ilvl="2" w:tplc="08090005" w:tentative="1">
+      <w:start w:val="1"/>
+      <w:numFmt w:val="bullet"/>
+      <w:lvlText w:val=""/>
+      <w:lvlJc w:val="left"/>
+      <w:pPr>
+        <w:ind w:left="2160" w:hanging="360"/>
+      </w:pPr>
+      <w:rPr>
+        <w:rFonts w:ascii="Wingdings" w:hAnsi="Wingdings" w:hint="default"/>
+      </w:rPr>
+    </w:lvl>
+    <w:lvl w:ilvl="3" w:tplc="08090001" w:tentative="1">
+      <w:start w:val="1"/>
+      <w:numFmt w:val="bullet"/>
+      <w:lvlText w:val=""/>
+      <w:lvlJc w:val="left"/>
+      <w:pPr>
+        <w:ind w:left="2880" w:hanging="360"/>
+      </w:pPr>
+      <w:rPr>
+        <w:rFonts w:ascii="Symbol" w:hAnsi="Symbol" w:hint="default"/>
+      </w:rPr>
+    </w:lvl>
+    <w:lvl w:ilvl="4" w:tplc="08090003" w:tentative="1">
+      <w:start w:val="1"/>
+      <w:numFmt w:val="bullet"/>
+      <w:lvlText w:val="o"/>
+      <w:lvlJc w:val="left"/>
+      <w:pPr>
+        <w:ind w:left="3600" w:hanging="360"/>
+      </w:pPr>
+      <w:rPr>
+        <w:rFonts w:ascii="Courier New" w:hAnsi="Courier New" w:cs="Courier New" w:hint="default"/>
+      </w:rPr>
+    </w:lvl>
+    <w:lvl w:ilvl="5" w:tplc="08090005" w:tentative="1">
+      <w:start w:val="1"/>
+      <w:numFmt w:val="bullet"/>
+      <w:lvlText w:val=""/>
+      <w:lvlJc w:val="left"/>
+      <w:pPr>
+        <w:ind w:left="4320" w:hanging="360"/>
+      </w:pPr>
+      <w:rPr>
+        <w:rFonts w:ascii="Wingdings" w:hAnsi="Wingdings" w:hint="default"/>
+      </w:rPr>
+    </w:lvl>
+    <w:lvl w:ilvl="6" w:tplc="08090001" w:tentative="1">
+      <w:start w:val="1"/>
+      <w:numFmt w:val="bullet"/>
+      <w:lvlText w:val=""/>
+      <w:lvlJc w:val="left"/>
+      <w:pPr>
+        <w:ind w:left="5040" w:hanging="360"/>
+      </w:pPr>
+      <w:rPr>
+        <w:rFonts w:ascii="Symbol" w:hAnsi="Symbol" w:hint="default"/>
+      </w:rPr>
+    </w:lvl>
+    <w:lvl w:ilvl="7" w:tplc="08090003" w:tentative="1">
+      <w:start w:val="1"/>
+      <w:numFmt w:val="bullet"/>
+      <w:lvlText w:val="o"/>
+      <w:lvlJc w:val="left"/>
+      <w:pPr>
+        <w:ind w:left="5760" w:hanging="360"/>
+      </w:pPr>
+      <w:rPr>
+        <w:rFonts w:ascii="Courier New" w:hAnsi="Courier New" w:cs="Courier New" w:hint="default"/>
+      </w:rPr>
+    </w:lvl>
+    <w:lvl w:ilvl="8" w:tplc="08090005" w:tentative="1">
+      <w:start w:val="1"/>
+      <w:numFmt w:val="bullet"/>
+      <w:lvlText w:val=""/>
+      <w:lvlJc w:val="left"/>
+      <w:pPr>
+        <w:ind w:left="6480" w:hanging="360"/>
+      </w:pPr>
+      <w:rPr>
+        <w:rFonts w:ascii="Wingdings" w:hAnsi="Wingdings" w:hint="default"/>
+      </w:rPr>
+    </w:lvl>
+  </w:abstractNum>
   <w:num w:numId="1" w16cid:durableId="1305966707">
     <w:abstractNumId w:val="0"/>
+  </w:num>
+  <w:num w:numId="2" w16cid:durableId="1954897734">
+    <w:abstractNumId w:val="1"/>
   </w:num>
 </w:numbering>
 </file>
@@ -2070,6 +2641,7 @@
   <w:style w:type="character" w:default="1" w:styleId="DefaultParagraphFont">
     <w:name w:val="Default Paragraph Font"/>
     <w:uiPriority w:val="1"/>
+    <w:semiHidden/>
     <w:unhideWhenUsed/>
   </w:style>
   <w:style w:type="table" w:default="1" w:styleId="TableNormal">
@@ -2580,4 +3152,16 @@
   <a:objectDefaults/>
   <a:extraClrSchemeLst/>
 </a:theme>
+</file>
+
+<file path=customXml/item1.xml><?xml version="1.0" encoding="utf-8"?>
+<b:Sources xmlns:b="http://schemas.openxmlformats.org/officeDocument/2006/bibliography" xmlns="http://schemas.openxmlformats.org/officeDocument/2006/bibliography" SelectedStyle="\APASixthEditionOfficeOnline.xsl" StyleName="APA" Version="6"/>
+</file>
+
+<file path=customXml/itemProps1.xml><?xml version="1.0" encoding="utf-8"?>
+<ds:datastoreItem xmlns:ds="http://schemas.openxmlformats.org/officeDocument/2006/customXml" ds:itemID="{B35FC724-B8CF-4D47-A51B-957BB488B587}">
+  <ds:schemaRefs>
+    <ds:schemaRef ds:uri="http://schemas.openxmlformats.org/officeDocument/2006/bibliography"/>
+  </ds:schemaRefs>
+</ds:datastoreItem>
 </file>
</xml_diff>

<commit_message>
Final project - updated
</commit_message>
<xml_diff>
--- a/Project_Project-Sep2026.docx
+++ b/Project_Project-Sep2026.docx
@@ -5,45 +5,493 @@
     <w:p>
       <w:pPr>
         <w:pStyle w:val="Heading2"/>
+        <w:rPr>
+          <w:rFonts w:asciiTheme="minorHAnsi" w:hAnsiTheme="minorHAnsi" w:cstheme="minorHAnsi"/>
+          <w:u w:val="single"/>
+          <w:lang w:val="en-US"/>
+        </w:rPr>
+      </w:pPr>
+    </w:p>
+    <w:p>
+      <w:pPr>
+        <w:pStyle w:val="Heading2"/>
         <w:jc w:val="center"/>
         <w:rPr>
           <w:u w:val="single"/>
           <w:lang w:val="en-US"/>
         </w:rPr>
       </w:pPr>
-      <w:r>
+    </w:p>
+    <w:p>
+      <w:pPr>
+        <w:spacing w:after="200"/>
+        <w:jc w:val="center"/>
+      </w:pPr>
+      <w:r>
+        <w:rPr>
+          <w:noProof/>
+        </w:rPr>
+        <w:drawing>
+          <wp:inline distT="0" distB="0" distL="0" distR="0" wp14:anchorId="66AF3636" wp14:editId="6ABFA495">
+            <wp:extent cx="2476500" cy="853483"/>
+            <wp:effectExtent l="0" t="0" r="0" b="0"/>
+            <wp:docPr id="2" name="image1.png"/>
+            <wp:cNvGraphicFramePr/>
+            <a:graphic xmlns:a="http://schemas.openxmlformats.org/drawingml/2006/main">
+              <a:graphicData uri="http://schemas.openxmlformats.org/drawingml/2006/picture">
+                <pic:pic xmlns:pic="http://schemas.openxmlformats.org/drawingml/2006/picture">
+                  <pic:nvPicPr>
+                    <pic:cNvPr id="0" name="image1.png"/>
+                    <pic:cNvPicPr preferRelativeResize="0"/>
+                  </pic:nvPicPr>
+                  <pic:blipFill>
+                    <a:blip r:embed="rId6"/>
+                    <a:srcRect/>
+                    <a:stretch>
+                      <a:fillRect/>
+                    </a:stretch>
+                  </pic:blipFill>
+                  <pic:spPr>
+                    <a:xfrm>
+                      <a:off x="0" y="0"/>
+                      <a:ext cx="2476500" cy="853483"/>
+                    </a:xfrm>
+                    <a:prstGeom prst="rect">
+                      <a:avLst/>
+                    </a:prstGeom>
+                    <a:ln/>
+                  </pic:spPr>
+                </pic:pic>
+              </a:graphicData>
+            </a:graphic>
+          </wp:inline>
+        </w:drawing>
+      </w:r>
+    </w:p>
+    <w:p>
+      <w:pPr>
+        <w:pStyle w:val="Heading2"/>
+        <w:jc w:val="center"/>
         <w:rPr>
           <w:u w:val="single"/>
           <w:lang w:val="en-US"/>
         </w:rPr>
-        <w:t>Social</w:t>
-      </w:r>
+      </w:pPr>
       <w:r>
         <w:rPr>
           <w:u w:val="single"/>
           <w:lang w:val="en-US"/>
         </w:rPr>
-        <w:t xml:space="preserve"> impact by Chronic Diseases</w:t>
-      </w:r>
-    </w:p>
+        <w:t>Chronic Diseases</w:t>
+      </w:r>
+      <w:r>
+        <w:rPr>
+          <w:u w:val="single"/>
+          <w:lang w:val="en-US"/>
+        </w:rPr>
+        <w:t xml:space="preserve"> Indicators</w:t>
+      </w:r>
+    </w:p>
+    <w:p>
+      <w:pPr>
+        <w:rPr>
+          <w:lang w:val="en-US"/>
+        </w:rPr>
+      </w:pPr>
+    </w:p>
+    <w:tbl>
+      <w:tblPr>
+        <w:tblW w:w="9638" w:type="dxa"/>
+        <w:tblBorders>
+          <w:top w:val="single" w:sz="4" w:space="0" w:color="000000"/>
+          <w:left w:val="single" w:sz="4" w:space="0" w:color="000000"/>
+          <w:bottom w:val="single" w:sz="4" w:space="0" w:color="000000"/>
+          <w:right w:val="single" w:sz="4" w:space="0" w:color="000000"/>
+          <w:insideH w:val="single" w:sz="4" w:space="0" w:color="000000"/>
+          <w:insideV w:val="single" w:sz="4" w:space="0" w:color="000000"/>
+        </w:tblBorders>
+        <w:tblLayout w:type="fixed"/>
+        <w:tblLook w:val="0000" w:firstRow="0" w:lastRow="0" w:firstColumn="0" w:lastColumn="0" w:noHBand="0" w:noVBand="0"/>
+      </w:tblPr>
+      <w:tblGrid>
+        <w:gridCol w:w="3200"/>
+        <w:gridCol w:w="6438"/>
+      </w:tblGrid>
+      <w:tr>
+        <w:tc>
+          <w:tcPr>
+            <w:tcW w:w="3200" w:type="dxa"/>
+            <w:tcBorders>
+              <w:top w:val="single" w:sz="4" w:space="0" w:color="000000"/>
+              <w:left w:val="single" w:sz="4" w:space="0" w:color="000000"/>
+              <w:bottom w:val="single" w:sz="4" w:space="0" w:color="000000"/>
+              <w:right w:val="single" w:sz="4" w:space="0" w:color="000000"/>
+            </w:tcBorders>
+            <w:tcMar>
+              <w:top w:w="60" w:type="dxa"/>
+              <w:left w:w="100" w:type="dxa"/>
+              <w:bottom w:w="60" w:type="dxa"/>
+              <w:right w:w="100" w:type="dxa"/>
+            </w:tcMar>
+            <w:vAlign w:val="center"/>
+          </w:tcPr>
+          <w:p>
+            <w:r>
+              <w:rPr>
+                <w:b/>
+                <w:bCs/>
+              </w:rPr>
+              <w:t>Student Full Name</w:t>
+            </w:r>
+          </w:p>
+        </w:tc>
+        <w:tc>
+          <w:tcPr>
+            <w:tcW w:w="6438" w:type="dxa"/>
+            <w:tcBorders>
+              <w:top w:val="single" w:sz="4" w:space="0" w:color="000000"/>
+              <w:left w:val="single" w:sz="4" w:space="0" w:color="000000"/>
+              <w:bottom w:val="single" w:sz="4" w:space="0" w:color="000000"/>
+              <w:right w:val="single" w:sz="4" w:space="0" w:color="000000"/>
+            </w:tcBorders>
+            <w:tcMar>
+              <w:top w:w="60" w:type="dxa"/>
+              <w:left w:w="100" w:type="dxa"/>
+              <w:bottom w:w="60" w:type="dxa"/>
+              <w:right w:w="100" w:type="dxa"/>
+            </w:tcMar>
+          </w:tcPr>
+          <w:p>
+            <w:r>
+              <w:t>Carla Augusta Araujo Mesquita</w:t>
+            </w:r>
+          </w:p>
+        </w:tc>
+      </w:tr>
+      <w:tr>
+        <w:tc>
+          <w:tcPr>
+            <w:tcW w:w="3200" w:type="dxa"/>
+            <w:tcBorders>
+              <w:top w:val="single" w:sz="4" w:space="0" w:color="000000"/>
+              <w:left w:val="single" w:sz="4" w:space="0" w:color="000000"/>
+              <w:bottom w:val="single" w:sz="4" w:space="0" w:color="000000"/>
+              <w:right w:val="single" w:sz="4" w:space="0" w:color="000000"/>
+            </w:tcBorders>
+            <w:tcMar>
+              <w:top w:w="60" w:type="dxa"/>
+              <w:left w:w="100" w:type="dxa"/>
+              <w:bottom w:w="60" w:type="dxa"/>
+              <w:right w:w="100" w:type="dxa"/>
+            </w:tcMar>
+            <w:vAlign w:val="center"/>
+          </w:tcPr>
+          <w:p>
+            <w:r>
+              <w:rPr>
+                <w:b/>
+                <w:bCs/>
+              </w:rPr>
+              <w:t>Student Number</w:t>
+            </w:r>
+          </w:p>
+        </w:tc>
+        <w:tc>
+          <w:tcPr>
+            <w:tcW w:w="6438" w:type="dxa"/>
+            <w:tcBorders>
+              <w:top w:val="single" w:sz="4" w:space="0" w:color="000000"/>
+              <w:left w:val="single" w:sz="4" w:space="0" w:color="000000"/>
+              <w:bottom w:val="single" w:sz="4" w:space="0" w:color="000000"/>
+              <w:right w:val="single" w:sz="4" w:space="0" w:color="000000"/>
+            </w:tcBorders>
+            <w:tcMar>
+              <w:top w:w="60" w:type="dxa"/>
+              <w:left w:w="100" w:type="dxa"/>
+              <w:bottom w:w="60" w:type="dxa"/>
+              <w:right w:w="100" w:type="dxa"/>
+            </w:tcMar>
+          </w:tcPr>
+          <w:p>
+            <w:r>
+              <w:t>Sba26088</w:t>
+            </w:r>
+          </w:p>
+        </w:tc>
+      </w:tr>
+      <w:tr>
+        <w:tc>
+          <w:tcPr>
+            <w:tcW w:w="3200" w:type="dxa"/>
+            <w:tcBorders>
+              <w:top w:val="single" w:sz="4" w:space="0" w:color="000000"/>
+              <w:left w:val="single" w:sz="4" w:space="0" w:color="000000"/>
+              <w:bottom w:val="single" w:sz="4" w:space="0" w:color="000000"/>
+              <w:right w:val="single" w:sz="4" w:space="0" w:color="000000"/>
+            </w:tcBorders>
+            <w:tcMar>
+              <w:top w:w="60" w:type="dxa"/>
+              <w:left w:w="100" w:type="dxa"/>
+              <w:bottom w:w="60" w:type="dxa"/>
+              <w:right w:w="100" w:type="dxa"/>
+            </w:tcMar>
+            <w:vAlign w:val="center"/>
+          </w:tcPr>
+          <w:p>
+            <w:r>
+              <w:rPr>
+                <w:b/>
+                <w:bCs/>
+              </w:rPr>
+              <w:t>Module Title</w:t>
+            </w:r>
+          </w:p>
+        </w:tc>
+        <w:tc>
+          <w:tcPr>
+            <w:tcW w:w="6438" w:type="dxa"/>
+            <w:tcBorders>
+              <w:top w:val="single" w:sz="4" w:space="0" w:color="000000"/>
+              <w:left w:val="single" w:sz="4" w:space="0" w:color="000000"/>
+              <w:bottom w:val="single" w:sz="4" w:space="0" w:color="000000"/>
+              <w:right w:val="single" w:sz="4" w:space="0" w:color="000000"/>
+            </w:tcBorders>
+            <w:tcMar>
+              <w:top w:w="60" w:type="dxa"/>
+              <w:left w:w="100" w:type="dxa"/>
+              <w:bottom w:w="60" w:type="dxa"/>
+              <w:right w:w="100" w:type="dxa"/>
+            </w:tcMar>
+          </w:tcPr>
+          <w:p>
+            <w:r>
+              <w:t>CA1-Strategic Thinking</w:t>
+            </w:r>
+          </w:p>
+        </w:tc>
+      </w:tr>
+      <w:tr>
+        <w:trPr>
+          <w:trHeight w:val="329"/>
+        </w:trPr>
+        <w:tc>
+          <w:tcPr>
+            <w:tcW w:w="3200" w:type="dxa"/>
+            <w:tcBorders>
+              <w:top w:val="single" w:sz="4" w:space="0" w:color="000000"/>
+              <w:left w:val="single" w:sz="4" w:space="0" w:color="000000"/>
+              <w:bottom w:val="single" w:sz="4" w:space="0" w:color="000000"/>
+              <w:right w:val="single" w:sz="4" w:space="0" w:color="000000"/>
+            </w:tcBorders>
+            <w:tcMar>
+              <w:top w:w="60" w:type="dxa"/>
+              <w:left w:w="100" w:type="dxa"/>
+              <w:bottom w:w="60" w:type="dxa"/>
+              <w:right w:w="100" w:type="dxa"/>
+            </w:tcMar>
+            <w:vAlign w:val="center"/>
+          </w:tcPr>
+          <w:p>
+            <w:r>
+              <w:rPr>
+                <w:b/>
+                <w:bCs/>
+              </w:rPr>
+              <w:t>Assessment Title</w:t>
+            </w:r>
+          </w:p>
+        </w:tc>
+        <w:tc>
+          <w:tcPr>
+            <w:tcW w:w="6438" w:type="dxa"/>
+            <w:tcBorders>
+              <w:top w:val="single" w:sz="4" w:space="0" w:color="000000"/>
+              <w:left w:val="single" w:sz="4" w:space="0" w:color="000000"/>
+              <w:bottom w:val="single" w:sz="4" w:space="0" w:color="000000"/>
+              <w:right w:val="single" w:sz="4" w:space="0" w:color="000000"/>
+            </w:tcBorders>
+            <w:tcMar>
+              <w:top w:w="60" w:type="dxa"/>
+              <w:left w:w="100" w:type="dxa"/>
+              <w:bottom w:w="60" w:type="dxa"/>
+              <w:right w:w="100" w:type="dxa"/>
+            </w:tcMar>
+          </w:tcPr>
+          <w:p>
+            <w:pPr>
+              <w:rPr>
+                <w:lang w:val="en-US"/>
+              </w:rPr>
+            </w:pPr>
+            <w:r>
+              <w:t>CA 1 – Capstone Project Proposal</w:t>
+            </w:r>
+          </w:p>
+        </w:tc>
+      </w:tr>
+      <w:tr>
+        <w:tc>
+          <w:tcPr>
+            <w:tcW w:w="3200" w:type="dxa"/>
+            <w:tcBorders>
+              <w:top w:val="single" w:sz="4" w:space="0" w:color="000000"/>
+              <w:left w:val="single" w:sz="4" w:space="0" w:color="000000"/>
+              <w:bottom w:val="single" w:sz="4" w:space="0" w:color="000000"/>
+              <w:right w:val="single" w:sz="4" w:space="0" w:color="000000"/>
+            </w:tcBorders>
+            <w:tcMar>
+              <w:top w:w="60" w:type="dxa"/>
+              <w:left w:w="100" w:type="dxa"/>
+              <w:bottom w:w="60" w:type="dxa"/>
+              <w:right w:w="100" w:type="dxa"/>
+            </w:tcMar>
+            <w:vAlign w:val="center"/>
+          </w:tcPr>
+          <w:p>
+            <w:r>
+              <w:rPr>
+                <w:b/>
+                <w:bCs/>
+              </w:rPr>
+              <w:t>Lecturer/Supervisor</w:t>
+            </w:r>
+          </w:p>
+        </w:tc>
+        <w:tc>
+          <w:tcPr>
+            <w:tcW w:w="6438" w:type="dxa"/>
+            <w:tcBorders>
+              <w:top w:val="single" w:sz="4" w:space="0" w:color="000000"/>
+              <w:left w:val="single" w:sz="4" w:space="0" w:color="000000"/>
+              <w:bottom w:val="single" w:sz="4" w:space="0" w:color="000000"/>
+              <w:right w:val="single" w:sz="4" w:space="0" w:color="000000"/>
+            </w:tcBorders>
+            <w:tcMar>
+              <w:top w:w="60" w:type="dxa"/>
+              <w:left w:w="100" w:type="dxa"/>
+              <w:bottom w:w="60" w:type="dxa"/>
+              <w:right w:w="100" w:type="dxa"/>
+            </w:tcMar>
+          </w:tcPr>
+          <w:p>
+            <w:r>
+              <w:rPr>
+                <w:lang w:val="fr-FR"/>
+              </w:rPr>
+              <w:t>Taufique Ahmed</w:t>
+            </w:r>
+          </w:p>
+        </w:tc>
+      </w:tr>
+      <w:tr>
+        <w:tc>
+          <w:tcPr>
+            <w:tcW w:w="3200" w:type="dxa"/>
+            <w:tcBorders>
+              <w:top w:val="single" w:sz="4" w:space="0" w:color="000000"/>
+              <w:left w:val="single" w:sz="4" w:space="0" w:color="000000"/>
+              <w:bottom w:val="single" w:sz="4" w:space="0" w:color="000000"/>
+              <w:right w:val="single" w:sz="4" w:space="0" w:color="000000"/>
+            </w:tcBorders>
+            <w:tcMar>
+              <w:top w:w="60" w:type="dxa"/>
+              <w:left w:w="100" w:type="dxa"/>
+              <w:bottom w:w="60" w:type="dxa"/>
+              <w:right w:w="100" w:type="dxa"/>
+            </w:tcMar>
+            <w:vAlign w:val="center"/>
+          </w:tcPr>
+          <w:p>
+            <w:r>
+              <w:rPr>
+                <w:b/>
+                <w:bCs/>
+              </w:rPr>
+              <w:t>Assessment Due Date</w:t>
+            </w:r>
+          </w:p>
+        </w:tc>
+        <w:tc>
+          <w:tcPr>
+            <w:tcW w:w="6438" w:type="dxa"/>
+            <w:tcBorders>
+              <w:top w:val="single" w:sz="4" w:space="0" w:color="000000"/>
+              <w:left w:val="single" w:sz="4" w:space="0" w:color="000000"/>
+              <w:bottom w:val="single" w:sz="4" w:space="0" w:color="000000"/>
+              <w:right w:val="single" w:sz="4" w:space="0" w:color="000000"/>
+            </w:tcBorders>
+            <w:tcMar>
+              <w:top w:w="60" w:type="dxa"/>
+              <w:left w:w="100" w:type="dxa"/>
+              <w:bottom w:w="60" w:type="dxa"/>
+              <w:right w:w="100" w:type="dxa"/>
+            </w:tcMar>
+          </w:tcPr>
+          <w:p>
+            <w:r>
+              <w:t>24.10.2026</w:t>
+            </w:r>
+          </w:p>
+        </w:tc>
+      </w:tr>
+      <w:tr>
+        <w:tc>
+          <w:tcPr>
+            <w:tcW w:w="3200" w:type="dxa"/>
+            <w:tcBorders>
+              <w:top w:val="single" w:sz="4" w:space="0" w:color="000000"/>
+              <w:left w:val="single" w:sz="4" w:space="0" w:color="000000"/>
+              <w:bottom w:val="single" w:sz="4" w:space="0" w:color="000000"/>
+              <w:right w:val="single" w:sz="4" w:space="0" w:color="000000"/>
+            </w:tcBorders>
+            <w:tcMar>
+              <w:top w:w="60" w:type="dxa"/>
+              <w:left w:w="100" w:type="dxa"/>
+              <w:bottom w:w="60" w:type="dxa"/>
+              <w:right w:w="100" w:type="dxa"/>
+            </w:tcMar>
+            <w:vAlign w:val="center"/>
+          </w:tcPr>
+          <w:p>
+            <w:r>
+              <w:rPr>
+                <w:b/>
+                <w:bCs/>
+              </w:rPr>
+              <w:t>Date of Submission</w:t>
+            </w:r>
+          </w:p>
+        </w:tc>
+        <w:tc>
+          <w:tcPr>
+            <w:tcW w:w="6438" w:type="dxa"/>
+            <w:tcBorders>
+              <w:top w:val="single" w:sz="4" w:space="0" w:color="000000"/>
+              <w:left w:val="single" w:sz="4" w:space="0" w:color="000000"/>
+              <w:bottom w:val="single" w:sz="4" w:space="0" w:color="000000"/>
+              <w:right w:val="single" w:sz="4" w:space="0" w:color="000000"/>
+            </w:tcBorders>
+            <w:tcMar>
+              <w:top w:w="60" w:type="dxa"/>
+              <w:left w:w="100" w:type="dxa"/>
+              <w:bottom w:w="60" w:type="dxa"/>
+              <w:right w:w="100" w:type="dxa"/>
+            </w:tcMar>
+          </w:tcPr>
+          <w:p>
+            <w:r>
+              <w:t>25.10.2026</w:t>
+            </w:r>
+          </w:p>
+        </w:tc>
+      </w:tr>
+    </w:tbl>
     <w:p>
       <w:pPr>
         <w:pStyle w:val="Heading2"/>
-        <w:rPr>
-          <w:lang w:val="en-US"/>
-        </w:rPr>
-      </w:pPr>
-    </w:p>
-    <w:p>
-      <w:pPr>
-        <w:rPr>
-          <w:lang w:val="en-US"/>
-        </w:rPr>
-      </w:pPr>
-    </w:p>
-    <w:p>
-      <w:pPr>
-        <w:rPr>
+        <w:jc w:val="center"/>
+        <w:rPr>
+          <w:u w:val="single"/>
           <w:lang w:val="en-US"/>
         </w:rPr>
       </w:pPr>
@@ -51,14 +499,149 @@
     <w:p>
       <w:pPr>
         <w:pStyle w:val="Heading2"/>
-        <w:rPr>
-          <w:lang w:val="en-US"/>
-        </w:rPr>
-      </w:pPr>
-      <w:r>
-        <w:rPr>
-          <w:lang w:val="en-US"/>
-        </w:rPr>
+        <w:jc w:val="center"/>
+        <w:rPr>
+          <w:u w:val="single"/>
+          <w:lang w:val="en-US"/>
+        </w:rPr>
+      </w:pPr>
+    </w:p>
+    <w:p>
+      <w:pPr>
+        <w:pStyle w:val="Heading2"/>
+        <w:jc w:val="center"/>
+        <w:rPr>
+          <w:u w:val="single"/>
+          <w:lang w:val="en-US"/>
+        </w:rPr>
+      </w:pPr>
+    </w:p>
+    <w:p>
+      <w:pPr>
+        <w:pStyle w:val="Heading2"/>
+        <w:jc w:val="center"/>
+        <w:rPr>
+          <w:u w:val="single"/>
+          <w:lang w:val="en-US"/>
+        </w:rPr>
+      </w:pPr>
+    </w:p>
+    <w:p>
+      <w:pPr>
+        <w:pStyle w:val="Heading2"/>
+        <w:jc w:val="center"/>
+        <w:rPr>
+          <w:u w:val="single"/>
+          <w:lang w:val="en-US"/>
+        </w:rPr>
+      </w:pPr>
+    </w:p>
+    <w:p>
+      <w:pPr>
+        <w:rPr>
+          <w:lang w:val="en-US"/>
+        </w:rPr>
+      </w:pPr>
+    </w:p>
+    <w:p>
+      <w:pPr>
+        <w:rPr>
+          <w:lang w:val="en-US"/>
+        </w:rPr>
+      </w:pPr>
+    </w:p>
+    <w:p>
+      <w:pPr>
+        <w:rPr>
+          <w:lang w:val="en-US"/>
+        </w:rPr>
+      </w:pPr>
+    </w:p>
+    <w:p>
+      <w:pPr>
+        <w:rPr>
+          <w:lang w:val="en-US"/>
+        </w:rPr>
+      </w:pPr>
+    </w:p>
+    <w:p>
+      <w:pPr>
+        <w:rPr>
+          <w:lang w:val="en-US"/>
+        </w:rPr>
+      </w:pPr>
+    </w:p>
+    <w:p>
+      <w:pPr>
+        <w:rPr>
+          <w:lang w:val="en-US"/>
+        </w:rPr>
+      </w:pPr>
+    </w:p>
+    <w:p>
+      <w:pPr>
+        <w:pStyle w:val="Heading2"/>
+        <w:jc w:val="center"/>
+        <w:rPr>
+          <w:u w:val="single"/>
+          <w:lang w:val="en-US"/>
+        </w:rPr>
+      </w:pPr>
+    </w:p>
+    <w:p>
+      <w:pPr>
+        <w:pStyle w:val="Heading2"/>
+        <w:jc w:val="center"/>
+        <w:rPr>
+          <w:u w:val="single"/>
+          <w:lang w:val="en-US"/>
+        </w:rPr>
+      </w:pPr>
+    </w:p>
+    <w:p>
+      <w:pPr>
+        <w:pStyle w:val="Heading2"/>
+        <w:jc w:val="center"/>
+        <w:rPr>
+          <w:u w:val="single"/>
+          <w:lang w:val="en-US"/>
+        </w:rPr>
+      </w:pPr>
+    </w:p>
+    <w:p>
+      <w:pPr>
+        <w:pStyle w:val="Heading2"/>
+        <w:rPr>
+          <w:lang w:val="en-US"/>
+        </w:rPr>
+      </w:pPr>
+    </w:p>
+    <w:p>
+      <w:pPr>
+        <w:rPr>
+          <w:lang w:val="en-US"/>
+        </w:rPr>
+      </w:pPr>
+    </w:p>
+    <w:p>
+      <w:pPr>
+        <w:rPr>
+          <w:lang w:val="en-US"/>
+        </w:rPr>
+      </w:pPr>
+    </w:p>
+    <w:p>
+      <w:pPr>
+        <w:pStyle w:val="Heading2"/>
+        <w:rPr>
+          <w:lang w:val="en-US"/>
+        </w:rPr>
+      </w:pPr>
+      <w:r>
+        <w:rPr>
+          <w:lang w:val="en-US"/>
+        </w:rPr>
+        <w:lastRenderedPageBreak/>
         <w:t>Summary</w:t>
       </w:r>
     </w:p>
@@ -309,8 +892,7 @@
       <w:pPr>
         <w:pStyle w:val="Heading3"/>
         <w:rPr>
-          <w:rFonts w:ascii="Trebuchet MS" w:hAnsi="Trebuchet MS" w:cs="Times New Roman"/>
-          <w:lang w:val="en-US"/>
+          <w:rFonts w:asciiTheme="minorHAnsi" w:hAnsiTheme="minorHAnsi" w:cstheme="minorHAnsi"/>
         </w:rPr>
       </w:pPr>
       <w:r>
@@ -332,6 +914,42 @@
         <w:t>0</w:t>
       </w:r>
     </w:p>
+    <w:p/>
+    <w:p>
+      <w:pPr>
+        <w:rPr>
+          <w:rFonts w:asciiTheme="minorHAnsi" w:eastAsiaTheme="majorEastAsia" w:hAnsiTheme="minorHAnsi" w:cstheme="minorHAnsi"/>
+          <w:b/>
+          <w:bCs/>
+          <w:color w:val="4F81BD" w:themeColor="accent1"/>
+        </w:rPr>
+      </w:pPr>
+      <w:r>
+        <w:rPr>
+          <w:rFonts w:asciiTheme="minorHAnsi" w:eastAsiaTheme="majorEastAsia" w:hAnsiTheme="minorHAnsi" w:cstheme="minorHAnsi"/>
+          <w:b/>
+          <w:bCs/>
+          <w:color w:val="4F81BD" w:themeColor="accent1"/>
+        </w:rPr>
+        <w:t>References</w:t>
+      </w:r>
+      <w:r>
+        <w:rPr>
+          <w:rFonts w:asciiTheme="minorHAnsi" w:eastAsiaTheme="majorEastAsia" w:hAnsiTheme="minorHAnsi" w:cstheme="minorHAnsi"/>
+          <w:b/>
+          <w:bCs/>
+          <w:color w:val="4F81BD" w:themeColor="accent1"/>
+        </w:rPr>
+        <w:t xml:space="preserve"> ………………………………………………………………………………………………………………………. 11</w:t>
+      </w:r>
+    </w:p>
+    <w:p>
+      <w:pPr>
+        <w:rPr>
+          <w:lang w:val="en-US"/>
+        </w:rPr>
+      </w:pPr>
+    </w:p>
     <w:p>
       <w:pPr>
         <w:pStyle w:val="ListParagraph"/>
@@ -503,13 +1121,6 @@
     </w:p>
     <w:p>
       <w:pPr>
-        <w:rPr>
-          <w:lang w:val="en-US"/>
-        </w:rPr>
-      </w:pPr>
-    </w:p>
-    <w:p>
-      <w:pPr>
         <w:pStyle w:val="Heading2"/>
         <w:rPr>
           <w:lang w:val="en-US"/>
@@ -519,6 +1130,7 @@
         <w:rPr>
           <w:lang w:val="en-US"/>
         </w:rPr>
+        <w:lastRenderedPageBreak/>
         <w:t>Introduction</w:t>
       </w:r>
     </w:p>
@@ -550,7 +1162,7 @@
         </w:rPr>
         <w:t>The Chronic Disease Indicators (CDI) web tool (</w:t>
       </w:r>
-      <w:hyperlink r:id="rId6" w:tgtFrame="_blank" w:history="1">
+      <w:hyperlink r:id="rId7" w:tgtFrame="_blank" w:history="1">
         <w:r>
           <w:rPr>
             <w:rStyle w:val="Hyperlink"/>
@@ -733,22 +1345,13 @@
         </w:rPr>
         <w:t xml:space="preserve"> Indicators (CDI</w:t>
       </w:r>
-      <w:proofErr w:type="gramStart"/>
-      <w:r>
-        <w:rPr>
-          <w:rFonts w:asciiTheme="minorHAnsi" w:hAnsiTheme="minorHAnsi" w:cstheme="minorHAnsi"/>
-          <w:lang w:val="en-US"/>
-        </w:rPr>
-        <w:t xml:space="preserve">) </w:t>
-      </w:r>
-      <w:r>
-        <w:rPr>
-          <w:rFonts w:asciiTheme="minorHAnsi" w:hAnsiTheme="minorHAnsi" w:cstheme="minorHAnsi"/>
-          <w:lang w:val="en-US"/>
-        </w:rPr>
-        <w:t>,</w:t>
-      </w:r>
-      <w:proofErr w:type="gramEnd"/>
+      <w:r>
+        <w:rPr>
+          <w:rFonts w:asciiTheme="minorHAnsi" w:hAnsiTheme="minorHAnsi" w:cstheme="minorHAnsi"/>
+          <w:lang w:val="en-US"/>
+        </w:rPr>
+        <w:t>),</w:t>
+      </w:r>
       <w:r>
         <w:rPr>
           <w:rFonts w:asciiTheme="minorHAnsi" w:hAnsiTheme="minorHAnsi" w:cstheme="minorHAnsi"/>
@@ -819,21 +1422,7 @@
           <w:rFonts w:asciiTheme="minorHAnsi" w:hAnsiTheme="minorHAnsi" w:cstheme="minorHAnsi"/>
           <w:lang w:val="en-US"/>
         </w:rPr>
-        <w:t>explain</w:t>
-      </w:r>
-      <w:r>
-        <w:rPr>
-          <w:rFonts w:asciiTheme="minorHAnsi" w:hAnsiTheme="minorHAnsi" w:cstheme="minorHAnsi"/>
-          <w:lang w:val="en-US"/>
-        </w:rPr>
-        <w:t xml:space="preserve"> the simplest </w:t>
-      </w:r>
-      <w:r>
-        <w:rPr>
-          <w:rFonts w:asciiTheme="minorHAnsi" w:hAnsiTheme="minorHAnsi" w:cstheme="minorHAnsi"/>
-          <w:lang w:val="en-US"/>
-        </w:rPr>
-        <w:t>terms possible,</w:t>
+        <w:t>provide</w:t>
       </w:r>
       <w:r>
         <w:rPr>
@@ -847,97 +1436,79 @@
           <w:rFonts w:asciiTheme="minorHAnsi" w:hAnsiTheme="minorHAnsi" w:cstheme="minorHAnsi"/>
           <w:lang w:val="en-US"/>
         </w:rPr>
-        <w:t xml:space="preserve">importance of this data collection for society in general and how it can affect individuals; It will also highlight why prevention is essential in </w:t>
-      </w:r>
-      <w:r>
-        <w:rPr>
-          <w:rFonts w:asciiTheme="minorHAnsi" w:hAnsiTheme="minorHAnsi" w:cstheme="minorHAnsi"/>
-          <w:lang w:val="en-US"/>
-        </w:rPr>
-        <w:t>this</w:t>
-      </w:r>
-      <w:r>
-        <w:rPr>
-          <w:rFonts w:asciiTheme="minorHAnsi" w:hAnsiTheme="minorHAnsi" w:cstheme="minorHAnsi"/>
-          <w:lang w:val="en-US"/>
-        </w:rPr>
-        <w:t xml:space="preserve"> process in which the government must be proactive, effective, and sufficient manner.</w:t>
-      </w:r>
-    </w:p>
-    <w:p>
-      <w:pPr>
-        <w:rPr>
-          <w:rFonts w:asciiTheme="minorHAnsi" w:hAnsiTheme="minorHAnsi" w:cstheme="minorHAnsi"/>
-          <w:lang w:val="en-US"/>
-        </w:rPr>
-      </w:pPr>
-    </w:p>
-    <w:p>
-      <w:pPr>
-        <w:rPr>
-          <w:rFonts w:asciiTheme="minorHAnsi" w:hAnsiTheme="minorHAnsi" w:cstheme="minorHAnsi"/>
-          <w:lang w:val="en-US"/>
-        </w:rPr>
-      </w:pPr>
-      <w:r>
-        <w:rPr>
-          <w:rFonts w:asciiTheme="minorHAnsi" w:hAnsiTheme="minorHAnsi" w:cstheme="minorHAnsi"/>
-          <w:lang w:val="en-US"/>
-        </w:rPr>
-        <w:t>You are invited</w:t>
-      </w:r>
-      <w:r>
-        <w:rPr>
-          <w:rFonts w:asciiTheme="minorHAnsi" w:hAnsiTheme="minorHAnsi" w:cstheme="minorHAnsi"/>
-          <w:lang w:val="en-US"/>
-        </w:rPr>
-        <w:t xml:space="preserve"> to </w:t>
-      </w:r>
-      <w:r>
-        <w:rPr>
-          <w:rFonts w:asciiTheme="minorHAnsi" w:hAnsiTheme="minorHAnsi" w:cstheme="minorHAnsi"/>
-          <w:lang w:val="en-US"/>
-        </w:rPr>
-        <w:t>join this journey of knowledge and discovery of human body and a sample of its diseases, to understand little bit more how the prevention works and how the style life changes can improve or harm your life outcome as human being.</w:t>
-      </w:r>
-    </w:p>
-    <w:p>
-      <w:pPr>
-        <w:rPr>
-          <w:rFonts w:asciiTheme="minorHAnsi" w:hAnsiTheme="minorHAnsi" w:cstheme="minorHAnsi"/>
-          <w:lang w:val="en-US"/>
-        </w:rPr>
-      </w:pPr>
-    </w:p>
-    <w:p>
-      <w:pPr>
-        <w:rPr>
-          <w:rFonts w:asciiTheme="minorHAnsi" w:hAnsiTheme="minorHAnsi" w:cstheme="minorHAnsi"/>
-          <w:lang w:val="en-US"/>
-        </w:rPr>
-      </w:pPr>
-      <w:r>
-        <w:rPr>
-          <w:rFonts w:asciiTheme="minorHAnsi" w:hAnsiTheme="minorHAnsi" w:cstheme="minorHAnsi"/>
-          <w:lang w:val="en-US"/>
-        </w:rPr>
-        <w:t>If you come closer, you will be able to see such interesting and important value of this subject and perhaps one day you can help someone or yourself.</w:t>
-      </w:r>
-    </w:p>
-    <w:p>
-      <w:pPr>
-        <w:rPr>
-          <w:rFonts w:asciiTheme="minorHAnsi" w:hAnsiTheme="minorHAnsi" w:cstheme="minorHAnsi"/>
-          <w:lang w:val="en-US"/>
-        </w:rPr>
-      </w:pPr>
-      <w:r>
-        <w:rPr>
-          <w:rFonts w:asciiTheme="minorHAnsi" w:hAnsiTheme="minorHAnsi" w:cstheme="minorHAnsi"/>
-          <w:lang w:val="en-US"/>
-        </w:rPr>
-        <w:t xml:space="preserve"> </w:t>
-      </w:r>
+        <w:t>methods and techniques using Machine learning, Data preparation, Statistical and strategic thinking to improve the data analysis and how it can be easier and clear to work on</w:t>
+      </w:r>
+      <w:r>
+        <w:rPr>
+          <w:rFonts w:asciiTheme="minorHAnsi" w:hAnsiTheme="minorHAnsi" w:cstheme="minorHAnsi"/>
+          <w:lang w:val="en-US"/>
+        </w:rPr>
+        <w:t>.</w:t>
+      </w:r>
+    </w:p>
+    <w:p>
+      <w:pPr>
+        <w:rPr>
+          <w:rFonts w:asciiTheme="minorHAnsi" w:hAnsiTheme="minorHAnsi" w:cstheme="minorHAnsi"/>
+          <w:lang w:val="en-US"/>
+        </w:rPr>
+      </w:pPr>
+    </w:p>
+    <w:p>
+      <w:pPr>
+        <w:rPr>
+          <w:rFonts w:asciiTheme="minorHAnsi" w:hAnsiTheme="minorHAnsi" w:cstheme="minorHAnsi"/>
+          <w:lang w:val="en-US"/>
+        </w:rPr>
+      </w:pPr>
+    </w:p>
+    <w:p>
+      <w:pPr>
+        <w:rPr>
+          <w:rFonts w:asciiTheme="minorHAnsi" w:hAnsiTheme="minorHAnsi" w:cstheme="minorHAnsi"/>
+          <w:lang w:val="en-US"/>
+        </w:rPr>
+      </w:pPr>
+    </w:p>
+    <w:p>
+      <w:pPr>
+        <w:rPr>
+          <w:rFonts w:asciiTheme="minorHAnsi" w:hAnsiTheme="minorHAnsi" w:cstheme="minorHAnsi"/>
+          <w:lang w:val="en-US"/>
+        </w:rPr>
+      </w:pPr>
+    </w:p>
+    <w:p>
+      <w:pPr>
+        <w:rPr>
+          <w:rFonts w:asciiTheme="minorHAnsi" w:hAnsiTheme="minorHAnsi" w:cstheme="minorHAnsi"/>
+          <w:lang w:val="en-US"/>
+        </w:rPr>
+      </w:pPr>
+    </w:p>
+    <w:p>
+      <w:pPr>
+        <w:rPr>
+          <w:rFonts w:asciiTheme="minorHAnsi" w:hAnsiTheme="minorHAnsi" w:cstheme="minorHAnsi"/>
+          <w:lang w:val="en-US"/>
+        </w:rPr>
+      </w:pPr>
+    </w:p>
+    <w:p>
+      <w:pPr>
+        <w:rPr>
+          <w:rFonts w:asciiTheme="minorHAnsi" w:hAnsiTheme="minorHAnsi" w:cstheme="minorHAnsi"/>
+          <w:lang w:val="en-US"/>
+        </w:rPr>
+      </w:pPr>
+    </w:p>
+    <w:p>
+      <w:pPr>
+        <w:rPr>
+          <w:rFonts w:asciiTheme="minorHAnsi" w:hAnsiTheme="minorHAnsi" w:cstheme="minorHAnsi"/>
+          <w:lang w:val="en-US"/>
+        </w:rPr>
+      </w:pPr>
     </w:p>
     <w:p>
       <w:pPr>
@@ -1067,6 +1638,7 @@
           <w:iCs/>
           <w:lang w:val="en-US"/>
         </w:rPr>
+        <w:lastRenderedPageBreak/>
         <w:t>Problem Definition</w:t>
       </w:r>
     </w:p>
@@ -1347,28 +1919,31 @@
         <w:rPr>
           <w:rFonts w:asciiTheme="minorHAnsi" w:hAnsiTheme="minorHAnsi" w:cstheme="minorHAnsi"/>
         </w:rPr>
-        <w:t xml:space="preserve">Based on this information above the dataset chose to be used on this project was extracted from </w:t>
-      </w:r>
-      <w:hyperlink r:id="rId7" w:history="1">
-        <w:r>
-          <w:rPr>
-            <w:rStyle w:val="Hyperlink"/>
-            <w:rFonts w:asciiTheme="minorHAnsi" w:hAnsiTheme="minorHAnsi" w:cstheme="minorHAnsi"/>
-          </w:rPr>
-          <w:t>U.S. Department of Health &amp; Human Services - U.S. Chronic Disease Indicators</w:t>
-        </w:r>
-      </w:hyperlink>
-      <w:r>
-        <w:rPr>
-          <w:rFonts w:asciiTheme="minorHAnsi" w:hAnsiTheme="minorHAnsi" w:cstheme="minorHAnsi"/>
-        </w:rPr>
-        <w:t xml:space="preserve"> , </w:t>
-      </w:r>
-      <w:r>
-        <w:rPr>
-          <w:rFonts w:asciiTheme="minorHAnsi" w:hAnsiTheme="minorHAnsi" w:cstheme="minorHAnsi"/>
-        </w:rPr>
-        <w:t>and the indicators will be explored</w:t>
+        <w:t xml:space="preserve">Based on this information above the dataset chose to be used on this project was extracted </w:t>
+      </w:r>
+      <w:r>
+        <w:rPr>
+          <w:rFonts w:asciiTheme="minorHAnsi" w:hAnsiTheme="minorHAnsi" w:cstheme="minorHAnsi"/>
+        </w:rPr>
+        <w:t xml:space="preserve">from Measures </w:t>
+      </w:r>
+      <w:r>
+        <w:rPr>
+          <w:rFonts w:asciiTheme="minorHAnsi" w:hAnsiTheme="minorHAnsi" w:cstheme="minorHAnsi"/>
+        </w:rPr>
+        <w:t xml:space="preserve">indicators </w:t>
+      </w:r>
+      <w:r>
+        <w:rPr>
+          <w:rFonts w:asciiTheme="minorHAnsi" w:hAnsiTheme="minorHAnsi" w:cstheme="minorHAnsi"/>
+        </w:rPr>
+        <w:t>to</w:t>
+      </w:r>
+      <w:r>
+        <w:rPr>
+          <w:rFonts w:asciiTheme="minorHAnsi" w:hAnsiTheme="minorHAnsi" w:cstheme="minorHAnsi"/>
+        </w:rPr>
+        <w:t xml:space="preserve"> be explored</w:t>
       </w:r>
       <w:r>
         <w:rPr>
@@ -1440,6 +2015,20 @@
         </w:rPr>
         <w:t xml:space="preserve">  </w:t>
       </w:r>
+    </w:p>
+    <w:p>
+      <w:pPr>
+        <w:rPr>
+          <w:lang w:val="en-US"/>
+        </w:rPr>
+      </w:pPr>
+    </w:p>
+    <w:p>
+      <w:pPr>
+        <w:rPr>
+          <w:lang w:val="en-US"/>
+        </w:rPr>
+      </w:pPr>
     </w:p>
     <w:p>
       <w:pPr>
@@ -1598,13 +2187,7 @@
         <w:rPr>
           <w:rFonts w:asciiTheme="minorHAnsi" w:hAnsiTheme="minorHAnsi" w:cstheme="minorHAnsi"/>
         </w:rPr>
-        <w:t xml:space="preserve">The aim of this project is to provide </w:t>
-      </w:r>
-      <w:r>
-        <w:rPr>
-          <w:rFonts w:asciiTheme="minorHAnsi" w:hAnsiTheme="minorHAnsi" w:cstheme="minorHAnsi"/>
-        </w:rPr>
-        <w:t xml:space="preserve">full </w:t>
+        <w:t xml:space="preserve">The aim of this project is to provide full </w:t>
       </w:r>
       <w:r>
         <w:rPr>
@@ -1616,13 +2199,7 @@
         <w:rPr>
           <w:rFonts w:asciiTheme="minorHAnsi" w:hAnsiTheme="minorHAnsi" w:cstheme="minorHAnsi"/>
         </w:rPr>
-        <w:t xml:space="preserve"> </w:t>
-      </w:r>
-      <w:r>
-        <w:rPr>
-          <w:rFonts w:asciiTheme="minorHAnsi" w:hAnsiTheme="minorHAnsi" w:cstheme="minorHAnsi"/>
-        </w:rPr>
-        <w:t xml:space="preserve">of Data, since </w:t>
+        <w:t xml:space="preserve"> of Data, since </w:t>
       </w:r>
       <w:r>
         <w:rPr>
@@ -2373,21 +2950,7 @@
           <w:rFonts w:asciiTheme="minorHAnsi" w:hAnsiTheme="minorHAnsi" w:cstheme="minorHAnsi"/>
           <w:lang w:val="en-US"/>
         </w:rPr>
-        <w:t xml:space="preserve">12 topics related to </w:t>
-      </w:r>
-      <w:r>
-        <w:rPr>
-          <w:rFonts w:asciiTheme="minorHAnsi" w:hAnsiTheme="minorHAnsi" w:cstheme="minorHAnsi"/>
-          <w:lang w:val="en-US"/>
-        </w:rPr>
-        <w:t>diseases already developed or acquired</w:t>
-      </w:r>
-      <w:r>
-        <w:rPr>
-          <w:rFonts w:asciiTheme="minorHAnsi" w:hAnsiTheme="minorHAnsi" w:cstheme="minorHAnsi"/>
-          <w:lang w:val="en-US"/>
-        </w:rPr>
-        <w:t>.</w:t>
+        <w:t>12 topics related to diseases already developed or acquired.</w:t>
       </w:r>
     </w:p>
     <w:p>
@@ -2710,19 +3273,7 @@
         <w:rPr>
           <w:rFonts w:asciiTheme="minorHAnsi" w:hAnsiTheme="minorHAnsi" w:cstheme="minorHAnsi"/>
         </w:rPr>
-        <w:t>T</w:t>
-      </w:r>
-      <w:r>
-        <w:rPr>
-          <w:rFonts w:asciiTheme="minorHAnsi" w:hAnsiTheme="minorHAnsi" w:cstheme="minorHAnsi"/>
-        </w:rPr>
-        <w:t>he dataset chose to be used on this project was extracted from</w:t>
-      </w:r>
-      <w:r>
-        <w:rPr>
-          <w:rFonts w:asciiTheme="minorHAnsi" w:hAnsiTheme="minorHAnsi" w:cstheme="minorHAnsi"/>
-        </w:rPr>
-        <w:t>:</w:t>
+        <w:t>The dataset chose to be used on this project was extracted from:</w:t>
       </w:r>
     </w:p>
     <w:p>
@@ -3128,21 +3679,7 @@
           <w:lang w:val="en-US"/>
         </w:rPr>
         <w:lastRenderedPageBreak/>
-        <w:t>H</w:t>
-      </w:r>
-      <w:r>
-        <w:rPr>
-          <w:rFonts w:asciiTheme="majorHAnsi" w:eastAsiaTheme="majorEastAsia" w:hAnsiTheme="majorHAnsi" w:cstheme="majorBidi"/>
-          <w:b/>
-          <w:bCs/>
-          <w:i/>
-          <w:iCs/>
-          <w:color w:val="4F81BD" w:themeColor="accent1"/>
-          <w:sz w:val="26"/>
-          <w:szCs w:val="26"/>
-          <w:lang w:val="en-US"/>
-        </w:rPr>
-        <w:t>igh-level architectural diagram</w:t>
+        <w:t>High-level architectural diagram</w:t>
       </w:r>
     </w:p>
     <w:p>
@@ -3465,9 +4002,447 @@
           <w:lang w:val="en-US"/>
         </w:rPr>
         <w:lastRenderedPageBreak/>
-        <w:t>Data Sources</w:t>
-      </w:r>
-      <w:r>
+        <w:t>Data Sources:</w:t>
+      </w:r>
+    </w:p>
+    <w:p>
+      <w:pPr>
+        <w:rPr>
+          <w:rFonts w:asciiTheme="minorHAnsi" w:hAnsiTheme="minorHAnsi" w:cstheme="minorHAnsi"/>
+        </w:rPr>
+      </w:pPr>
+    </w:p>
+    <w:p>
+      <w:pPr>
+        <w:rPr>
+          <w:rFonts w:asciiTheme="minorHAnsi" w:hAnsiTheme="minorHAnsi" w:cstheme="minorHAnsi"/>
+        </w:rPr>
+      </w:pPr>
+    </w:p>
+    <w:p>
+      <w:pPr>
+        <w:rPr>
+          <w:rFonts w:asciiTheme="minorHAnsi" w:hAnsiTheme="minorHAnsi" w:cstheme="minorHAnsi"/>
+        </w:rPr>
+      </w:pPr>
+      <w:r>
+        <w:rPr>
+          <w:rFonts w:asciiTheme="minorHAnsi" w:hAnsiTheme="minorHAnsi" w:cstheme="minorHAnsi"/>
+        </w:rPr>
+        <w:t xml:space="preserve">The primary data source </w:t>
+      </w:r>
+      <w:r>
+        <w:rPr>
+          <w:rFonts w:asciiTheme="minorHAnsi" w:hAnsiTheme="minorHAnsi" w:cstheme="minorHAnsi"/>
+        </w:rPr>
+        <w:t xml:space="preserve">has a size of the 39K features </w:t>
+      </w:r>
+      <w:r>
+        <w:rPr>
+          <w:rFonts w:asciiTheme="minorHAnsi" w:hAnsiTheme="minorHAnsi" w:cstheme="minorHAnsi"/>
+        </w:rPr>
+        <w:t>was extracted from</w:t>
+      </w:r>
+      <w:r>
+        <w:rPr>
+          <w:rFonts w:asciiTheme="minorHAnsi" w:hAnsiTheme="minorHAnsi" w:cstheme="minorHAnsi"/>
+        </w:rPr>
+        <w:t>:</w:t>
+      </w:r>
+    </w:p>
+    <w:p>
+      <w:pPr>
+        <w:rPr>
+          <w:rFonts w:asciiTheme="minorHAnsi" w:hAnsiTheme="minorHAnsi" w:cstheme="minorHAnsi"/>
+        </w:rPr>
+      </w:pPr>
+      <w:hyperlink r:id="rId14" w:history="1">
+        <w:r>
+          <w:rPr>
+            <w:rStyle w:val="Hyperlink"/>
+            <w:rFonts w:asciiTheme="minorHAnsi" w:hAnsiTheme="minorHAnsi" w:cstheme="minorHAnsi"/>
+          </w:rPr>
+          <w:t>https://catalog.data.gov/dataset/u-s-chronic-disease-indicators</w:t>
+        </w:r>
+      </w:hyperlink>
+    </w:p>
+    <w:p>
+      <w:pPr>
+        <w:rPr>
+          <w:rFonts w:asciiTheme="minorHAnsi" w:hAnsiTheme="minorHAnsi" w:cstheme="minorHAnsi"/>
+        </w:rPr>
+      </w:pPr>
+      <w:r>
+        <w:rPr>
+          <w:rFonts w:asciiTheme="minorHAnsi" w:hAnsiTheme="minorHAnsi" w:cstheme="minorHAnsi"/>
+        </w:rPr>
+        <w:t>Which is available for public resources with different format (CSV, JSON, KML, and others).</w:t>
+      </w:r>
+      <w:r>
+        <w:rPr>
+          <w:rFonts w:asciiTheme="minorHAnsi" w:hAnsiTheme="minorHAnsi" w:cstheme="minorHAnsi"/>
+        </w:rPr>
+        <w:t xml:space="preserve"> Where this file will be relevant to process Machine Learning models and predictions.</w:t>
+      </w:r>
+    </w:p>
+    <w:p>
+      <w:pPr>
+        <w:rPr>
+          <w:rFonts w:asciiTheme="minorHAnsi" w:hAnsiTheme="minorHAnsi" w:cstheme="minorHAnsi"/>
+        </w:rPr>
+      </w:pPr>
+    </w:p>
+    <w:p>
+      <w:pPr>
+        <w:rPr>
+          <w:rFonts w:asciiTheme="minorHAnsi" w:hAnsiTheme="minorHAnsi" w:cstheme="minorHAnsi"/>
+        </w:rPr>
+      </w:pPr>
+      <w:r>
+        <w:rPr>
+          <w:rFonts w:asciiTheme="minorHAnsi" w:hAnsiTheme="minorHAnsi" w:cstheme="minorHAnsi"/>
+        </w:rPr>
+        <w:t>The</w:t>
+      </w:r>
+      <w:r>
+        <w:rPr>
+          <w:rFonts w:asciiTheme="minorHAnsi" w:hAnsiTheme="minorHAnsi" w:cstheme="minorHAnsi"/>
+        </w:rPr>
+        <w:t xml:space="preserve"> source</w:t>
+      </w:r>
+      <w:r>
+        <w:rPr>
+          <w:rFonts w:asciiTheme="minorHAnsi" w:hAnsiTheme="minorHAnsi" w:cstheme="minorHAnsi"/>
+        </w:rPr>
+        <w:t xml:space="preserve"> Chronic Disease Indicators (CDI) tool provides national and state estimates for a set of key surveillance indicators of chronic diseases and their risk factors</w:t>
+      </w:r>
+      <w:r>
+        <w:rPr>
+          <w:rFonts w:asciiTheme="minorHAnsi" w:hAnsiTheme="minorHAnsi" w:cstheme="minorHAnsi"/>
+        </w:rPr>
+        <w:t xml:space="preserve">. </w:t>
+      </w:r>
+      <w:r>
+        <w:rPr>
+          <w:rFonts w:asciiTheme="minorHAnsi" w:hAnsiTheme="minorHAnsi" w:cstheme="minorHAnsi"/>
+        </w:rPr>
+        <w:t>The</w:t>
+      </w:r>
+      <w:r>
+        <w:rPr>
+          <w:rFonts w:asciiTheme="minorHAnsi" w:hAnsiTheme="minorHAnsi" w:cstheme="minorHAnsi"/>
+        </w:rPr>
+        <w:t xml:space="preserve"> Data.gov was created as</w:t>
+      </w:r>
+      <w:r>
+        <w:rPr>
+          <w:rFonts w:asciiTheme="minorHAnsi" w:hAnsiTheme="minorHAnsi" w:cstheme="minorHAnsi"/>
+        </w:rPr>
+        <w:t xml:space="preserve"> </w:t>
+      </w:r>
+      <w:r>
+        <w:rPr>
+          <w:rFonts w:asciiTheme="minorHAnsi" w:hAnsiTheme="minorHAnsi" w:cstheme="minorHAnsi"/>
+        </w:rPr>
+        <w:t xml:space="preserve">sources </w:t>
+      </w:r>
+      <w:r>
+        <w:rPr>
+          <w:rFonts w:asciiTheme="minorHAnsi" w:hAnsiTheme="minorHAnsi" w:cstheme="minorHAnsi"/>
+        </w:rPr>
+        <w:t xml:space="preserve">to informing decision by the public and policymakers, economic impact </w:t>
+      </w:r>
+      <w:r>
+        <w:rPr>
+          <w:rFonts w:asciiTheme="minorHAnsi" w:hAnsiTheme="minorHAnsi" w:cstheme="minorHAnsi"/>
+        </w:rPr>
+        <w:t>on</w:t>
+      </w:r>
+      <w:r>
+        <w:rPr>
+          <w:rFonts w:asciiTheme="minorHAnsi" w:hAnsiTheme="minorHAnsi" w:cstheme="minorHAnsi"/>
+        </w:rPr>
+        <w:t xml:space="preserve"> the society </w:t>
+      </w:r>
+      <w:r>
+        <w:rPr>
+          <w:rFonts w:asciiTheme="minorHAnsi" w:hAnsiTheme="minorHAnsi" w:cstheme="minorHAnsi"/>
+        </w:rPr>
+        <w:t xml:space="preserve">related the subject </w:t>
+      </w:r>
+      <w:r>
+        <w:rPr>
+          <w:rFonts w:asciiTheme="minorHAnsi" w:hAnsiTheme="minorHAnsi" w:cstheme="minorHAnsi"/>
+        </w:rPr>
+        <w:t>that we will work on and develop</w:t>
+      </w:r>
+      <w:r>
+        <w:rPr>
+          <w:rFonts w:asciiTheme="minorHAnsi" w:hAnsiTheme="minorHAnsi" w:cstheme="minorHAnsi"/>
+        </w:rPr>
+        <w:t>, any access is available online on that website.</w:t>
+      </w:r>
+    </w:p>
+    <w:p>
+      <w:pPr>
+        <w:rPr>
+          <w:rFonts w:asciiTheme="minorHAnsi" w:hAnsiTheme="minorHAnsi" w:cstheme="minorHAnsi"/>
+        </w:rPr>
+      </w:pPr>
+    </w:p>
+    <w:p>
+      <w:pPr>
+        <w:rPr>
+          <w:rFonts w:asciiTheme="minorHAnsi" w:hAnsiTheme="minorHAnsi" w:cstheme="minorHAnsi"/>
+        </w:rPr>
+      </w:pPr>
+    </w:p>
+    <w:p>
+      <w:pPr>
+        <w:rPr>
+          <w:rFonts w:asciiTheme="minorHAnsi" w:hAnsiTheme="minorHAnsi" w:cstheme="minorHAnsi"/>
+        </w:rPr>
+      </w:pPr>
+    </w:p>
+    <w:p>
+      <w:pPr>
+        <w:rPr>
+          <w:rFonts w:asciiTheme="minorHAnsi" w:hAnsiTheme="minorHAnsi" w:cstheme="minorHAnsi"/>
+        </w:rPr>
+      </w:pPr>
+    </w:p>
+    <w:p>
+      <w:pPr>
+        <w:rPr>
+          <w:rFonts w:asciiTheme="minorHAnsi" w:hAnsiTheme="minorHAnsi" w:cstheme="minorHAnsi"/>
+        </w:rPr>
+      </w:pPr>
+    </w:p>
+    <w:p>
+      <w:pPr>
+        <w:rPr>
+          <w:rFonts w:asciiTheme="minorHAnsi" w:hAnsiTheme="minorHAnsi" w:cstheme="minorHAnsi"/>
+        </w:rPr>
+      </w:pPr>
+    </w:p>
+    <w:p>
+      <w:pPr>
+        <w:rPr>
+          <w:rFonts w:asciiTheme="minorHAnsi" w:hAnsiTheme="minorHAnsi" w:cstheme="minorHAnsi"/>
+        </w:rPr>
+      </w:pPr>
+    </w:p>
+    <w:p>
+      <w:pPr>
+        <w:rPr>
+          <w:rFonts w:asciiTheme="minorHAnsi" w:hAnsiTheme="minorHAnsi" w:cstheme="minorHAnsi"/>
+        </w:rPr>
+      </w:pPr>
+    </w:p>
+    <w:p>
+      <w:pPr>
+        <w:rPr>
+          <w:rFonts w:asciiTheme="minorHAnsi" w:hAnsiTheme="minorHAnsi" w:cstheme="minorHAnsi"/>
+        </w:rPr>
+      </w:pPr>
+    </w:p>
+    <w:p>
+      <w:pPr>
+        <w:rPr>
+          <w:rFonts w:asciiTheme="minorHAnsi" w:hAnsiTheme="minorHAnsi" w:cstheme="minorHAnsi"/>
+        </w:rPr>
+      </w:pPr>
+    </w:p>
+    <w:p>
+      <w:pPr>
+        <w:rPr>
+          <w:rFonts w:asciiTheme="minorHAnsi" w:hAnsiTheme="minorHAnsi" w:cstheme="minorHAnsi"/>
+        </w:rPr>
+      </w:pPr>
+    </w:p>
+    <w:p>
+      <w:pPr>
+        <w:rPr>
+          <w:rFonts w:asciiTheme="minorHAnsi" w:hAnsiTheme="minorHAnsi" w:cstheme="minorHAnsi"/>
+        </w:rPr>
+      </w:pPr>
+    </w:p>
+    <w:p>
+      <w:pPr>
+        <w:rPr>
+          <w:rFonts w:asciiTheme="minorHAnsi" w:hAnsiTheme="minorHAnsi" w:cstheme="minorHAnsi"/>
+        </w:rPr>
+      </w:pPr>
+    </w:p>
+    <w:p>
+      <w:pPr>
+        <w:rPr>
+          <w:rFonts w:asciiTheme="minorHAnsi" w:hAnsiTheme="minorHAnsi" w:cstheme="minorHAnsi"/>
+        </w:rPr>
+      </w:pPr>
+    </w:p>
+    <w:p>
+      <w:pPr>
+        <w:rPr>
+          <w:rFonts w:asciiTheme="minorHAnsi" w:hAnsiTheme="minorHAnsi" w:cstheme="minorHAnsi"/>
+        </w:rPr>
+      </w:pPr>
+    </w:p>
+    <w:p>
+      <w:pPr>
+        <w:rPr>
+          <w:rFonts w:asciiTheme="minorHAnsi" w:hAnsiTheme="minorHAnsi" w:cstheme="minorHAnsi"/>
+        </w:rPr>
+      </w:pPr>
+    </w:p>
+    <w:p>
+      <w:pPr>
+        <w:rPr>
+          <w:rFonts w:asciiTheme="minorHAnsi" w:hAnsiTheme="minorHAnsi" w:cstheme="minorHAnsi"/>
+        </w:rPr>
+      </w:pPr>
+    </w:p>
+    <w:p>
+      <w:pPr>
+        <w:rPr>
+          <w:rFonts w:asciiTheme="minorHAnsi" w:hAnsiTheme="minorHAnsi" w:cstheme="minorHAnsi"/>
+        </w:rPr>
+      </w:pPr>
+    </w:p>
+    <w:p>
+      <w:pPr>
+        <w:rPr>
+          <w:rFonts w:asciiTheme="minorHAnsi" w:hAnsiTheme="minorHAnsi" w:cstheme="minorHAnsi"/>
+        </w:rPr>
+      </w:pPr>
+    </w:p>
+    <w:p>
+      <w:pPr>
+        <w:rPr>
+          <w:rFonts w:asciiTheme="minorHAnsi" w:hAnsiTheme="minorHAnsi" w:cstheme="minorHAnsi"/>
+        </w:rPr>
+      </w:pPr>
+    </w:p>
+    <w:p>
+      <w:pPr>
+        <w:rPr>
+          <w:rFonts w:asciiTheme="minorHAnsi" w:hAnsiTheme="minorHAnsi" w:cstheme="minorHAnsi"/>
+        </w:rPr>
+      </w:pPr>
+    </w:p>
+    <w:p>
+      <w:pPr>
+        <w:rPr>
+          <w:rFonts w:asciiTheme="minorHAnsi" w:hAnsiTheme="minorHAnsi" w:cstheme="minorHAnsi"/>
+        </w:rPr>
+      </w:pPr>
+    </w:p>
+    <w:p>
+      <w:pPr>
+        <w:rPr>
+          <w:rFonts w:asciiTheme="minorHAnsi" w:hAnsiTheme="minorHAnsi" w:cstheme="minorHAnsi"/>
+        </w:rPr>
+      </w:pPr>
+    </w:p>
+    <w:p>
+      <w:pPr>
+        <w:rPr>
+          <w:rFonts w:asciiTheme="minorHAnsi" w:hAnsiTheme="minorHAnsi" w:cstheme="minorHAnsi"/>
+        </w:rPr>
+      </w:pPr>
+    </w:p>
+    <w:p>
+      <w:pPr>
+        <w:rPr>
+          <w:rFonts w:asciiTheme="minorHAnsi" w:hAnsiTheme="minorHAnsi" w:cstheme="minorHAnsi"/>
+        </w:rPr>
+      </w:pPr>
+    </w:p>
+    <w:p>
+      <w:pPr>
+        <w:rPr>
+          <w:rFonts w:asciiTheme="minorHAnsi" w:hAnsiTheme="minorHAnsi" w:cstheme="minorHAnsi"/>
+        </w:rPr>
+      </w:pPr>
+    </w:p>
+    <w:p>
+      <w:pPr>
+        <w:rPr>
+          <w:rFonts w:asciiTheme="minorHAnsi" w:hAnsiTheme="minorHAnsi" w:cstheme="minorHAnsi"/>
+        </w:rPr>
+      </w:pPr>
+    </w:p>
+    <w:p>
+      <w:pPr>
+        <w:rPr>
+          <w:rFonts w:asciiTheme="minorHAnsi" w:hAnsiTheme="minorHAnsi" w:cstheme="minorHAnsi"/>
+        </w:rPr>
+      </w:pPr>
+    </w:p>
+    <w:p>
+      <w:pPr>
+        <w:rPr>
+          <w:rFonts w:asciiTheme="minorHAnsi" w:hAnsiTheme="minorHAnsi" w:cstheme="minorHAnsi"/>
+        </w:rPr>
+      </w:pPr>
+    </w:p>
+    <w:p>
+      <w:pPr>
+        <w:rPr>
+          <w:rFonts w:asciiTheme="minorHAnsi" w:hAnsiTheme="minorHAnsi" w:cstheme="minorHAnsi"/>
+        </w:rPr>
+      </w:pPr>
+    </w:p>
+    <w:p>
+      <w:pPr>
+        <w:rPr>
+          <w:rFonts w:asciiTheme="minorHAnsi" w:hAnsiTheme="minorHAnsi" w:cstheme="minorHAnsi"/>
+        </w:rPr>
+      </w:pPr>
+    </w:p>
+    <w:p>
+      <w:pPr>
+        <w:rPr>
+          <w:rFonts w:asciiTheme="minorHAnsi" w:hAnsiTheme="minorHAnsi" w:cstheme="minorHAnsi"/>
+        </w:rPr>
+      </w:pPr>
+    </w:p>
+    <w:p>
+      <w:pPr>
+        <w:rPr>
+          <w:rFonts w:asciiTheme="minorHAnsi" w:hAnsiTheme="minorHAnsi" w:cstheme="minorHAnsi"/>
+        </w:rPr>
+      </w:pPr>
+    </w:p>
+    <w:p>
+      <w:pPr>
+        <w:rPr>
+          <w:rFonts w:asciiTheme="minorHAnsi" w:hAnsiTheme="minorHAnsi" w:cstheme="minorHAnsi"/>
+        </w:rPr>
+      </w:pPr>
+    </w:p>
+    <w:p>
+      <w:pPr>
+        <w:rPr>
+          <w:rFonts w:asciiTheme="minorHAnsi" w:hAnsiTheme="minorHAnsi" w:cstheme="minorHAnsi"/>
+        </w:rPr>
+      </w:pPr>
+    </w:p>
+    <w:p>
+      <w:pPr>
+        <w:rPr>
+          <w:rFonts w:asciiTheme="minorHAnsi" w:hAnsiTheme="minorHAnsi" w:cstheme="minorHAnsi"/>
+        </w:rPr>
+      </w:pPr>
+      <w:r>
+        <w:rPr>
+          <w:rFonts w:asciiTheme="minorHAnsi" w:hAnsiTheme="minorHAnsi" w:cstheme="minorHAnsi"/>
+        </w:rPr>
+        <w:t xml:space="preserve">                                                                                                                                                                                         8</w:t>
+      </w:r>
+    </w:p>
+    <w:p>
+      <w:pPr>
         <w:rPr>
           <w:rFonts w:asciiTheme="majorHAnsi" w:eastAsiaTheme="majorEastAsia" w:hAnsiTheme="majorHAnsi" w:cstheme="majorBidi"/>
           <w:b/>
@@ -3479,399 +4454,8 @@
           <w:szCs w:val="26"/>
           <w:lang w:val="en-US"/>
         </w:rPr>
-        <w:t>:</w:t>
-      </w:r>
-    </w:p>
-    <w:p>
-      <w:pPr>
-        <w:rPr>
-          <w:rFonts w:asciiTheme="minorHAnsi" w:hAnsiTheme="minorHAnsi" w:cstheme="minorHAnsi"/>
-        </w:rPr>
-      </w:pPr>
-    </w:p>
-    <w:p>
-      <w:pPr>
-        <w:rPr>
-          <w:rFonts w:asciiTheme="minorHAnsi" w:hAnsiTheme="minorHAnsi" w:cstheme="minorHAnsi"/>
-        </w:rPr>
-      </w:pPr>
-    </w:p>
-    <w:p>
-      <w:pPr>
-        <w:rPr>
-          <w:rFonts w:asciiTheme="minorHAnsi" w:hAnsiTheme="minorHAnsi" w:cstheme="minorHAnsi"/>
-        </w:rPr>
-      </w:pPr>
-      <w:r>
-        <w:rPr>
-          <w:rFonts w:asciiTheme="minorHAnsi" w:hAnsiTheme="minorHAnsi" w:cstheme="minorHAnsi"/>
-        </w:rPr>
-        <w:t xml:space="preserve">The primary data source was extracted from  </w:t>
-      </w:r>
-      <w:hyperlink r:id="rId14" w:history="1">
-        <w:r>
-          <w:rPr>
-            <w:rStyle w:val="Hyperlink"/>
-            <w:rFonts w:asciiTheme="minorHAnsi" w:hAnsiTheme="minorHAnsi" w:cstheme="minorHAnsi"/>
-          </w:rPr>
-          <w:t>U.S. Department of Health &amp; Human Services - U.S. Chronic Disease Indicators</w:t>
-        </w:r>
-      </w:hyperlink>
-    </w:p>
-    <w:p>
-      <w:pPr>
-        <w:rPr>
-          <w:rFonts w:asciiTheme="minorHAnsi" w:hAnsiTheme="minorHAnsi" w:cstheme="minorHAnsi"/>
-        </w:rPr>
-      </w:pPr>
-      <w:r>
-        <w:rPr>
-          <w:rFonts w:asciiTheme="minorHAnsi" w:hAnsiTheme="minorHAnsi" w:cstheme="minorHAnsi"/>
-        </w:rPr>
-        <w:t>Which is available for public resources with different format (CSV, JSON, KML, and others).</w:t>
-      </w:r>
-    </w:p>
-    <w:p>
-      <w:pPr>
-        <w:rPr>
-          <w:rFonts w:asciiTheme="minorHAnsi" w:hAnsiTheme="minorHAnsi" w:cstheme="minorHAnsi"/>
-        </w:rPr>
-      </w:pPr>
-    </w:p>
-    <w:p>
-      <w:pPr>
-        <w:rPr>
-          <w:rFonts w:asciiTheme="minorHAnsi" w:hAnsiTheme="minorHAnsi" w:cstheme="minorHAnsi"/>
-        </w:rPr>
-      </w:pPr>
-      <w:r>
-        <w:rPr>
-          <w:rFonts w:asciiTheme="minorHAnsi" w:hAnsiTheme="minorHAnsi" w:cstheme="minorHAnsi"/>
-        </w:rPr>
-        <w:t>Supportive sources related the subject were:</w:t>
-      </w:r>
-    </w:p>
-    <w:p>
-      <w:pPr>
-        <w:rPr>
-          <w:rFonts w:asciiTheme="minorHAnsi" w:hAnsiTheme="minorHAnsi" w:cstheme="minorHAnsi"/>
-        </w:rPr>
-      </w:pPr>
-    </w:p>
-    <w:p>
-      <w:pPr>
-        <w:rPr>
-          <w:rFonts w:asciiTheme="minorHAnsi" w:hAnsiTheme="minorHAnsi" w:cstheme="minorHAnsi"/>
-          <w:lang w:val="en-US"/>
-        </w:rPr>
-      </w:pPr>
-      <w:hyperlink r:id="rId15" w:history="1">
-        <w:r>
-          <w:rPr>
-            <w:rStyle w:val="Hyperlink"/>
-            <w:rFonts w:asciiTheme="minorHAnsi" w:hAnsiTheme="minorHAnsi" w:cstheme="minorHAnsi"/>
-          </w:rPr>
-          <w:t>Chronic Disease Indicators: 2022-2024 Refresh and Modernization of the Web Tool. - Abstract - Europe PMC</w:t>
-        </w:r>
-      </w:hyperlink>
-    </w:p>
-    <w:p>
-      <w:pPr>
-        <w:rPr>
-          <w:rFonts w:asciiTheme="minorHAnsi" w:hAnsiTheme="minorHAnsi" w:cstheme="minorHAnsi"/>
-          <w:lang w:val="en-US"/>
-        </w:rPr>
-      </w:pPr>
-    </w:p>
-    <w:p>
-      <w:pPr>
-        <w:rPr>
-          <w:rFonts w:asciiTheme="minorHAnsi" w:hAnsiTheme="minorHAnsi" w:cstheme="minorHAnsi"/>
-          <w:lang w:val="en-US"/>
-        </w:rPr>
-      </w:pPr>
-      <w:hyperlink r:id="rId16" w:history="1">
-        <w:r>
-          <w:rPr>
-            <w:rStyle w:val="Hyperlink"/>
-            <w:rFonts w:asciiTheme="minorHAnsi" w:hAnsiTheme="minorHAnsi" w:cstheme="minorHAnsi"/>
-          </w:rPr>
-          <w:t>2026 EU4Health Work Programme - Public Health - European Commission</w:t>
-        </w:r>
-      </w:hyperlink>
-    </w:p>
-    <w:p>
-      <w:pPr>
-        <w:rPr>
-          <w:rFonts w:asciiTheme="minorHAnsi" w:hAnsiTheme="minorHAnsi" w:cstheme="minorHAnsi"/>
-          <w:lang w:val="en-US"/>
-        </w:rPr>
-      </w:pPr>
-    </w:p>
-    <w:p>
-      <w:pPr>
-        <w:rPr>
-          <w:rFonts w:asciiTheme="minorHAnsi" w:hAnsiTheme="minorHAnsi" w:cstheme="minorHAnsi"/>
-        </w:rPr>
-      </w:pPr>
-      <w:hyperlink r:id="rId17" w:history="1">
-        <w:r>
-          <w:rPr>
-            <w:rStyle w:val="Hyperlink"/>
-            <w:rFonts w:asciiTheme="minorHAnsi" w:hAnsiTheme="minorHAnsi" w:cstheme="minorHAnsi"/>
-          </w:rPr>
-          <w:t>Chronic Disease Indicators (CDI) | DPH | CDC</w:t>
-        </w:r>
-      </w:hyperlink>
-    </w:p>
-    <w:p>
-      <w:pPr>
-        <w:rPr>
-          <w:rFonts w:asciiTheme="minorHAnsi" w:hAnsiTheme="minorHAnsi" w:cstheme="minorHAnsi"/>
-        </w:rPr>
-      </w:pPr>
-    </w:p>
-    <w:p>
-      <w:pPr>
-        <w:rPr>
-          <w:rFonts w:asciiTheme="minorHAnsi" w:hAnsiTheme="minorHAnsi" w:cstheme="minorHAnsi"/>
-        </w:rPr>
-      </w:pPr>
-      <w:hyperlink r:id="rId18" w:history="1">
-        <w:r>
-          <w:rPr>
-            <w:rStyle w:val="Hyperlink"/>
-            <w:rFonts w:asciiTheme="minorHAnsi" w:hAnsiTheme="minorHAnsi" w:cstheme="minorHAnsi"/>
-          </w:rPr>
-          <w:t>EU chronic diseases data and information - Public Health</w:t>
-        </w:r>
-      </w:hyperlink>
-    </w:p>
-    <w:p>
-      <w:pPr>
-        <w:rPr>
-          <w:rFonts w:asciiTheme="minorHAnsi" w:hAnsiTheme="minorHAnsi" w:cstheme="minorHAnsi"/>
-        </w:rPr>
-      </w:pPr>
-    </w:p>
-    <w:p>
-      <w:pPr>
-        <w:rPr>
-          <w:rFonts w:asciiTheme="minorHAnsi" w:hAnsiTheme="minorHAnsi" w:cstheme="minorHAnsi"/>
-        </w:rPr>
-      </w:pPr>
-    </w:p>
-    <w:p>
-      <w:pPr>
-        <w:rPr>
-          <w:rFonts w:asciiTheme="minorHAnsi" w:hAnsiTheme="minorHAnsi" w:cstheme="minorHAnsi"/>
-        </w:rPr>
-      </w:pPr>
-    </w:p>
-    <w:p>
-      <w:pPr>
-        <w:rPr>
-          <w:rFonts w:asciiTheme="minorHAnsi" w:hAnsiTheme="minorHAnsi" w:cstheme="minorHAnsi"/>
-        </w:rPr>
-      </w:pPr>
-    </w:p>
-    <w:p>
-      <w:pPr>
-        <w:rPr>
-          <w:rFonts w:asciiTheme="minorHAnsi" w:hAnsiTheme="minorHAnsi" w:cstheme="minorHAnsi"/>
-        </w:rPr>
-      </w:pPr>
-    </w:p>
-    <w:p>
-      <w:pPr>
-        <w:rPr>
-          <w:rFonts w:asciiTheme="minorHAnsi" w:hAnsiTheme="minorHAnsi" w:cstheme="minorHAnsi"/>
-        </w:rPr>
-      </w:pPr>
-    </w:p>
-    <w:p>
-      <w:pPr>
-        <w:rPr>
-          <w:rFonts w:asciiTheme="minorHAnsi" w:hAnsiTheme="minorHAnsi" w:cstheme="minorHAnsi"/>
-        </w:rPr>
-      </w:pPr>
-    </w:p>
-    <w:p>
-      <w:pPr>
-        <w:rPr>
-          <w:rFonts w:asciiTheme="minorHAnsi" w:hAnsiTheme="minorHAnsi" w:cstheme="minorHAnsi"/>
-        </w:rPr>
-      </w:pPr>
-    </w:p>
-    <w:p>
-      <w:pPr>
-        <w:rPr>
-          <w:rFonts w:asciiTheme="minorHAnsi" w:hAnsiTheme="minorHAnsi" w:cstheme="minorHAnsi"/>
-        </w:rPr>
-      </w:pPr>
-    </w:p>
-    <w:p>
-      <w:pPr>
-        <w:rPr>
-          <w:rFonts w:asciiTheme="minorHAnsi" w:hAnsiTheme="minorHAnsi" w:cstheme="minorHAnsi"/>
-        </w:rPr>
-      </w:pPr>
-    </w:p>
-    <w:p>
-      <w:pPr>
-        <w:rPr>
-          <w:rFonts w:asciiTheme="minorHAnsi" w:hAnsiTheme="minorHAnsi" w:cstheme="minorHAnsi"/>
-        </w:rPr>
-      </w:pPr>
-    </w:p>
-    <w:p>
-      <w:pPr>
-        <w:rPr>
-          <w:rFonts w:asciiTheme="minorHAnsi" w:hAnsiTheme="minorHAnsi" w:cstheme="minorHAnsi"/>
-        </w:rPr>
-      </w:pPr>
-    </w:p>
-    <w:p>
-      <w:pPr>
-        <w:rPr>
-          <w:rFonts w:asciiTheme="minorHAnsi" w:hAnsiTheme="minorHAnsi" w:cstheme="minorHAnsi"/>
-        </w:rPr>
-      </w:pPr>
-    </w:p>
-    <w:p>
-      <w:pPr>
-        <w:rPr>
-          <w:rFonts w:asciiTheme="minorHAnsi" w:hAnsiTheme="minorHAnsi" w:cstheme="minorHAnsi"/>
-        </w:rPr>
-      </w:pPr>
-    </w:p>
-    <w:p>
-      <w:pPr>
-        <w:rPr>
-          <w:rFonts w:asciiTheme="minorHAnsi" w:hAnsiTheme="minorHAnsi" w:cstheme="minorHAnsi"/>
-        </w:rPr>
-      </w:pPr>
-    </w:p>
-    <w:p>
-      <w:pPr>
-        <w:rPr>
-          <w:rFonts w:asciiTheme="minorHAnsi" w:hAnsiTheme="minorHAnsi" w:cstheme="minorHAnsi"/>
-        </w:rPr>
-      </w:pPr>
-    </w:p>
-    <w:p>
-      <w:pPr>
-        <w:rPr>
-          <w:rFonts w:asciiTheme="minorHAnsi" w:hAnsiTheme="minorHAnsi" w:cstheme="minorHAnsi"/>
-        </w:rPr>
-      </w:pPr>
-    </w:p>
-    <w:p>
-      <w:pPr>
-        <w:rPr>
-          <w:rFonts w:asciiTheme="minorHAnsi" w:hAnsiTheme="minorHAnsi" w:cstheme="minorHAnsi"/>
-        </w:rPr>
-      </w:pPr>
-    </w:p>
-    <w:p>
-      <w:pPr>
-        <w:rPr>
-          <w:rFonts w:asciiTheme="minorHAnsi" w:hAnsiTheme="minorHAnsi" w:cstheme="minorHAnsi"/>
-        </w:rPr>
-      </w:pPr>
-    </w:p>
-    <w:p>
-      <w:pPr>
-        <w:rPr>
-          <w:rFonts w:asciiTheme="minorHAnsi" w:hAnsiTheme="minorHAnsi" w:cstheme="minorHAnsi"/>
-        </w:rPr>
-      </w:pPr>
-    </w:p>
-    <w:p>
-      <w:pPr>
-        <w:rPr>
-          <w:rFonts w:asciiTheme="minorHAnsi" w:hAnsiTheme="minorHAnsi" w:cstheme="minorHAnsi"/>
-        </w:rPr>
-      </w:pPr>
-    </w:p>
-    <w:p>
-      <w:pPr>
-        <w:rPr>
-          <w:rFonts w:asciiTheme="minorHAnsi" w:hAnsiTheme="minorHAnsi" w:cstheme="minorHAnsi"/>
-        </w:rPr>
-      </w:pPr>
-    </w:p>
-    <w:p>
-      <w:pPr>
-        <w:rPr>
-          <w:rFonts w:asciiTheme="minorHAnsi" w:hAnsiTheme="minorHAnsi" w:cstheme="minorHAnsi"/>
-        </w:rPr>
-      </w:pPr>
-    </w:p>
-    <w:p>
-      <w:pPr>
-        <w:rPr>
-          <w:rFonts w:asciiTheme="minorHAnsi" w:hAnsiTheme="minorHAnsi" w:cstheme="minorHAnsi"/>
-        </w:rPr>
-      </w:pPr>
-    </w:p>
-    <w:p>
-      <w:pPr>
-        <w:rPr>
-          <w:rFonts w:asciiTheme="minorHAnsi" w:hAnsiTheme="minorHAnsi" w:cstheme="minorHAnsi"/>
-        </w:rPr>
-      </w:pPr>
-    </w:p>
-    <w:p>
-      <w:pPr>
-        <w:rPr>
-          <w:rFonts w:asciiTheme="minorHAnsi" w:hAnsiTheme="minorHAnsi" w:cstheme="minorHAnsi"/>
-        </w:rPr>
-      </w:pPr>
-    </w:p>
-    <w:p>
-      <w:pPr>
-        <w:rPr>
-          <w:rFonts w:asciiTheme="minorHAnsi" w:hAnsiTheme="minorHAnsi" w:cstheme="minorHAnsi"/>
-        </w:rPr>
-      </w:pPr>
-    </w:p>
-    <w:p>
-      <w:pPr>
-        <w:rPr>
-          <w:rFonts w:asciiTheme="minorHAnsi" w:hAnsiTheme="minorHAnsi" w:cstheme="minorHAnsi"/>
-        </w:rPr>
-      </w:pPr>
-    </w:p>
-    <w:p>
-      <w:pPr>
-        <w:rPr>
-          <w:rFonts w:asciiTheme="minorHAnsi" w:hAnsiTheme="minorHAnsi" w:cstheme="minorHAnsi"/>
-        </w:rPr>
-      </w:pPr>
-    </w:p>
-    <w:p>
-      <w:pPr>
-        <w:rPr>
-          <w:rFonts w:asciiTheme="minorHAnsi" w:hAnsiTheme="minorHAnsi" w:cstheme="minorHAnsi"/>
-        </w:rPr>
-      </w:pPr>
-    </w:p>
-    <w:p>
-      <w:pPr>
-        <w:rPr>
-          <w:rFonts w:asciiTheme="minorHAnsi" w:hAnsiTheme="minorHAnsi" w:cstheme="minorHAnsi"/>
-        </w:rPr>
-      </w:pPr>
-      <w:r>
-        <w:rPr>
-          <w:rFonts w:asciiTheme="minorHAnsi" w:hAnsiTheme="minorHAnsi" w:cstheme="minorHAnsi"/>
-        </w:rPr>
-        <w:t xml:space="preserve">                                                                                                                                                                                         8</w:t>
-      </w:r>
-    </w:p>
-    <w:p>
-      <w:pPr>
+      </w:pPr>
+      <w:r>
         <w:rPr>
           <w:rFonts w:asciiTheme="majorHAnsi" w:eastAsiaTheme="majorEastAsia" w:hAnsiTheme="majorHAnsi" w:cstheme="majorBidi"/>
           <w:b/>
@@ -3883,8 +4467,12 @@
           <w:szCs w:val="26"/>
           <w:lang w:val="en-US"/>
         </w:rPr>
-      </w:pPr>
-      <w:r>
+        <w:lastRenderedPageBreak/>
+        <w:t>Expected Deliverables</w:t>
+      </w:r>
+    </w:p>
+    <w:p>
+      <w:pPr>
         <w:rPr>
           <w:rFonts w:asciiTheme="majorHAnsi" w:eastAsiaTheme="majorEastAsia" w:hAnsiTheme="majorHAnsi" w:cstheme="majorBidi"/>
           <w:b/>
@@ -3896,23 +4484,6 @@
           <w:szCs w:val="26"/>
           <w:lang w:val="en-US"/>
         </w:rPr>
-        <w:lastRenderedPageBreak/>
-        <w:t>Expected Deliverables</w:t>
-      </w:r>
-    </w:p>
-    <w:p>
-      <w:pPr>
-        <w:rPr>
-          <w:rFonts w:asciiTheme="majorHAnsi" w:eastAsiaTheme="majorEastAsia" w:hAnsiTheme="majorHAnsi" w:cstheme="majorBidi"/>
-          <w:b/>
-          <w:bCs/>
-          <w:i/>
-          <w:iCs/>
-          <w:color w:val="4F81BD" w:themeColor="accent1"/>
-          <w:sz w:val="26"/>
-          <w:szCs w:val="26"/>
-          <w:lang w:val="en-US"/>
-        </w:rPr>
       </w:pPr>
     </w:p>
     <w:p>
@@ -3964,49 +4535,7 @@
           <w:rFonts w:asciiTheme="minorHAnsi" w:hAnsiTheme="minorHAnsi" w:cstheme="minorHAnsi"/>
           <w:lang w:val="en-US"/>
         </w:rPr>
-        <w:t xml:space="preserve">Each step is essential, such as the Dataset choice up to reviewing the relevant information to amend, modify or remove information to a new csv file created by Python tool using the classification, collection and Division, Evaluation, and after all of these steps, closure of the </w:t>
-      </w:r>
-      <w:r>
-        <w:rPr>
-          <w:rFonts w:asciiTheme="minorHAnsi" w:hAnsiTheme="minorHAnsi" w:cstheme="minorHAnsi"/>
-          <w:lang w:val="en-US"/>
-        </w:rPr>
-        <w:t>study</w:t>
-      </w:r>
-      <w:r>
-        <w:rPr>
-          <w:rFonts w:asciiTheme="minorHAnsi" w:hAnsiTheme="minorHAnsi" w:cstheme="minorHAnsi"/>
-          <w:lang w:val="en-US"/>
-        </w:rPr>
-        <w:t xml:space="preserve"> with a </w:t>
-      </w:r>
-      <w:r>
-        <w:rPr>
-          <w:rFonts w:asciiTheme="minorHAnsi" w:hAnsiTheme="minorHAnsi" w:cstheme="minorHAnsi"/>
-          <w:lang w:val="en-US"/>
-        </w:rPr>
-        <w:t xml:space="preserve">best </w:t>
-      </w:r>
-      <w:r>
-        <w:rPr>
-          <w:rFonts w:asciiTheme="minorHAnsi" w:hAnsiTheme="minorHAnsi" w:cstheme="minorHAnsi"/>
-          <w:lang w:val="en-US"/>
-        </w:rPr>
-        <w:t>decision</w:t>
-      </w:r>
-      <w:r>
-        <w:rPr>
-          <w:rFonts w:asciiTheme="minorHAnsi" w:hAnsiTheme="minorHAnsi" w:cstheme="minorHAnsi"/>
-          <w:lang w:val="en-US"/>
-        </w:rPr>
-        <w:t xml:space="preserve"> taken</w:t>
-      </w:r>
-      <w:r>
-        <w:rPr>
-          <w:rFonts w:asciiTheme="minorHAnsi" w:hAnsiTheme="minorHAnsi" w:cstheme="minorHAnsi"/>
-          <w:lang w:val="en-US"/>
-        </w:rPr>
-        <w:t>.</w:t>
+        <w:t>Each step is essential, such as the Dataset choice up to reviewing the relevant information to amend, modify or remove information to a new csv file created by Python tool using the classification, collection and Division, Evaluation, and after all of these steps, closure of the study with a best decision taken.</w:t>
       </w:r>
     </w:p>
     <w:p>
@@ -4340,7 +4869,7 @@
             <wp:cNvGraphicFramePr/>
             <a:graphic xmlns:a="http://schemas.openxmlformats.org/drawingml/2006/main">
               <a:graphicData uri="http://schemas.openxmlformats.org/drawingml/2006/diagram">
-                <dgm:relIds xmlns:dgm="http://schemas.openxmlformats.org/drawingml/2006/diagram" xmlns:r="http://schemas.openxmlformats.org/officeDocument/2006/relationships" r:dm="rId19" r:lo="rId20" r:qs="rId21" r:cs="rId22"/>
+                <dgm:relIds xmlns:dgm="http://schemas.openxmlformats.org/drawingml/2006/diagram" xmlns:r="http://schemas.openxmlformats.org/officeDocument/2006/relationships" r:dm="rId15" r:lo="rId16" r:qs="rId17" r:cs="rId18"/>
               </a:graphicData>
             </a:graphic>
           </wp:inline>
@@ -4517,6 +5046,1646 @@
           <w:lang w:val="en-US"/>
         </w:rPr>
       </w:pPr>
+    </w:p>
+    <w:p>
+      <w:pPr>
+        <w:rPr>
+          <w:rFonts w:asciiTheme="minorHAnsi" w:eastAsiaTheme="majorEastAsia" w:hAnsiTheme="minorHAnsi" w:cstheme="minorHAnsi"/>
+          <w:lang w:val="en-US"/>
+        </w:rPr>
+      </w:pPr>
+      <w:r>
+        <w:rPr>
+          <w:rFonts w:asciiTheme="minorHAnsi" w:eastAsiaTheme="majorEastAsia" w:hAnsiTheme="minorHAnsi" w:cstheme="minorHAnsi"/>
+          <w:lang w:val="en-US"/>
+        </w:rPr>
+        <w:t>The data will be used only for academic and Research purposes, from a legal perspective, the project must comply with data protection and environmental regulations, General Data Protection Regulation (GDPR).</w:t>
+      </w:r>
+    </w:p>
+    <w:p>
+      <w:pPr>
+        <w:rPr>
+          <w:rFonts w:asciiTheme="minorHAnsi" w:eastAsiaTheme="majorEastAsia" w:hAnsiTheme="minorHAnsi" w:cstheme="minorHAnsi"/>
+          <w:lang w:val="en-US"/>
+        </w:rPr>
+      </w:pPr>
+    </w:p>
+    <w:p>
+      <w:pPr>
+        <w:rPr>
+          <w:rFonts w:asciiTheme="majorHAnsi" w:eastAsiaTheme="majorEastAsia" w:hAnsiTheme="majorHAnsi" w:cstheme="majorBidi"/>
+          <w:b/>
+          <w:bCs/>
+          <w:i/>
+          <w:iCs/>
+          <w:color w:val="4F81BD" w:themeColor="accent1"/>
+          <w:sz w:val="26"/>
+          <w:szCs w:val="26"/>
+          <w:lang w:val="en-US"/>
+        </w:rPr>
+      </w:pPr>
+      <w:r>
+        <w:rPr>
+          <w:rFonts w:asciiTheme="minorHAnsi" w:eastAsiaTheme="majorEastAsia" w:hAnsiTheme="minorHAnsi" w:cstheme="minorHAnsi"/>
+          <w:lang w:val="en-US"/>
+        </w:rPr>
+        <w:t>All</w:t>
+      </w:r>
+      <w:r>
+        <w:rPr>
+          <w:rFonts w:asciiTheme="minorHAnsi" w:eastAsiaTheme="majorEastAsia" w:hAnsiTheme="minorHAnsi" w:cstheme="minorHAnsi"/>
+          <w:lang w:val="en-US"/>
+        </w:rPr>
+        <w:t xml:space="preserve"> information accessed through Data.gov </w:t>
+      </w:r>
+      <w:proofErr w:type="gramStart"/>
+      <w:r>
+        <w:rPr>
+          <w:rFonts w:asciiTheme="minorHAnsi" w:eastAsiaTheme="majorEastAsia" w:hAnsiTheme="minorHAnsi" w:cstheme="minorHAnsi"/>
+          <w:lang w:val="en-US"/>
+        </w:rPr>
+        <w:t>is in compliance with</w:t>
+      </w:r>
+      <w:proofErr w:type="gramEnd"/>
+      <w:r>
+        <w:rPr>
+          <w:rFonts w:asciiTheme="minorHAnsi" w:eastAsiaTheme="majorEastAsia" w:hAnsiTheme="minorHAnsi" w:cstheme="minorHAnsi"/>
+          <w:lang w:val="en-US"/>
+        </w:rPr>
+        <w:t xml:space="preserve"> the required confidentiality, integrity, and availability controls mandated by Federal Information Processing Standard (FIPS) 199 as promulgated by the National Institute of Standards and Technology (NIST) and the associated NIST publications supporting the Certification and Accreditation (C&amp;A) process. Submitting Agencies</w:t>
+      </w:r>
+      <w:r>
+        <w:rPr>
+          <w:rFonts w:asciiTheme="minorHAnsi" w:eastAsiaTheme="majorEastAsia" w:hAnsiTheme="minorHAnsi" w:cstheme="minorHAnsi"/>
+        </w:rPr>
+        <w:t xml:space="preserve"> are required to follow NIST guidelines and OMB guidance (including C&amp;A requirements).</w:t>
+      </w:r>
+    </w:p>
+    <w:p>
+      <w:pPr>
+        <w:rPr>
+          <w:rFonts w:asciiTheme="majorHAnsi" w:eastAsiaTheme="majorEastAsia" w:hAnsiTheme="majorHAnsi" w:cstheme="majorBidi"/>
+          <w:b/>
+          <w:bCs/>
+          <w:i/>
+          <w:iCs/>
+          <w:color w:val="4F81BD" w:themeColor="accent1"/>
+          <w:sz w:val="26"/>
+          <w:szCs w:val="26"/>
+          <w:lang w:val="en-US"/>
+        </w:rPr>
+      </w:pPr>
+    </w:p>
+    <w:p>
+      <w:pPr>
+        <w:rPr>
+          <w:rFonts w:asciiTheme="majorHAnsi" w:eastAsiaTheme="majorEastAsia" w:hAnsiTheme="majorHAnsi" w:cstheme="majorBidi"/>
+          <w:b/>
+          <w:bCs/>
+          <w:i/>
+          <w:iCs/>
+          <w:color w:val="4F81BD" w:themeColor="accent1"/>
+          <w:sz w:val="26"/>
+          <w:szCs w:val="26"/>
+          <w:lang w:val="en-US"/>
+        </w:rPr>
+      </w:pPr>
+    </w:p>
+    <w:p>
+      <w:pPr>
+        <w:rPr>
+          <w:rFonts w:asciiTheme="majorHAnsi" w:eastAsiaTheme="majorEastAsia" w:hAnsiTheme="majorHAnsi" w:cstheme="majorBidi"/>
+          <w:b/>
+          <w:bCs/>
+          <w:i/>
+          <w:iCs/>
+          <w:color w:val="4F81BD" w:themeColor="accent1"/>
+          <w:sz w:val="26"/>
+          <w:szCs w:val="26"/>
+          <w:lang w:val="en-US"/>
+        </w:rPr>
+      </w:pPr>
+    </w:p>
+    <w:p>
+      <w:pPr>
+        <w:rPr>
+          <w:rFonts w:asciiTheme="majorHAnsi" w:eastAsiaTheme="majorEastAsia" w:hAnsiTheme="majorHAnsi" w:cstheme="majorBidi"/>
+          <w:b/>
+          <w:bCs/>
+          <w:i/>
+          <w:iCs/>
+          <w:color w:val="4F81BD" w:themeColor="accent1"/>
+          <w:sz w:val="26"/>
+          <w:szCs w:val="26"/>
+          <w:lang w:val="en-US"/>
+        </w:rPr>
+      </w:pPr>
+    </w:p>
+    <w:p>
+      <w:pPr>
+        <w:rPr>
+          <w:rFonts w:asciiTheme="majorHAnsi" w:eastAsiaTheme="majorEastAsia" w:hAnsiTheme="majorHAnsi" w:cstheme="majorBidi"/>
+          <w:b/>
+          <w:bCs/>
+          <w:i/>
+          <w:iCs/>
+          <w:color w:val="4F81BD" w:themeColor="accent1"/>
+          <w:sz w:val="26"/>
+          <w:szCs w:val="26"/>
+          <w:lang w:val="en-US"/>
+        </w:rPr>
+      </w:pPr>
+    </w:p>
+    <w:p>
+      <w:pPr>
+        <w:rPr>
+          <w:rFonts w:asciiTheme="majorHAnsi" w:eastAsiaTheme="majorEastAsia" w:hAnsiTheme="majorHAnsi" w:cstheme="majorBidi"/>
+          <w:b/>
+          <w:bCs/>
+          <w:i/>
+          <w:iCs/>
+          <w:color w:val="4F81BD" w:themeColor="accent1"/>
+          <w:sz w:val="26"/>
+          <w:szCs w:val="26"/>
+          <w:lang w:val="en-US"/>
+        </w:rPr>
+      </w:pPr>
+    </w:p>
+    <w:p>
+      <w:pPr>
+        <w:rPr>
+          <w:rFonts w:asciiTheme="majorHAnsi" w:eastAsiaTheme="majorEastAsia" w:hAnsiTheme="majorHAnsi" w:cstheme="majorBidi"/>
+          <w:b/>
+          <w:bCs/>
+          <w:i/>
+          <w:iCs/>
+          <w:color w:val="4F81BD" w:themeColor="accent1"/>
+          <w:sz w:val="26"/>
+          <w:szCs w:val="26"/>
+          <w:lang w:val="en-US"/>
+        </w:rPr>
+      </w:pPr>
+    </w:p>
+    <w:p>
+      <w:pPr>
+        <w:rPr>
+          <w:rFonts w:asciiTheme="majorHAnsi" w:eastAsiaTheme="majorEastAsia" w:hAnsiTheme="majorHAnsi" w:cstheme="majorBidi"/>
+          <w:b/>
+          <w:bCs/>
+          <w:i/>
+          <w:iCs/>
+          <w:color w:val="4F81BD" w:themeColor="accent1"/>
+          <w:sz w:val="26"/>
+          <w:szCs w:val="26"/>
+          <w:lang w:val="en-US"/>
+        </w:rPr>
+      </w:pPr>
+    </w:p>
+    <w:p>
+      <w:pPr>
+        <w:rPr>
+          <w:rFonts w:asciiTheme="majorHAnsi" w:eastAsiaTheme="majorEastAsia" w:hAnsiTheme="majorHAnsi" w:cstheme="majorBidi"/>
+          <w:b/>
+          <w:bCs/>
+          <w:i/>
+          <w:iCs/>
+          <w:color w:val="4F81BD" w:themeColor="accent1"/>
+          <w:sz w:val="26"/>
+          <w:szCs w:val="26"/>
+          <w:lang w:val="en-US"/>
+        </w:rPr>
+      </w:pPr>
+    </w:p>
+    <w:p>
+      <w:pPr>
+        <w:rPr>
+          <w:rFonts w:asciiTheme="majorHAnsi" w:eastAsiaTheme="majorEastAsia" w:hAnsiTheme="majorHAnsi" w:cstheme="majorBidi"/>
+          <w:b/>
+          <w:bCs/>
+          <w:i/>
+          <w:iCs/>
+          <w:color w:val="4F81BD" w:themeColor="accent1"/>
+          <w:sz w:val="26"/>
+          <w:szCs w:val="26"/>
+          <w:lang w:val="en-US"/>
+        </w:rPr>
+      </w:pPr>
+    </w:p>
+    <w:p>
+      <w:pPr>
+        <w:rPr>
+          <w:rFonts w:asciiTheme="majorHAnsi" w:eastAsiaTheme="majorEastAsia" w:hAnsiTheme="majorHAnsi" w:cstheme="majorBidi"/>
+          <w:b/>
+          <w:bCs/>
+          <w:i/>
+          <w:iCs/>
+          <w:color w:val="4F81BD" w:themeColor="accent1"/>
+          <w:sz w:val="26"/>
+          <w:szCs w:val="26"/>
+          <w:lang w:val="en-US"/>
+        </w:rPr>
+      </w:pPr>
+    </w:p>
+    <w:p>
+      <w:pPr>
+        <w:rPr>
+          <w:rFonts w:asciiTheme="majorHAnsi" w:eastAsiaTheme="majorEastAsia" w:hAnsiTheme="majorHAnsi" w:cstheme="majorBidi"/>
+          <w:b/>
+          <w:bCs/>
+          <w:i/>
+          <w:iCs/>
+          <w:color w:val="4F81BD" w:themeColor="accent1"/>
+          <w:sz w:val="26"/>
+          <w:szCs w:val="26"/>
+          <w:lang w:val="en-US"/>
+        </w:rPr>
+      </w:pPr>
+    </w:p>
+    <w:p>
+      <w:pPr>
+        <w:rPr>
+          <w:rFonts w:asciiTheme="majorHAnsi" w:eastAsiaTheme="majorEastAsia" w:hAnsiTheme="majorHAnsi" w:cstheme="majorBidi"/>
+          <w:b/>
+          <w:bCs/>
+          <w:i/>
+          <w:iCs/>
+          <w:color w:val="4F81BD" w:themeColor="accent1"/>
+          <w:sz w:val="26"/>
+          <w:szCs w:val="26"/>
+          <w:lang w:val="en-US"/>
+        </w:rPr>
+      </w:pPr>
+    </w:p>
+    <w:p>
+      <w:pPr>
+        <w:rPr>
+          <w:rFonts w:asciiTheme="majorHAnsi" w:eastAsiaTheme="majorEastAsia" w:hAnsiTheme="majorHAnsi" w:cstheme="majorBidi"/>
+          <w:b/>
+          <w:bCs/>
+          <w:i/>
+          <w:iCs/>
+          <w:color w:val="4F81BD" w:themeColor="accent1"/>
+          <w:sz w:val="26"/>
+          <w:szCs w:val="26"/>
+          <w:lang w:val="en-US"/>
+        </w:rPr>
+      </w:pPr>
+    </w:p>
+    <w:p>
+      <w:pPr>
+        <w:rPr>
+          <w:rFonts w:asciiTheme="majorHAnsi" w:eastAsiaTheme="majorEastAsia" w:hAnsiTheme="majorHAnsi" w:cstheme="majorBidi"/>
+          <w:b/>
+          <w:bCs/>
+          <w:i/>
+          <w:iCs/>
+          <w:color w:val="4F81BD" w:themeColor="accent1"/>
+          <w:sz w:val="26"/>
+          <w:szCs w:val="26"/>
+          <w:lang w:val="en-US"/>
+        </w:rPr>
+      </w:pPr>
+    </w:p>
+    <w:p>
+      <w:pPr>
+        <w:rPr>
+          <w:rFonts w:asciiTheme="majorHAnsi" w:eastAsiaTheme="majorEastAsia" w:hAnsiTheme="majorHAnsi" w:cstheme="majorBidi"/>
+          <w:b/>
+          <w:bCs/>
+          <w:i/>
+          <w:iCs/>
+          <w:color w:val="4F81BD" w:themeColor="accent1"/>
+          <w:sz w:val="26"/>
+          <w:szCs w:val="26"/>
+          <w:lang w:val="en-US"/>
+        </w:rPr>
+      </w:pPr>
+    </w:p>
+    <w:p>
+      <w:pPr>
+        <w:rPr>
+          <w:rFonts w:asciiTheme="majorHAnsi" w:eastAsiaTheme="majorEastAsia" w:hAnsiTheme="majorHAnsi" w:cstheme="majorBidi"/>
+          <w:b/>
+          <w:bCs/>
+          <w:i/>
+          <w:iCs/>
+          <w:color w:val="4F81BD" w:themeColor="accent1"/>
+          <w:sz w:val="26"/>
+          <w:szCs w:val="26"/>
+          <w:lang w:val="en-US"/>
+        </w:rPr>
+      </w:pPr>
+    </w:p>
+    <w:p>
+      <w:pPr>
+        <w:rPr>
+          <w:rFonts w:asciiTheme="majorHAnsi" w:eastAsiaTheme="majorEastAsia" w:hAnsiTheme="majorHAnsi" w:cstheme="majorBidi"/>
+          <w:b/>
+          <w:bCs/>
+          <w:i/>
+          <w:iCs/>
+          <w:color w:val="4F81BD" w:themeColor="accent1"/>
+          <w:sz w:val="26"/>
+          <w:szCs w:val="26"/>
+          <w:lang w:val="en-US"/>
+        </w:rPr>
+      </w:pPr>
+    </w:p>
+    <w:p>
+      <w:pPr>
+        <w:rPr>
+          <w:rFonts w:asciiTheme="majorHAnsi" w:eastAsiaTheme="majorEastAsia" w:hAnsiTheme="majorHAnsi" w:cstheme="majorBidi"/>
+          <w:b/>
+          <w:bCs/>
+          <w:i/>
+          <w:iCs/>
+          <w:color w:val="4F81BD" w:themeColor="accent1"/>
+          <w:sz w:val="26"/>
+          <w:szCs w:val="26"/>
+          <w:lang w:val="en-US"/>
+        </w:rPr>
+      </w:pPr>
+    </w:p>
+    <w:p>
+      <w:pPr>
+        <w:rPr>
+          <w:rFonts w:asciiTheme="majorHAnsi" w:eastAsiaTheme="majorEastAsia" w:hAnsiTheme="majorHAnsi" w:cstheme="majorBidi"/>
+          <w:b/>
+          <w:bCs/>
+          <w:i/>
+          <w:iCs/>
+          <w:color w:val="4F81BD" w:themeColor="accent1"/>
+          <w:sz w:val="26"/>
+          <w:szCs w:val="26"/>
+          <w:lang w:val="en-US"/>
+        </w:rPr>
+      </w:pPr>
+    </w:p>
+    <w:p>
+      <w:pPr>
+        <w:rPr>
+          <w:rFonts w:asciiTheme="majorHAnsi" w:eastAsiaTheme="majorEastAsia" w:hAnsiTheme="majorHAnsi" w:cstheme="majorBidi"/>
+          <w:b/>
+          <w:bCs/>
+          <w:i/>
+          <w:iCs/>
+          <w:color w:val="4F81BD" w:themeColor="accent1"/>
+          <w:sz w:val="26"/>
+          <w:szCs w:val="26"/>
+          <w:lang w:val="en-US"/>
+        </w:rPr>
+      </w:pPr>
+    </w:p>
+    <w:p>
+      <w:pPr>
+        <w:rPr>
+          <w:rFonts w:asciiTheme="majorHAnsi" w:eastAsiaTheme="majorEastAsia" w:hAnsiTheme="majorHAnsi" w:cstheme="majorBidi"/>
+          <w:b/>
+          <w:bCs/>
+          <w:i/>
+          <w:iCs/>
+          <w:color w:val="4F81BD" w:themeColor="accent1"/>
+          <w:sz w:val="26"/>
+          <w:szCs w:val="26"/>
+          <w:lang w:val="en-US"/>
+        </w:rPr>
+      </w:pPr>
+    </w:p>
+    <w:p>
+      <w:pPr>
+        <w:rPr>
+          <w:rFonts w:asciiTheme="majorHAnsi" w:eastAsiaTheme="majorEastAsia" w:hAnsiTheme="majorHAnsi" w:cstheme="majorBidi"/>
+          <w:b/>
+          <w:bCs/>
+          <w:i/>
+          <w:iCs/>
+          <w:color w:val="4F81BD" w:themeColor="accent1"/>
+          <w:sz w:val="26"/>
+          <w:szCs w:val="26"/>
+          <w:lang w:val="en-US"/>
+        </w:rPr>
+      </w:pPr>
+    </w:p>
+    <w:p>
+      <w:pPr>
+        <w:rPr>
+          <w:rFonts w:asciiTheme="majorHAnsi" w:eastAsiaTheme="majorEastAsia" w:hAnsiTheme="majorHAnsi" w:cstheme="majorBidi"/>
+          <w:b/>
+          <w:bCs/>
+          <w:i/>
+          <w:iCs/>
+          <w:color w:val="4F81BD" w:themeColor="accent1"/>
+          <w:sz w:val="26"/>
+          <w:szCs w:val="26"/>
+          <w:lang w:val="en-US"/>
+        </w:rPr>
+      </w:pPr>
+    </w:p>
+    <w:p>
+      <w:pPr>
+        <w:rPr>
+          <w:rFonts w:asciiTheme="majorHAnsi" w:eastAsiaTheme="majorEastAsia" w:hAnsiTheme="majorHAnsi" w:cstheme="majorBidi"/>
+          <w:b/>
+          <w:bCs/>
+          <w:i/>
+          <w:iCs/>
+          <w:color w:val="4F81BD" w:themeColor="accent1"/>
+          <w:sz w:val="26"/>
+          <w:szCs w:val="26"/>
+          <w:lang w:val="en-US"/>
+        </w:rPr>
+      </w:pPr>
+    </w:p>
+    <w:p>
+      <w:pPr>
+        <w:rPr>
+          <w:rFonts w:asciiTheme="majorHAnsi" w:eastAsiaTheme="majorEastAsia" w:hAnsiTheme="majorHAnsi" w:cstheme="majorBidi"/>
+          <w:b/>
+          <w:bCs/>
+          <w:i/>
+          <w:iCs/>
+          <w:color w:val="4F81BD" w:themeColor="accent1"/>
+          <w:sz w:val="26"/>
+          <w:szCs w:val="26"/>
+          <w:lang w:val="en-US"/>
+        </w:rPr>
+      </w:pPr>
+    </w:p>
+    <w:p>
+      <w:pPr>
+        <w:rPr>
+          <w:rFonts w:asciiTheme="majorHAnsi" w:eastAsiaTheme="majorEastAsia" w:hAnsiTheme="majorHAnsi" w:cstheme="majorBidi"/>
+          <w:b/>
+          <w:bCs/>
+          <w:i/>
+          <w:iCs/>
+          <w:color w:val="4F81BD" w:themeColor="accent1"/>
+          <w:sz w:val="26"/>
+          <w:szCs w:val="26"/>
+          <w:lang w:val="en-US"/>
+        </w:rPr>
+      </w:pPr>
+    </w:p>
+    <w:p>
+      <w:pPr>
+        <w:rPr>
+          <w:rFonts w:asciiTheme="majorHAnsi" w:eastAsiaTheme="majorEastAsia" w:hAnsiTheme="majorHAnsi" w:cstheme="majorBidi"/>
+          <w:b/>
+          <w:bCs/>
+          <w:i/>
+          <w:iCs/>
+          <w:color w:val="4F81BD" w:themeColor="accent1"/>
+          <w:sz w:val="26"/>
+          <w:szCs w:val="26"/>
+          <w:lang w:val="en-US"/>
+        </w:rPr>
+      </w:pPr>
+    </w:p>
+    <w:p>
+      <w:pPr>
+        <w:rPr>
+          <w:rFonts w:asciiTheme="majorHAnsi" w:eastAsiaTheme="majorEastAsia" w:hAnsiTheme="majorHAnsi" w:cstheme="majorBidi"/>
+          <w:b/>
+          <w:bCs/>
+          <w:i/>
+          <w:iCs/>
+          <w:color w:val="4F81BD" w:themeColor="accent1"/>
+          <w:sz w:val="26"/>
+          <w:szCs w:val="26"/>
+          <w:lang w:val="en-US"/>
+        </w:rPr>
+      </w:pPr>
+    </w:p>
+    <w:p>
+      <w:pPr>
+        <w:rPr>
+          <w:rFonts w:asciiTheme="majorHAnsi" w:eastAsiaTheme="majorEastAsia" w:hAnsiTheme="majorHAnsi" w:cstheme="majorBidi"/>
+          <w:b/>
+          <w:bCs/>
+          <w:i/>
+          <w:iCs/>
+          <w:color w:val="4F81BD" w:themeColor="accent1"/>
+          <w:sz w:val="26"/>
+          <w:szCs w:val="26"/>
+          <w:lang w:val="en-US"/>
+        </w:rPr>
+      </w:pPr>
+    </w:p>
+    <w:p>
+      <w:pPr>
+        <w:rPr>
+          <w:rFonts w:asciiTheme="minorHAnsi" w:eastAsiaTheme="majorEastAsia" w:hAnsiTheme="minorHAnsi" w:cstheme="minorHAnsi"/>
+          <w:lang w:val="en-US"/>
+        </w:rPr>
+      </w:pPr>
+      <w:r>
+        <w:rPr>
+          <w:rFonts w:asciiTheme="majorHAnsi" w:eastAsiaTheme="majorEastAsia" w:hAnsiTheme="majorHAnsi" w:cstheme="majorBidi"/>
+          <w:b/>
+          <w:bCs/>
+          <w:i/>
+          <w:iCs/>
+          <w:color w:val="4F81BD" w:themeColor="accent1"/>
+          <w:sz w:val="26"/>
+          <w:szCs w:val="26"/>
+          <w:lang w:val="en-US"/>
+        </w:rPr>
+        <w:t xml:space="preserve">                                                                                                                                                              </w:t>
+      </w:r>
+      <w:r>
+        <w:rPr>
+          <w:rFonts w:asciiTheme="minorHAnsi" w:eastAsiaTheme="majorEastAsia" w:hAnsiTheme="minorHAnsi" w:cstheme="minorHAnsi"/>
+          <w:lang w:val="en-US"/>
+        </w:rPr>
+        <w:t>10</w:t>
+      </w:r>
+    </w:p>
+    <w:p>
+      <w:pPr>
+        <w:rPr>
+          <w:rFonts w:asciiTheme="majorHAnsi" w:eastAsiaTheme="majorEastAsia" w:hAnsiTheme="majorHAnsi" w:cstheme="majorBidi"/>
+          <w:b/>
+          <w:bCs/>
+          <w:i/>
+          <w:iCs/>
+          <w:color w:val="4F81BD" w:themeColor="accent1"/>
+          <w:sz w:val="26"/>
+          <w:szCs w:val="26"/>
+          <w:lang w:val="en-US"/>
+        </w:rPr>
+      </w:pPr>
+      <w:r>
+        <w:rPr>
+          <w:rFonts w:asciiTheme="majorHAnsi" w:eastAsiaTheme="majorEastAsia" w:hAnsiTheme="majorHAnsi" w:cstheme="majorBidi"/>
+          <w:b/>
+          <w:bCs/>
+          <w:i/>
+          <w:iCs/>
+          <w:color w:val="4F81BD" w:themeColor="accent1"/>
+          <w:sz w:val="26"/>
+          <w:szCs w:val="26"/>
+          <w:lang w:val="en-US"/>
+        </w:rPr>
+        <w:lastRenderedPageBreak/>
+        <w:t>References</w:t>
+      </w:r>
+    </w:p>
+    <w:p>
+      <w:pPr>
+        <w:rPr>
+          <w:rFonts w:asciiTheme="majorHAnsi" w:eastAsiaTheme="majorEastAsia" w:hAnsiTheme="majorHAnsi" w:cstheme="majorBidi"/>
+          <w:b/>
+          <w:bCs/>
+          <w:i/>
+          <w:iCs/>
+          <w:color w:val="4F81BD" w:themeColor="accent1"/>
+          <w:sz w:val="26"/>
+          <w:szCs w:val="26"/>
+          <w:lang w:val="en-US"/>
+        </w:rPr>
+      </w:pPr>
+    </w:p>
+    <w:p>
+      <w:pPr>
+        <w:rPr>
+          <w:rFonts w:asciiTheme="majorHAnsi" w:eastAsiaTheme="majorEastAsia" w:hAnsiTheme="majorHAnsi" w:cstheme="majorBidi"/>
+          <w:b/>
+          <w:bCs/>
+          <w:i/>
+          <w:iCs/>
+          <w:color w:val="4F81BD" w:themeColor="accent1"/>
+          <w:sz w:val="26"/>
+          <w:szCs w:val="26"/>
+          <w:lang w:val="en-US"/>
+        </w:rPr>
+      </w:pPr>
+    </w:p>
+    <w:p>
+      <w:pPr>
+        <w:rPr>
+          <w:rFonts w:asciiTheme="majorHAnsi" w:eastAsiaTheme="majorEastAsia" w:hAnsiTheme="majorHAnsi" w:cstheme="majorBidi"/>
+          <w:b/>
+          <w:bCs/>
+          <w:i/>
+          <w:iCs/>
+          <w:color w:val="4F81BD" w:themeColor="accent1"/>
+          <w:sz w:val="26"/>
+          <w:szCs w:val="26"/>
+          <w:lang w:val="en-US"/>
+        </w:rPr>
+      </w:pPr>
+    </w:p>
+    <w:p>
+      <w:pPr>
+        <w:rPr>
+          <w:rFonts w:asciiTheme="majorHAnsi" w:eastAsiaTheme="majorEastAsia" w:hAnsiTheme="majorHAnsi" w:cstheme="majorBidi"/>
+          <w:b/>
+          <w:bCs/>
+          <w:i/>
+          <w:iCs/>
+          <w:color w:val="4F81BD" w:themeColor="accent1"/>
+          <w:sz w:val="26"/>
+          <w:szCs w:val="26"/>
+          <w:lang w:val="en-US"/>
+        </w:rPr>
+      </w:pPr>
+      <w:r>
+        <w:rPr>
+          <w:rFonts w:asciiTheme="minorHAnsi" w:eastAsiaTheme="majorEastAsia" w:hAnsiTheme="minorHAnsi" w:cstheme="minorHAnsi"/>
+          <w:lang w:val="en-US"/>
+        </w:rPr>
+        <w:t>DATA.GOV</w:t>
+      </w:r>
+    </w:p>
+    <w:p>
+      <w:pPr>
+        <w:rPr>
+          <w:rFonts w:asciiTheme="minorHAnsi" w:hAnsiTheme="minorHAnsi" w:cstheme="minorHAnsi"/>
+        </w:rPr>
+      </w:pPr>
+      <w:hyperlink r:id="rId20" w:history="1">
+        <w:r>
+          <w:rPr>
+            <w:rStyle w:val="Hyperlink"/>
+            <w:rFonts w:asciiTheme="minorHAnsi" w:hAnsiTheme="minorHAnsi" w:cstheme="minorHAnsi"/>
+          </w:rPr>
+          <w:t>https://catalog.data.gov/dataset/u-s-chronic-disease-indicators</w:t>
+        </w:r>
+      </w:hyperlink>
+    </w:p>
+    <w:p>
+      <w:pPr>
+        <w:rPr>
+          <w:rFonts w:asciiTheme="minorHAnsi" w:hAnsiTheme="minorHAnsi" w:cstheme="minorHAnsi"/>
+        </w:rPr>
+      </w:pPr>
+      <w:r>
+        <w:rPr>
+          <w:rFonts w:asciiTheme="minorHAnsi" w:hAnsiTheme="minorHAnsi" w:cstheme="minorHAnsi"/>
+        </w:rPr>
+        <w:t>(Accessed 19 October 2026)</w:t>
+      </w:r>
+    </w:p>
+    <w:p>
+      <w:pPr>
+        <w:rPr>
+          <w:rFonts w:asciiTheme="minorHAnsi" w:hAnsiTheme="minorHAnsi" w:cstheme="minorHAnsi"/>
+        </w:rPr>
+      </w:pPr>
+    </w:p>
+    <w:p>
+      <w:pPr>
+        <w:rPr>
+          <w:rFonts w:asciiTheme="minorHAnsi" w:hAnsiTheme="minorHAnsi" w:cstheme="minorHAnsi"/>
+          <w:lang w:val="en-GB"/>
+        </w:rPr>
+      </w:pPr>
+      <w:r>
+        <w:rPr>
+          <w:rFonts w:asciiTheme="minorHAnsi" w:hAnsiTheme="minorHAnsi" w:cstheme="minorHAnsi"/>
+          <w:lang w:val="en-GB"/>
+        </w:rPr>
+        <w:t>Chronic Disease Indicators (CDI)</w:t>
+      </w:r>
+    </w:p>
+    <w:p>
+      <w:hyperlink r:id="rId21" w:tgtFrame="_blank" w:history="1">
+        <w:r>
+          <w:rPr>
+            <w:rStyle w:val="Hyperlink"/>
+            <w:rFonts w:asciiTheme="minorHAnsi" w:hAnsiTheme="minorHAnsi" w:cstheme="minorHAnsi"/>
+          </w:rPr>
+          <w:t>www.cdc.gov/cdi</w:t>
+        </w:r>
+      </w:hyperlink>
+    </w:p>
+    <w:p>
+      <w:pPr>
+        <w:rPr>
+          <w:rFonts w:asciiTheme="minorHAnsi" w:hAnsiTheme="minorHAnsi" w:cstheme="minorHAnsi"/>
+        </w:rPr>
+      </w:pPr>
+      <w:r>
+        <w:rPr>
+          <w:rFonts w:asciiTheme="minorHAnsi" w:hAnsiTheme="minorHAnsi" w:cstheme="minorHAnsi"/>
+        </w:rPr>
+        <w:t>(Accessed 19 October 2026)</w:t>
+      </w:r>
+    </w:p>
+    <w:p>
+      <w:pPr>
+        <w:rPr>
+          <w:rFonts w:asciiTheme="minorHAnsi" w:hAnsiTheme="minorHAnsi" w:cstheme="minorHAnsi"/>
+        </w:rPr>
+      </w:pPr>
+    </w:p>
+    <w:p>
+      <w:pPr>
+        <w:rPr>
+          <w:rFonts w:asciiTheme="minorHAnsi" w:hAnsiTheme="minorHAnsi" w:cstheme="minorHAnsi"/>
+        </w:rPr>
+      </w:pPr>
+      <w:r>
+        <w:rPr>
+          <w:rFonts w:asciiTheme="minorHAnsi" w:hAnsiTheme="minorHAnsi" w:cstheme="minorHAnsi"/>
+        </w:rPr>
+        <w:t>CCT College Dublin</w:t>
+      </w:r>
+      <w:r>
+        <w:rPr>
+          <w:rFonts w:asciiTheme="minorHAnsi" w:hAnsiTheme="minorHAnsi" w:cstheme="minorHAnsi"/>
+        </w:rPr>
+        <w:t xml:space="preserve"> - By Moodle</w:t>
+      </w:r>
+    </w:p>
+    <w:p>
+      <w:pPr>
+        <w:rPr>
+          <w:rFonts w:asciiTheme="minorHAnsi" w:hAnsiTheme="minorHAnsi" w:cstheme="minorHAnsi"/>
+        </w:rPr>
+      </w:pPr>
+      <w:r>
+        <w:rPr>
+          <w:rFonts w:asciiTheme="minorHAnsi" w:hAnsiTheme="minorHAnsi" w:cstheme="minorHAnsi"/>
+        </w:rPr>
+        <w:t xml:space="preserve">Machine Learning </w:t>
+      </w:r>
+      <w:r>
+        <w:rPr>
+          <w:rFonts w:asciiTheme="minorHAnsi" w:hAnsiTheme="minorHAnsi" w:cstheme="minorHAnsi"/>
+        </w:rPr>
+        <w:t xml:space="preserve">(Accessed </w:t>
+      </w:r>
+      <w:r>
+        <w:rPr>
+          <w:rFonts w:asciiTheme="minorHAnsi" w:hAnsiTheme="minorHAnsi" w:cstheme="minorHAnsi"/>
+        </w:rPr>
+        <w:t>10,15 and 1</w:t>
+      </w:r>
+      <w:r>
+        <w:rPr>
+          <w:rFonts w:asciiTheme="minorHAnsi" w:hAnsiTheme="minorHAnsi" w:cstheme="minorHAnsi"/>
+        </w:rPr>
+        <w:t>9</w:t>
+      </w:r>
+      <w:r>
+        <w:rPr>
+          <w:rFonts w:asciiTheme="minorHAnsi" w:hAnsiTheme="minorHAnsi" w:cstheme="minorHAnsi"/>
+        </w:rPr>
+        <w:t xml:space="preserve"> October 2026)</w:t>
+      </w:r>
+    </w:p>
+    <w:p>
+      <w:pPr>
+        <w:rPr>
+          <w:rFonts w:asciiTheme="minorHAnsi" w:hAnsiTheme="minorHAnsi" w:cstheme="minorHAnsi"/>
+        </w:rPr>
+      </w:pPr>
+    </w:p>
+    <w:p>
+      <w:pPr>
+        <w:rPr>
+          <w:rFonts w:asciiTheme="minorHAnsi" w:hAnsiTheme="minorHAnsi" w:cstheme="minorHAnsi"/>
+        </w:rPr>
+      </w:pPr>
+      <w:r>
+        <w:rPr>
+          <w:rFonts w:asciiTheme="minorHAnsi" w:hAnsiTheme="minorHAnsi" w:cstheme="minorHAnsi"/>
+        </w:rPr>
+        <w:t>CCT College Dublin</w:t>
+      </w:r>
+      <w:r>
+        <w:rPr>
+          <w:rFonts w:asciiTheme="minorHAnsi" w:hAnsiTheme="minorHAnsi" w:cstheme="minorHAnsi"/>
+        </w:rPr>
+        <w:t xml:space="preserve"> - By Moodle</w:t>
+      </w:r>
+    </w:p>
+    <w:p>
+      <w:pPr>
+        <w:rPr>
+          <w:rFonts w:asciiTheme="minorHAnsi" w:hAnsiTheme="minorHAnsi" w:cstheme="minorHAnsi"/>
+        </w:rPr>
+      </w:pPr>
+      <w:r>
+        <w:rPr>
+          <w:rFonts w:asciiTheme="minorHAnsi" w:hAnsiTheme="minorHAnsi" w:cstheme="minorHAnsi"/>
+        </w:rPr>
+        <w:t>S</w:t>
+      </w:r>
+      <w:r>
+        <w:rPr>
+          <w:rFonts w:asciiTheme="minorHAnsi" w:hAnsiTheme="minorHAnsi" w:cstheme="minorHAnsi"/>
+        </w:rPr>
+        <w:t>trategic Thinking</w:t>
+      </w:r>
+      <w:r>
+        <w:rPr>
+          <w:rFonts w:asciiTheme="minorHAnsi" w:hAnsiTheme="minorHAnsi" w:cstheme="minorHAnsi"/>
+        </w:rPr>
+        <w:t xml:space="preserve"> </w:t>
+      </w:r>
+      <w:r>
+        <w:rPr>
+          <w:rFonts w:asciiTheme="minorHAnsi" w:hAnsiTheme="minorHAnsi" w:cstheme="minorHAnsi"/>
+        </w:rPr>
+        <w:t xml:space="preserve">(Accessed </w:t>
+      </w:r>
+      <w:r>
+        <w:rPr>
+          <w:rFonts w:asciiTheme="minorHAnsi" w:hAnsiTheme="minorHAnsi" w:cstheme="minorHAnsi"/>
+        </w:rPr>
+        <w:t xml:space="preserve">7 - 12 </w:t>
+      </w:r>
+      <w:r>
+        <w:rPr>
+          <w:rFonts w:asciiTheme="minorHAnsi" w:hAnsiTheme="minorHAnsi" w:cstheme="minorHAnsi"/>
+        </w:rPr>
+        <w:t>October 2026)</w:t>
+      </w:r>
+    </w:p>
+    <w:p>
+      <w:pPr>
+        <w:rPr>
+          <w:rFonts w:asciiTheme="minorHAnsi" w:hAnsiTheme="minorHAnsi" w:cstheme="minorHAnsi"/>
+        </w:rPr>
+      </w:pPr>
+    </w:p>
+    <w:p>
+      <w:pPr>
+        <w:rPr>
+          <w:rFonts w:asciiTheme="minorHAnsi" w:hAnsiTheme="minorHAnsi" w:cstheme="minorHAnsi"/>
+        </w:rPr>
+      </w:pPr>
+      <w:r>
+        <w:rPr>
+          <w:rFonts w:asciiTheme="minorHAnsi" w:hAnsiTheme="minorHAnsi" w:cstheme="minorHAnsi"/>
+        </w:rPr>
+        <w:t>CCT College Dublin</w:t>
+      </w:r>
+      <w:r>
+        <w:rPr>
+          <w:rFonts w:asciiTheme="minorHAnsi" w:hAnsiTheme="minorHAnsi" w:cstheme="minorHAnsi"/>
+        </w:rPr>
+        <w:t xml:space="preserve"> - By Moodle</w:t>
+      </w:r>
+    </w:p>
+    <w:p>
+      <w:pPr>
+        <w:rPr>
+          <w:rFonts w:asciiTheme="minorHAnsi" w:hAnsiTheme="minorHAnsi" w:cstheme="minorHAnsi"/>
+        </w:rPr>
+      </w:pPr>
+      <w:r>
+        <w:rPr>
+          <w:rFonts w:asciiTheme="minorHAnsi" w:hAnsiTheme="minorHAnsi" w:cstheme="minorHAnsi"/>
+        </w:rPr>
+        <w:t>Data preparation</w:t>
+      </w:r>
+      <w:r>
+        <w:rPr>
+          <w:rFonts w:asciiTheme="minorHAnsi" w:hAnsiTheme="minorHAnsi" w:cstheme="minorHAnsi"/>
+        </w:rPr>
+        <w:t xml:space="preserve"> </w:t>
+      </w:r>
+      <w:r>
+        <w:rPr>
+          <w:rFonts w:asciiTheme="minorHAnsi" w:hAnsiTheme="minorHAnsi" w:cstheme="minorHAnsi"/>
+        </w:rPr>
+        <w:t xml:space="preserve">(Accessed </w:t>
+      </w:r>
+      <w:r>
+        <w:rPr>
+          <w:rFonts w:asciiTheme="minorHAnsi" w:hAnsiTheme="minorHAnsi" w:cstheme="minorHAnsi"/>
+        </w:rPr>
+        <w:t xml:space="preserve">19 - 20 </w:t>
+      </w:r>
+      <w:r>
+        <w:rPr>
+          <w:rFonts w:asciiTheme="minorHAnsi" w:hAnsiTheme="minorHAnsi" w:cstheme="minorHAnsi"/>
+        </w:rPr>
+        <w:t>October 2026)</w:t>
+      </w:r>
+    </w:p>
+    <w:p>
+      <w:pPr>
+        <w:rPr>
+          <w:rFonts w:asciiTheme="minorHAnsi" w:hAnsiTheme="minorHAnsi" w:cstheme="minorHAnsi"/>
+        </w:rPr>
+      </w:pPr>
+    </w:p>
+    <w:p>
+      <w:pPr>
+        <w:rPr>
+          <w:rFonts w:asciiTheme="minorHAnsi" w:hAnsiTheme="minorHAnsi" w:cstheme="minorHAnsi"/>
+        </w:rPr>
+      </w:pPr>
+      <w:r>
+        <w:rPr>
+          <w:rFonts w:asciiTheme="minorHAnsi" w:hAnsiTheme="minorHAnsi" w:cstheme="minorHAnsi"/>
+        </w:rPr>
+        <w:t>CCT College Dublin</w:t>
+      </w:r>
+      <w:r>
+        <w:rPr>
+          <w:rFonts w:asciiTheme="minorHAnsi" w:hAnsiTheme="minorHAnsi" w:cstheme="minorHAnsi"/>
+        </w:rPr>
+        <w:t xml:space="preserve"> - By Moodle</w:t>
+      </w:r>
+    </w:p>
+    <w:p>
+      <w:pPr>
+        <w:rPr>
+          <w:rFonts w:asciiTheme="minorHAnsi" w:hAnsiTheme="minorHAnsi" w:cstheme="minorHAnsi"/>
+        </w:rPr>
+      </w:pPr>
+      <w:r>
+        <w:rPr>
+          <w:rFonts w:asciiTheme="minorHAnsi" w:hAnsiTheme="minorHAnsi" w:cstheme="minorHAnsi"/>
+        </w:rPr>
+        <w:t>Statistical Techniques</w:t>
+      </w:r>
+      <w:r>
+        <w:rPr>
+          <w:rFonts w:asciiTheme="minorHAnsi" w:hAnsiTheme="minorHAnsi" w:cstheme="minorHAnsi"/>
+        </w:rPr>
+        <w:t xml:space="preserve"> </w:t>
+      </w:r>
+      <w:r>
+        <w:rPr>
+          <w:rFonts w:asciiTheme="minorHAnsi" w:hAnsiTheme="minorHAnsi" w:cstheme="minorHAnsi"/>
+        </w:rPr>
+        <w:t xml:space="preserve">(Accessed </w:t>
+      </w:r>
+      <w:r>
+        <w:rPr>
+          <w:rFonts w:asciiTheme="minorHAnsi" w:hAnsiTheme="minorHAnsi" w:cstheme="minorHAnsi"/>
+        </w:rPr>
+        <w:t>19</w:t>
+      </w:r>
+      <w:r>
+        <w:rPr>
+          <w:rFonts w:asciiTheme="minorHAnsi" w:hAnsiTheme="minorHAnsi" w:cstheme="minorHAnsi"/>
+        </w:rPr>
+        <w:t xml:space="preserve"> October 2026)</w:t>
+      </w:r>
+    </w:p>
+    <w:p>
+      <w:pPr>
+        <w:pStyle w:val="ListParagraph"/>
+        <w:rPr>
+          <w:rFonts w:asciiTheme="minorHAnsi" w:hAnsiTheme="minorHAnsi" w:cstheme="minorHAnsi"/>
+        </w:rPr>
+      </w:pPr>
+    </w:p>
+    <w:p>
+      <w:pPr>
+        <w:pStyle w:val="ListParagraph"/>
+        <w:rPr>
+          <w:rFonts w:asciiTheme="minorHAnsi" w:hAnsiTheme="minorHAnsi" w:cstheme="minorHAnsi"/>
+        </w:rPr>
+      </w:pPr>
+    </w:p>
+    <w:p>
+      <w:pPr>
+        <w:pStyle w:val="ListParagraph"/>
+        <w:rPr>
+          <w:rFonts w:asciiTheme="minorHAnsi" w:hAnsiTheme="minorHAnsi" w:cstheme="minorHAnsi"/>
+        </w:rPr>
+      </w:pPr>
+    </w:p>
+    <w:p>
+      <w:pPr>
+        <w:pStyle w:val="ListParagraph"/>
+        <w:rPr>
+          <w:rFonts w:asciiTheme="minorHAnsi" w:hAnsiTheme="minorHAnsi" w:cstheme="minorHAnsi"/>
+        </w:rPr>
+      </w:pPr>
+    </w:p>
+    <w:p>
+      <w:pPr>
+        <w:pStyle w:val="ListParagraph"/>
+        <w:rPr>
+          <w:rFonts w:asciiTheme="minorHAnsi" w:hAnsiTheme="minorHAnsi" w:cstheme="minorHAnsi"/>
+        </w:rPr>
+      </w:pPr>
+    </w:p>
+    <w:p>
+      <w:pPr>
+        <w:pStyle w:val="ListParagraph"/>
+        <w:rPr>
+          <w:rFonts w:asciiTheme="minorHAnsi" w:hAnsiTheme="minorHAnsi" w:cstheme="minorHAnsi"/>
+        </w:rPr>
+      </w:pPr>
+    </w:p>
+    <w:p>
+      <w:pPr>
+        <w:pStyle w:val="ListParagraph"/>
+        <w:rPr>
+          <w:rFonts w:asciiTheme="minorHAnsi" w:hAnsiTheme="minorHAnsi" w:cstheme="minorHAnsi"/>
+        </w:rPr>
+      </w:pPr>
+    </w:p>
+    <w:p>
+      <w:pPr>
+        <w:pStyle w:val="ListParagraph"/>
+        <w:rPr>
+          <w:rFonts w:asciiTheme="minorHAnsi" w:hAnsiTheme="minorHAnsi" w:cstheme="minorHAnsi"/>
+        </w:rPr>
+      </w:pPr>
+    </w:p>
+    <w:p>
+      <w:pPr>
+        <w:pStyle w:val="ListParagraph"/>
+        <w:rPr>
+          <w:rFonts w:asciiTheme="minorHAnsi" w:hAnsiTheme="minorHAnsi" w:cstheme="minorHAnsi"/>
+        </w:rPr>
+      </w:pPr>
+    </w:p>
+    <w:p>
+      <w:pPr>
+        <w:pStyle w:val="ListParagraph"/>
+        <w:rPr>
+          <w:rFonts w:asciiTheme="minorHAnsi" w:hAnsiTheme="minorHAnsi" w:cstheme="minorHAnsi"/>
+        </w:rPr>
+      </w:pPr>
+    </w:p>
+    <w:p>
+      <w:pPr>
+        <w:pStyle w:val="ListParagraph"/>
+        <w:rPr>
+          <w:rFonts w:asciiTheme="minorHAnsi" w:hAnsiTheme="minorHAnsi" w:cstheme="minorHAnsi"/>
+        </w:rPr>
+      </w:pPr>
+    </w:p>
+    <w:p>
+      <w:pPr>
+        <w:pStyle w:val="ListParagraph"/>
+        <w:rPr>
+          <w:rFonts w:asciiTheme="minorHAnsi" w:hAnsiTheme="minorHAnsi" w:cstheme="minorHAnsi"/>
+        </w:rPr>
+      </w:pPr>
+    </w:p>
+    <w:p>
+      <w:pPr>
+        <w:pStyle w:val="ListParagraph"/>
+        <w:rPr>
+          <w:rFonts w:asciiTheme="minorHAnsi" w:hAnsiTheme="minorHAnsi" w:cstheme="minorHAnsi"/>
+        </w:rPr>
+      </w:pPr>
+    </w:p>
+    <w:p>
+      <w:pPr>
+        <w:pStyle w:val="ListParagraph"/>
+        <w:rPr>
+          <w:rFonts w:asciiTheme="minorHAnsi" w:hAnsiTheme="minorHAnsi" w:cstheme="minorHAnsi"/>
+        </w:rPr>
+      </w:pPr>
+    </w:p>
+    <w:p>
+      <w:pPr>
+        <w:pStyle w:val="ListParagraph"/>
+        <w:rPr>
+          <w:rFonts w:asciiTheme="minorHAnsi" w:hAnsiTheme="minorHAnsi" w:cstheme="minorHAnsi"/>
+        </w:rPr>
+      </w:pPr>
+    </w:p>
+    <w:p>
+      <w:pPr>
+        <w:pStyle w:val="ListParagraph"/>
+        <w:rPr>
+          <w:rFonts w:asciiTheme="minorHAnsi" w:hAnsiTheme="minorHAnsi" w:cstheme="minorHAnsi"/>
+        </w:rPr>
+      </w:pPr>
+    </w:p>
+    <w:p>
+      <w:pPr>
+        <w:pStyle w:val="ListParagraph"/>
+        <w:rPr>
+          <w:rFonts w:asciiTheme="minorHAnsi" w:hAnsiTheme="minorHAnsi" w:cstheme="minorHAnsi"/>
+        </w:rPr>
+      </w:pPr>
+    </w:p>
+    <w:p>
+      <w:pPr>
+        <w:pStyle w:val="ListParagraph"/>
+        <w:rPr>
+          <w:rFonts w:asciiTheme="minorHAnsi" w:hAnsiTheme="minorHAnsi" w:cstheme="minorHAnsi"/>
+        </w:rPr>
+      </w:pPr>
+    </w:p>
+    <w:p>
+      <w:pPr>
+        <w:pStyle w:val="ListParagraph"/>
+        <w:rPr>
+          <w:rFonts w:asciiTheme="minorHAnsi" w:hAnsiTheme="minorHAnsi" w:cstheme="minorHAnsi"/>
+        </w:rPr>
+      </w:pPr>
+    </w:p>
+    <w:p>
+      <w:pPr>
+        <w:pStyle w:val="ListParagraph"/>
+        <w:rPr>
+          <w:rFonts w:asciiTheme="minorHAnsi" w:hAnsiTheme="minorHAnsi" w:cstheme="minorHAnsi"/>
+        </w:rPr>
+      </w:pPr>
+    </w:p>
+    <w:p>
+      <w:pPr>
+        <w:pStyle w:val="ListParagraph"/>
+        <w:rPr>
+          <w:rFonts w:asciiTheme="minorHAnsi" w:hAnsiTheme="minorHAnsi" w:cstheme="minorHAnsi"/>
+        </w:rPr>
+      </w:pPr>
+    </w:p>
+    <w:p>
+      <w:pPr>
+        <w:pStyle w:val="ListParagraph"/>
+        <w:rPr>
+          <w:rFonts w:asciiTheme="minorHAnsi" w:hAnsiTheme="minorHAnsi" w:cstheme="minorHAnsi"/>
+        </w:rPr>
+      </w:pPr>
+    </w:p>
+    <w:p>
+      <w:pPr>
+        <w:pStyle w:val="ListParagraph"/>
+        <w:rPr>
+          <w:rFonts w:asciiTheme="minorHAnsi" w:hAnsiTheme="minorHAnsi" w:cstheme="minorHAnsi"/>
+        </w:rPr>
+      </w:pPr>
+    </w:p>
+    <w:p>
+      <w:pPr>
+        <w:pStyle w:val="ListParagraph"/>
+        <w:rPr>
+          <w:rFonts w:asciiTheme="minorHAnsi" w:hAnsiTheme="minorHAnsi" w:cstheme="minorHAnsi"/>
+        </w:rPr>
+      </w:pPr>
+      <w:r>
+        <w:rPr>
+          <w:rFonts w:asciiTheme="minorHAnsi" w:hAnsiTheme="minorHAnsi" w:cstheme="minorHAnsi"/>
+        </w:rPr>
+        <w:t xml:space="preserve">                                                                                                                                                                         11</w:t>
+      </w:r>
+    </w:p>
+    <w:p>
+      <w:pPr>
+        <w:rPr>
+          <w:rFonts w:asciiTheme="majorHAnsi" w:eastAsiaTheme="majorEastAsia" w:hAnsiTheme="majorHAnsi" w:cstheme="majorBidi"/>
+          <w:b/>
+          <w:bCs/>
+          <w:i/>
+          <w:iCs/>
+          <w:color w:val="4F81BD" w:themeColor="accent1"/>
+          <w:sz w:val="26"/>
+          <w:szCs w:val="26"/>
+          <w:lang w:val="en-US"/>
+        </w:rPr>
+      </w:pPr>
+      <w:r>
+        <w:rPr>
+          <w:rFonts w:asciiTheme="majorHAnsi" w:eastAsiaTheme="majorEastAsia" w:hAnsiTheme="majorHAnsi" w:cstheme="majorBidi"/>
+          <w:b/>
+          <w:bCs/>
+          <w:i/>
+          <w:iCs/>
+          <w:color w:val="4F81BD" w:themeColor="accent1"/>
+          <w:sz w:val="26"/>
+          <w:szCs w:val="26"/>
+          <w:lang w:val="en-US"/>
+        </w:rPr>
+        <w:lastRenderedPageBreak/>
+        <w:t>Appendix: AI Declaration using the AI Fluency Framework</w:t>
+      </w:r>
+    </w:p>
+    <w:p>
+      <w:pPr>
+        <w:rPr>
+          <w:rFonts w:asciiTheme="majorHAnsi" w:eastAsiaTheme="majorEastAsia" w:hAnsiTheme="majorHAnsi" w:cstheme="majorBidi"/>
+          <w:b/>
+          <w:bCs/>
+          <w:i/>
+          <w:iCs/>
+          <w:color w:val="4F81BD" w:themeColor="accent1"/>
+          <w:sz w:val="26"/>
+          <w:szCs w:val="26"/>
+          <w:lang w:val="en-US"/>
+        </w:rPr>
+      </w:pPr>
+    </w:p>
+    <w:p>
+      <w:pPr>
+        <w:rPr>
+          <w:rFonts w:asciiTheme="majorHAnsi" w:eastAsiaTheme="majorEastAsia" w:hAnsiTheme="majorHAnsi" w:cstheme="majorBidi"/>
+          <w:b/>
+          <w:bCs/>
+          <w:i/>
+          <w:iCs/>
+          <w:color w:val="4F81BD" w:themeColor="accent1"/>
+          <w:sz w:val="26"/>
+          <w:szCs w:val="26"/>
+          <w:lang w:val="en-US"/>
+        </w:rPr>
+      </w:pPr>
+    </w:p>
+    <w:p>
+      <w:pPr>
+        <w:rPr>
+          <w:rFonts w:asciiTheme="minorHAnsi" w:eastAsiaTheme="majorEastAsia" w:hAnsiTheme="minorHAnsi" w:cstheme="minorHAnsi"/>
+          <w:lang w:val="en-US"/>
+        </w:rPr>
+      </w:pPr>
+      <w:r>
+        <w:rPr>
+          <w:rFonts w:asciiTheme="minorHAnsi" w:eastAsiaTheme="majorEastAsia" w:hAnsiTheme="minorHAnsi" w:cstheme="minorHAnsi"/>
+          <w:lang w:val="en-US"/>
+        </w:rPr>
+        <w:t xml:space="preserve">For this content was not necessarily AI </w:t>
+      </w:r>
+      <w:r>
+        <w:rPr>
+          <w:rFonts w:asciiTheme="minorHAnsi" w:eastAsiaTheme="majorEastAsia" w:hAnsiTheme="minorHAnsi" w:cstheme="minorHAnsi"/>
+          <w:lang w:val="en-US"/>
+        </w:rPr>
+        <w:t>tools used to</w:t>
+      </w:r>
+      <w:r>
+        <w:rPr>
+          <w:rFonts w:asciiTheme="minorHAnsi" w:eastAsiaTheme="majorEastAsia" w:hAnsiTheme="minorHAnsi" w:cstheme="minorHAnsi"/>
+          <w:lang w:val="en-US"/>
+        </w:rPr>
+        <w:t xml:space="preserve">, once the sources that I explored was found into CCT College student page through Moodle </w:t>
+      </w:r>
+      <w:r>
+        <w:rPr>
+          <w:rFonts w:asciiTheme="minorHAnsi" w:eastAsiaTheme="majorEastAsia" w:hAnsiTheme="minorHAnsi" w:cstheme="minorHAnsi"/>
+          <w:lang w:val="en-US"/>
+        </w:rPr>
+        <w:t>and the materials available by Professors and recording classes, as external sources I used the</w:t>
+      </w:r>
+      <w:r>
+        <w:rPr>
+          <w:rFonts w:asciiTheme="minorHAnsi" w:eastAsiaTheme="majorEastAsia" w:hAnsiTheme="minorHAnsi" w:cstheme="minorHAnsi"/>
+          <w:lang w:val="en-US"/>
+        </w:rPr>
+        <w:t xml:space="preserve"> DATA.GOV website.</w:t>
+      </w:r>
+    </w:p>
+    <w:p>
+      <w:pPr>
+        <w:rPr>
+          <w:rFonts w:asciiTheme="minorHAnsi" w:eastAsiaTheme="majorEastAsia" w:hAnsiTheme="minorHAnsi" w:cstheme="minorHAnsi"/>
+          <w:lang w:val="en-US"/>
+        </w:rPr>
+      </w:pPr>
+    </w:p>
+    <w:p>
+      <w:pPr>
+        <w:rPr>
+          <w:rFonts w:asciiTheme="minorHAnsi" w:eastAsiaTheme="majorEastAsia" w:hAnsiTheme="minorHAnsi" w:cstheme="minorHAnsi"/>
+          <w:lang w:val="en-US"/>
+        </w:rPr>
+      </w:pPr>
+    </w:p>
+    <w:p>
+      <w:pPr>
+        <w:rPr>
+          <w:rFonts w:asciiTheme="minorHAnsi" w:eastAsiaTheme="majorEastAsia" w:hAnsiTheme="minorHAnsi" w:cstheme="minorHAnsi"/>
+          <w:lang w:val="en-US"/>
+        </w:rPr>
+      </w:pPr>
+    </w:p>
+    <w:p>
+      <w:pPr>
+        <w:rPr>
+          <w:rFonts w:asciiTheme="minorHAnsi" w:eastAsiaTheme="majorEastAsia" w:hAnsiTheme="minorHAnsi" w:cstheme="minorHAnsi"/>
+          <w:lang w:val="en-US"/>
+        </w:rPr>
+      </w:pPr>
+    </w:p>
+    <w:p>
+      <w:pPr>
+        <w:rPr>
+          <w:rFonts w:asciiTheme="minorHAnsi" w:eastAsiaTheme="majorEastAsia" w:hAnsiTheme="minorHAnsi" w:cstheme="minorHAnsi"/>
+          <w:lang w:val="en-US"/>
+        </w:rPr>
+      </w:pPr>
+    </w:p>
+    <w:p>
+      <w:pPr>
+        <w:rPr>
+          <w:rFonts w:asciiTheme="minorHAnsi" w:eastAsiaTheme="majorEastAsia" w:hAnsiTheme="minorHAnsi" w:cstheme="minorHAnsi"/>
+          <w:lang w:val="en-US"/>
+        </w:rPr>
+      </w:pPr>
+    </w:p>
+    <w:p>
+      <w:pPr>
+        <w:rPr>
+          <w:rFonts w:asciiTheme="minorHAnsi" w:eastAsiaTheme="majorEastAsia" w:hAnsiTheme="minorHAnsi" w:cstheme="minorHAnsi"/>
+          <w:lang w:val="en-US"/>
+        </w:rPr>
+      </w:pPr>
+    </w:p>
+    <w:p>
+      <w:pPr>
+        <w:rPr>
+          <w:rFonts w:asciiTheme="minorHAnsi" w:eastAsiaTheme="majorEastAsia" w:hAnsiTheme="minorHAnsi" w:cstheme="minorHAnsi"/>
+          <w:lang w:val="en-US"/>
+        </w:rPr>
+      </w:pPr>
+    </w:p>
+    <w:p>
+      <w:pPr>
+        <w:rPr>
+          <w:rFonts w:asciiTheme="minorHAnsi" w:eastAsiaTheme="majorEastAsia" w:hAnsiTheme="minorHAnsi" w:cstheme="minorHAnsi"/>
+          <w:lang w:val="en-US"/>
+        </w:rPr>
+      </w:pPr>
+    </w:p>
+    <w:p>
+      <w:pPr>
+        <w:rPr>
+          <w:rFonts w:asciiTheme="minorHAnsi" w:eastAsiaTheme="majorEastAsia" w:hAnsiTheme="minorHAnsi" w:cstheme="minorHAnsi"/>
+          <w:lang w:val="en-US"/>
+        </w:rPr>
+      </w:pPr>
+    </w:p>
+    <w:p>
+      <w:pPr>
+        <w:rPr>
+          <w:rFonts w:asciiTheme="minorHAnsi" w:eastAsiaTheme="majorEastAsia" w:hAnsiTheme="minorHAnsi" w:cstheme="minorHAnsi"/>
+          <w:lang w:val="en-US"/>
+        </w:rPr>
+      </w:pPr>
+    </w:p>
+    <w:p>
+      <w:pPr>
+        <w:rPr>
+          <w:rFonts w:asciiTheme="minorHAnsi" w:eastAsiaTheme="majorEastAsia" w:hAnsiTheme="minorHAnsi" w:cstheme="minorHAnsi"/>
+          <w:lang w:val="en-US"/>
+        </w:rPr>
+      </w:pPr>
+    </w:p>
+    <w:p>
+      <w:pPr>
+        <w:rPr>
+          <w:rFonts w:asciiTheme="minorHAnsi" w:eastAsiaTheme="majorEastAsia" w:hAnsiTheme="minorHAnsi" w:cstheme="minorHAnsi"/>
+          <w:lang w:val="en-US"/>
+        </w:rPr>
+      </w:pPr>
+    </w:p>
+    <w:p>
+      <w:pPr>
+        <w:rPr>
+          <w:rFonts w:asciiTheme="minorHAnsi" w:eastAsiaTheme="majorEastAsia" w:hAnsiTheme="minorHAnsi" w:cstheme="minorHAnsi"/>
+          <w:lang w:val="en-US"/>
+        </w:rPr>
+      </w:pPr>
+    </w:p>
+    <w:p>
+      <w:pPr>
+        <w:rPr>
+          <w:rFonts w:asciiTheme="minorHAnsi" w:eastAsiaTheme="majorEastAsia" w:hAnsiTheme="minorHAnsi" w:cstheme="minorHAnsi"/>
+          <w:lang w:val="en-US"/>
+        </w:rPr>
+      </w:pPr>
+    </w:p>
+    <w:p>
+      <w:pPr>
+        <w:rPr>
+          <w:rFonts w:asciiTheme="minorHAnsi" w:eastAsiaTheme="majorEastAsia" w:hAnsiTheme="minorHAnsi" w:cstheme="minorHAnsi"/>
+          <w:lang w:val="en-US"/>
+        </w:rPr>
+      </w:pPr>
+    </w:p>
+    <w:p>
+      <w:pPr>
+        <w:rPr>
+          <w:rFonts w:asciiTheme="minorHAnsi" w:eastAsiaTheme="majorEastAsia" w:hAnsiTheme="minorHAnsi" w:cstheme="minorHAnsi"/>
+          <w:lang w:val="en-US"/>
+        </w:rPr>
+      </w:pPr>
+    </w:p>
+    <w:p>
+      <w:pPr>
+        <w:rPr>
+          <w:rFonts w:asciiTheme="minorHAnsi" w:eastAsiaTheme="majorEastAsia" w:hAnsiTheme="minorHAnsi" w:cstheme="minorHAnsi"/>
+          <w:lang w:val="en-US"/>
+        </w:rPr>
+      </w:pPr>
+    </w:p>
+    <w:p>
+      <w:pPr>
+        <w:rPr>
+          <w:rFonts w:asciiTheme="minorHAnsi" w:eastAsiaTheme="majorEastAsia" w:hAnsiTheme="minorHAnsi" w:cstheme="minorHAnsi"/>
+          <w:lang w:val="en-US"/>
+        </w:rPr>
+      </w:pPr>
+    </w:p>
+    <w:p>
+      <w:pPr>
+        <w:rPr>
+          <w:rFonts w:asciiTheme="minorHAnsi" w:eastAsiaTheme="majorEastAsia" w:hAnsiTheme="minorHAnsi" w:cstheme="minorHAnsi"/>
+          <w:lang w:val="en-US"/>
+        </w:rPr>
+      </w:pPr>
+    </w:p>
+    <w:p>
+      <w:pPr>
+        <w:rPr>
+          <w:rFonts w:asciiTheme="minorHAnsi" w:eastAsiaTheme="majorEastAsia" w:hAnsiTheme="minorHAnsi" w:cstheme="minorHAnsi"/>
+          <w:lang w:val="en-US"/>
+        </w:rPr>
+      </w:pPr>
+    </w:p>
+    <w:p>
+      <w:pPr>
+        <w:rPr>
+          <w:rFonts w:asciiTheme="minorHAnsi" w:eastAsiaTheme="majorEastAsia" w:hAnsiTheme="minorHAnsi" w:cstheme="minorHAnsi"/>
+          <w:lang w:val="en-US"/>
+        </w:rPr>
+      </w:pPr>
+    </w:p>
+    <w:p>
+      <w:pPr>
+        <w:rPr>
+          <w:rFonts w:asciiTheme="minorHAnsi" w:eastAsiaTheme="majorEastAsia" w:hAnsiTheme="minorHAnsi" w:cstheme="minorHAnsi"/>
+          <w:lang w:val="en-US"/>
+        </w:rPr>
+      </w:pPr>
+    </w:p>
+    <w:p>
+      <w:pPr>
+        <w:rPr>
+          <w:rFonts w:asciiTheme="minorHAnsi" w:eastAsiaTheme="majorEastAsia" w:hAnsiTheme="minorHAnsi" w:cstheme="minorHAnsi"/>
+          <w:lang w:val="en-US"/>
+        </w:rPr>
+      </w:pPr>
+    </w:p>
+    <w:p>
+      <w:pPr>
+        <w:rPr>
+          <w:rFonts w:asciiTheme="minorHAnsi" w:eastAsiaTheme="majorEastAsia" w:hAnsiTheme="minorHAnsi" w:cstheme="minorHAnsi"/>
+          <w:lang w:val="en-US"/>
+        </w:rPr>
+      </w:pPr>
+    </w:p>
+    <w:p>
+      <w:pPr>
+        <w:rPr>
+          <w:rFonts w:asciiTheme="minorHAnsi" w:eastAsiaTheme="majorEastAsia" w:hAnsiTheme="minorHAnsi" w:cstheme="minorHAnsi"/>
+          <w:lang w:val="en-US"/>
+        </w:rPr>
+      </w:pPr>
+    </w:p>
+    <w:p>
+      <w:pPr>
+        <w:rPr>
+          <w:rFonts w:asciiTheme="minorHAnsi" w:eastAsiaTheme="majorEastAsia" w:hAnsiTheme="minorHAnsi" w:cstheme="minorHAnsi"/>
+          <w:lang w:val="en-US"/>
+        </w:rPr>
+      </w:pPr>
+    </w:p>
+    <w:p>
+      <w:pPr>
+        <w:rPr>
+          <w:rFonts w:asciiTheme="minorHAnsi" w:eastAsiaTheme="majorEastAsia" w:hAnsiTheme="minorHAnsi" w:cstheme="minorHAnsi"/>
+          <w:lang w:val="en-US"/>
+        </w:rPr>
+      </w:pPr>
+    </w:p>
+    <w:p>
+      <w:pPr>
+        <w:rPr>
+          <w:rFonts w:asciiTheme="minorHAnsi" w:eastAsiaTheme="majorEastAsia" w:hAnsiTheme="minorHAnsi" w:cstheme="minorHAnsi"/>
+          <w:lang w:val="en-US"/>
+        </w:rPr>
+      </w:pPr>
+    </w:p>
+    <w:p>
+      <w:pPr>
+        <w:rPr>
+          <w:rFonts w:asciiTheme="minorHAnsi" w:eastAsiaTheme="majorEastAsia" w:hAnsiTheme="minorHAnsi" w:cstheme="minorHAnsi"/>
+          <w:lang w:val="en-US"/>
+        </w:rPr>
+      </w:pPr>
+    </w:p>
+    <w:p>
+      <w:pPr>
+        <w:rPr>
+          <w:rFonts w:asciiTheme="minorHAnsi" w:eastAsiaTheme="majorEastAsia" w:hAnsiTheme="minorHAnsi" w:cstheme="minorHAnsi"/>
+          <w:lang w:val="en-US"/>
+        </w:rPr>
+      </w:pPr>
+    </w:p>
+    <w:p>
+      <w:pPr>
+        <w:rPr>
+          <w:rFonts w:asciiTheme="minorHAnsi" w:eastAsiaTheme="majorEastAsia" w:hAnsiTheme="minorHAnsi" w:cstheme="minorHAnsi"/>
+          <w:lang w:val="en-US"/>
+        </w:rPr>
+      </w:pPr>
+    </w:p>
+    <w:p>
+      <w:pPr>
+        <w:rPr>
+          <w:rFonts w:asciiTheme="minorHAnsi" w:eastAsiaTheme="majorEastAsia" w:hAnsiTheme="minorHAnsi" w:cstheme="minorHAnsi"/>
+          <w:lang w:val="en-US"/>
+        </w:rPr>
+      </w:pPr>
+    </w:p>
+    <w:p>
+      <w:pPr>
+        <w:rPr>
+          <w:rFonts w:asciiTheme="minorHAnsi" w:eastAsiaTheme="majorEastAsia" w:hAnsiTheme="minorHAnsi" w:cstheme="minorHAnsi"/>
+          <w:lang w:val="en-US"/>
+        </w:rPr>
+      </w:pPr>
+    </w:p>
+    <w:p>
+      <w:pPr>
+        <w:rPr>
+          <w:rFonts w:asciiTheme="minorHAnsi" w:eastAsiaTheme="majorEastAsia" w:hAnsiTheme="minorHAnsi" w:cstheme="minorHAnsi"/>
+          <w:lang w:val="en-US"/>
+        </w:rPr>
+      </w:pPr>
+    </w:p>
+    <w:p>
+      <w:pPr>
+        <w:rPr>
+          <w:rFonts w:asciiTheme="minorHAnsi" w:eastAsiaTheme="majorEastAsia" w:hAnsiTheme="minorHAnsi" w:cstheme="minorHAnsi"/>
+          <w:lang w:val="en-US"/>
+        </w:rPr>
+      </w:pPr>
+    </w:p>
+    <w:p>
+      <w:pPr>
+        <w:rPr>
+          <w:rFonts w:asciiTheme="minorHAnsi" w:eastAsiaTheme="majorEastAsia" w:hAnsiTheme="minorHAnsi" w:cstheme="minorHAnsi"/>
+          <w:lang w:val="en-US"/>
+        </w:rPr>
+      </w:pPr>
+    </w:p>
+    <w:p>
+      <w:pPr>
+        <w:rPr>
+          <w:rFonts w:asciiTheme="minorHAnsi" w:eastAsiaTheme="majorEastAsia" w:hAnsiTheme="minorHAnsi" w:cstheme="minorHAnsi"/>
+          <w:lang w:val="en-US"/>
+        </w:rPr>
+      </w:pPr>
+    </w:p>
+    <w:p>
+      <w:pPr>
+        <w:rPr>
+          <w:rFonts w:asciiTheme="minorHAnsi" w:eastAsiaTheme="majorEastAsia" w:hAnsiTheme="minorHAnsi" w:cstheme="minorHAnsi"/>
+          <w:lang w:val="en-US"/>
+        </w:rPr>
+      </w:pPr>
+    </w:p>
+    <w:p>
+      <w:pPr>
+        <w:rPr>
+          <w:rFonts w:asciiTheme="minorHAnsi" w:eastAsiaTheme="majorEastAsia" w:hAnsiTheme="minorHAnsi" w:cstheme="minorHAnsi"/>
+          <w:lang w:val="en-US"/>
+        </w:rPr>
+      </w:pPr>
+    </w:p>
+    <w:p>
+      <w:pPr>
+        <w:rPr>
+          <w:rFonts w:asciiTheme="majorHAnsi" w:eastAsiaTheme="majorEastAsia" w:hAnsiTheme="majorHAnsi" w:cstheme="majorBidi"/>
+          <w:b/>
+          <w:bCs/>
+          <w:i/>
+          <w:iCs/>
+          <w:color w:val="4F81BD" w:themeColor="accent1"/>
+          <w:sz w:val="26"/>
+          <w:szCs w:val="26"/>
+          <w:lang w:val="en-US"/>
+        </w:rPr>
+      </w:pPr>
+      <w:r>
+        <w:rPr>
+          <w:rFonts w:asciiTheme="minorHAnsi" w:eastAsiaTheme="majorEastAsia" w:hAnsiTheme="minorHAnsi" w:cstheme="minorHAnsi"/>
+          <w:lang w:val="en-US"/>
+        </w:rPr>
+        <w:t xml:space="preserve">                                                                                                                                                                                       12</w:t>
+      </w:r>
+      <w:r>
+        <w:rPr>
+          <w:rFonts w:asciiTheme="majorHAnsi" w:eastAsiaTheme="majorEastAsia" w:hAnsiTheme="majorHAnsi" w:cstheme="majorBidi"/>
+          <w:b/>
+          <w:bCs/>
+          <w:i/>
+          <w:iCs/>
+          <w:color w:val="4F81BD" w:themeColor="accent1"/>
+          <w:sz w:val="26"/>
+          <w:szCs w:val="26"/>
+          <w:lang w:val="en-US"/>
+        </w:rPr>
+        <w:t xml:space="preserve"> </w:t>
+      </w:r>
     </w:p>
     <w:sectPr>
       <w:pgSz w:w="12240" w:h="15840"/>
@@ -8614,7 +10783,7 @@
   <dgm:whole/>
   <dgm:extLst>
     <a:ext uri="http://schemas.microsoft.com/office/drawing/2008/diagram">
-      <dsp:dataModelExt xmlns:dsp="http://schemas.microsoft.com/office/drawing/2008/diagram" relId="rId23" minVer="http://schemas.openxmlformats.org/drawingml/2006/diagram"/>
+      <dsp:dataModelExt xmlns:dsp="http://schemas.microsoft.com/office/drawing/2008/diagram" relId="rId19" minVer="http://schemas.openxmlformats.org/drawingml/2006/diagram"/>
     </a:ext>
   </dgm:extLst>
 </dgm:dataModel>

</xml_diff>